<commit_message>
docs: Added Metabolism Section
</commit_message>
<xml_diff>
--- a/Nutrients/Weight Loss.docx
+++ b/Nutrients/Weight Loss.docx
@@ -55,15 +55,7 @@
             <w:sz w:val="24"/>
             <w:szCs w:val="24"/>
           </w:rPr>
-          <w:t>h</w:t>
-        </w:r>
-        <w:r>
-          <w:rPr>
-            <w:rStyle w:val="Hyperlink"/>
-            <w:sz w:val="24"/>
-            <w:szCs w:val="24"/>
-          </w:rPr>
-          <w:t>ttps://www.verywellfit.com/how-does-fat-leave-the-body-4165132</w:t>
+          <w:t>https://www.verywellfit.com/how-does-fat-leave-the-body-4165132</w:t>
         </w:r>
       </w:hyperlink>
       <w:r>
@@ -93,15 +85,7 @@
             <w:sz w:val="24"/>
             <w:szCs w:val="24"/>
           </w:rPr>
-          <w:t>h</w:t>
-        </w:r>
-        <w:r>
-          <w:rPr>
-            <w:rStyle w:val="Hyperlink"/>
-            <w:sz w:val="24"/>
-            <w:szCs w:val="24"/>
-          </w:rPr>
-          <w:t>ttps://www.verywellfit.com/running-to-lose-weight-how-many-calories-in-a-pound-2911107</w:t>
+          <w:t>https://www.verywellfit.com/running-to-lose-weight-how-many-calories-in-a-pound-2911107</w:t>
         </w:r>
       </w:hyperlink>
       <w:r>
@@ -110,6 +94,26 @@
           <w:szCs w:val="24"/>
         </w:rPr>
         <w:t xml:space="preserve"> (How many calories in a pound)</w:t>
+      </w:r>
+    </w:p>
+    <w:p>
+      <w:pPr>
+        <w:pStyle w:val="ListParagraph"/>
+        <w:numPr>
+          <w:ilvl w:val="0"/>
+          <w:numId w:val="1"/>
+        </w:numPr>
+        <w:rPr>
+          <w:sz w:val="24"/>
+          <w:szCs w:val="24"/>
+        </w:rPr>
+      </w:pPr>
+      <w:r>
+        <w:rPr>
+          <w:sz w:val="24"/>
+          <w:szCs w:val="24"/>
+        </w:rPr>
+        <w:t>Copilot</w:t>
       </w:r>
     </w:p>
     <w:p>
@@ -563,14 +567,7 @@
           <w:szCs w:val="24"/>
         </w:rPr>
         <w:lastRenderedPageBreak/>
-        <w:t>Brown fat cells contain multiple fat droplets and considerably more water, salt, and protein. These cells are also equipped with mitochondria, which are responsible for the chemical reaction that burns </w:t>
-      </w:r>
-      <w:r>
-        <w:rPr>
-          <w:sz w:val="24"/>
-          <w:szCs w:val="24"/>
-        </w:rPr>
-        <w:t>ca</w:t>
+        <w:t>Brown fat cells contain multiple fat droplets and considerably more water, salt, and protein. These cells are also equipped with mitochondria, which are responsible for the chemical reaction that burns ca</w:t>
       </w:r>
       <w:r>
         <w:rPr>
@@ -1317,6 +1314,724 @@
         </w:rPr>
         <w:t>.</w:t>
       </w:r>
+    </w:p>
+    <w:p>
+      <w:pPr>
+        <w:rPr>
+          <w:sz w:val="24"/>
+          <w:szCs w:val="24"/>
+        </w:rPr>
+      </w:pPr>
+      <w:r>
+        <w:rPr>
+          <w:sz w:val="24"/>
+          <w:szCs w:val="24"/>
+        </w:rPr>
+        <w:br w:type="page"/>
+      </w:r>
+    </w:p>
+    <w:p>
+      <w:pPr>
+        <w:ind w:left="360"/>
+        <w:jc w:val="both"/>
+        <w:rPr>
+          <w:sz w:val="24"/>
+          <w:szCs w:val="24"/>
+        </w:rPr>
+      </w:pPr>
+      <w:r>
+        <w:rPr>
+          <w:sz w:val="24"/>
+          <w:szCs w:val="24"/>
+        </w:rPr>
+        <w:lastRenderedPageBreak/>
+        <w:t xml:space="preserve">After discussing the types of fats and their functionality. We will talk about the metabolism. The term metabolism </w:t>
+      </w:r>
+      <w:r>
+        <w:rPr>
+          <w:sz w:val="24"/>
+          <w:szCs w:val="24"/>
+        </w:rPr>
+        <w:t>refers to the complex set of chemical reactions that occur within your body to maintain life. These processes convert the food and drinks you consume into energy, which is used for various bodily functions such as breathing, circulating blood, and repairing cells</w:t>
+      </w:r>
+      <w:r>
+        <w:rPr>
+          <w:sz w:val="24"/>
+          <w:szCs w:val="24"/>
+        </w:rPr>
+        <w:t>.</w:t>
+      </w:r>
+      <w:r>
+        <w:rPr>
+          <w:sz w:val="24"/>
+          <w:szCs w:val="24"/>
+        </w:rPr>
+        <w:t xml:space="preserve"> Weight loss is the burning of calories or fat which goes through a metabolism process and the effeteness of burning fat or calories is based on the metabolism rate. The higher the metabolism rate the more effect the burning calories or fat. </w:t>
+      </w:r>
+      <w:r>
+        <w:rPr>
+          <w:sz w:val="24"/>
+          <w:szCs w:val="24"/>
+        </w:rPr>
+        <w:t>Below describe how metabolism affect our body and ways increase our metabolism</w:t>
+      </w:r>
+      <w:r>
+        <w:rPr>
+          <w:sz w:val="24"/>
+          <w:szCs w:val="24"/>
+        </w:rPr>
+        <w:t xml:space="preserve"> and also how exercise affect metabolism. </w:t>
+      </w:r>
+    </w:p>
+    <w:p>
+      <w:pPr>
+        <w:ind w:left="360"/>
+        <w:jc w:val="both"/>
+        <w:rPr>
+          <w:sz w:val="24"/>
+          <w:szCs w:val="24"/>
+        </w:rPr>
+      </w:pPr>
+    </w:p>
+    <w:p>
+      <w:pPr>
+        <w:jc w:val="both"/>
+        <w:rPr>
+          <w:b/>
+          <w:bCs/>
+          <w:sz w:val="28"/>
+          <w:szCs w:val="28"/>
+        </w:rPr>
+      </w:pPr>
+      <w:r>
+        <w:rPr>
+          <w:b/>
+          <w:bCs/>
+          <w:sz w:val="28"/>
+          <w:szCs w:val="28"/>
+        </w:rPr>
+        <w:t>How Does Metabolism Affect Our Body?</w:t>
+      </w:r>
+    </w:p>
+    <w:p>
+      <w:pPr>
+        <w:ind w:left="360"/>
+        <w:jc w:val="both"/>
+        <w:rPr>
+          <w:sz w:val="24"/>
+          <w:szCs w:val="24"/>
+        </w:rPr>
+      </w:pPr>
+      <w:r>
+        <w:rPr>
+          <w:sz w:val="24"/>
+          <w:szCs w:val="24"/>
+        </w:rPr>
+        <w:t>Metabolism is crucial for:</w:t>
+      </w:r>
+    </w:p>
+    <w:p>
+      <w:pPr>
+        <w:numPr>
+          <w:ilvl w:val="0"/>
+          <w:numId w:val="8"/>
+        </w:numPr>
+        <w:jc w:val="both"/>
+        <w:rPr>
+          <w:sz w:val="24"/>
+          <w:szCs w:val="24"/>
+        </w:rPr>
+      </w:pPr>
+      <w:r>
+        <w:rPr>
+          <w:b/>
+          <w:bCs/>
+          <w:sz w:val="24"/>
+          <w:szCs w:val="24"/>
+        </w:rPr>
+        <w:t>Energy Production</w:t>
+      </w:r>
+      <w:r>
+        <w:rPr>
+          <w:sz w:val="24"/>
+          <w:szCs w:val="24"/>
+        </w:rPr>
+        <w:t>: It provides the energy needed for all bodily functions, from basic activities like breathing to more complex processes like muscle contraction.</w:t>
+      </w:r>
+    </w:p>
+    <w:p>
+      <w:pPr>
+        <w:numPr>
+          <w:ilvl w:val="0"/>
+          <w:numId w:val="8"/>
+        </w:numPr>
+        <w:jc w:val="both"/>
+        <w:rPr>
+          <w:sz w:val="24"/>
+          <w:szCs w:val="24"/>
+        </w:rPr>
+      </w:pPr>
+      <w:r>
+        <w:rPr>
+          <w:b/>
+          <w:bCs/>
+          <w:sz w:val="24"/>
+          <w:szCs w:val="24"/>
+        </w:rPr>
+        <w:t>Growth and Repair</w:t>
+      </w:r>
+      <w:r>
+        <w:rPr>
+          <w:sz w:val="24"/>
+          <w:szCs w:val="24"/>
+        </w:rPr>
+        <w:t>: It helps in the growth and repair of tissues.</w:t>
+      </w:r>
+    </w:p>
+    <w:p>
+      <w:pPr>
+        <w:numPr>
+          <w:ilvl w:val="0"/>
+          <w:numId w:val="8"/>
+        </w:numPr>
+        <w:jc w:val="both"/>
+        <w:rPr>
+          <w:sz w:val="24"/>
+          <w:szCs w:val="24"/>
+        </w:rPr>
+      </w:pPr>
+      <w:r>
+        <w:rPr>
+          <w:b/>
+          <w:bCs/>
+          <w:sz w:val="24"/>
+          <w:szCs w:val="24"/>
+        </w:rPr>
+        <w:t>Waste Elimination</w:t>
+      </w:r>
+      <w:r>
+        <w:rPr>
+          <w:sz w:val="24"/>
+          <w:szCs w:val="24"/>
+        </w:rPr>
+        <w:t>: It aids in the removal of metabolic wastes from the body.</w:t>
+      </w:r>
+    </w:p>
+    <w:p>
+      <w:pPr>
+        <w:numPr>
+          <w:ilvl w:val="0"/>
+          <w:numId w:val="8"/>
+        </w:numPr>
+        <w:jc w:val="both"/>
+        <w:rPr>
+          <w:sz w:val="24"/>
+          <w:szCs w:val="24"/>
+        </w:rPr>
+      </w:pPr>
+      <w:r>
+        <w:rPr>
+          <w:b/>
+          <w:bCs/>
+          <w:sz w:val="24"/>
+          <w:szCs w:val="24"/>
+        </w:rPr>
+        <w:t>Hormone Regulation</w:t>
+      </w:r>
+      <w:r>
+        <w:rPr>
+          <w:sz w:val="24"/>
+          <w:szCs w:val="24"/>
+        </w:rPr>
+        <w:t>: It plays a role in managing hormone levels and regulating body temperature</w:t>
+      </w:r>
+    </w:p>
+    <w:p>
+      <w:pPr>
+        <w:jc w:val="both"/>
+        <w:rPr>
+          <w:sz w:val="24"/>
+          <w:szCs w:val="24"/>
+        </w:rPr>
+      </w:pPr>
+    </w:p>
+    <w:p>
+      <w:pPr>
+        <w:jc w:val="both"/>
+        <w:rPr>
+          <w:b/>
+          <w:bCs/>
+          <w:sz w:val="28"/>
+          <w:szCs w:val="28"/>
+        </w:rPr>
+      </w:pPr>
+      <w:r>
+        <w:rPr>
+          <w:b/>
+          <w:bCs/>
+          <w:sz w:val="28"/>
+          <w:szCs w:val="28"/>
+        </w:rPr>
+        <w:t>How to Increase Metabolism</w:t>
+      </w:r>
+    </w:p>
+    <w:p>
+      <w:pPr>
+        <w:ind w:firstLine="360"/>
+        <w:jc w:val="both"/>
+        <w:rPr>
+          <w:sz w:val="24"/>
+          <w:szCs w:val="24"/>
+        </w:rPr>
+      </w:pPr>
+      <w:r>
+        <w:rPr>
+          <w:sz w:val="24"/>
+          <w:szCs w:val="24"/>
+        </w:rPr>
+        <w:t>There are several ways to boost your metabolism:</w:t>
+      </w:r>
+    </w:p>
+    <w:p>
+      <w:pPr>
+        <w:numPr>
+          <w:ilvl w:val="0"/>
+          <w:numId w:val="10"/>
+        </w:numPr>
+        <w:jc w:val="both"/>
+        <w:rPr>
+          <w:sz w:val="24"/>
+          <w:szCs w:val="24"/>
+        </w:rPr>
+      </w:pPr>
+      <w:r>
+        <w:rPr>
+          <w:b/>
+          <w:bCs/>
+          <w:sz w:val="24"/>
+          <w:szCs w:val="24"/>
+        </w:rPr>
+        <w:t>Eat Plenty of Protein</w:t>
+      </w:r>
+      <w:r>
+        <w:rPr>
+          <w:sz w:val="24"/>
+          <w:szCs w:val="24"/>
+        </w:rPr>
+        <w:t>: Consuming protein-rich foods can temporarily increase your metabolism through the thermic effect of food (TEF), which is the energy required to digest, absorb, and process nutrients</w:t>
+      </w:r>
+      <w:r>
+        <w:rPr>
+          <w:sz w:val="24"/>
+          <w:szCs w:val="24"/>
+        </w:rPr>
+        <w:t>.</w:t>
+      </w:r>
+    </w:p>
+    <w:p>
+      <w:pPr>
+        <w:numPr>
+          <w:ilvl w:val="0"/>
+          <w:numId w:val="10"/>
+        </w:numPr>
+        <w:jc w:val="both"/>
+        <w:rPr>
+          <w:sz w:val="24"/>
+          <w:szCs w:val="24"/>
+        </w:rPr>
+      </w:pPr>
+      <w:r>
+        <w:rPr>
+          <w:b/>
+          <w:bCs/>
+          <w:sz w:val="24"/>
+          <w:szCs w:val="24"/>
+        </w:rPr>
+        <w:t>High-Intensity Interval Training (HIIT)</w:t>
+      </w:r>
+      <w:r>
+        <w:rPr>
+          <w:sz w:val="24"/>
+          <w:szCs w:val="24"/>
+        </w:rPr>
+        <w:t>: This involves short bursts of intense activity, which can significantly boost your metabolic rate</w:t>
+      </w:r>
+      <w:r>
+        <w:rPr>
+          <w:sz w:val="24"/>
+          <w:szCs w:val="24"/>
+        </w:rPr>
+        <w:t>.</w:t>
+      </w:r>
+    </w:p>
+    <w:p>
+      <w:pPr>
+        <w:numPr>
+          <w:ilvl w:val="0"/>
+          <w:numId w:val="10"/>
+        </w:numPr>
+        <w:jc w:val="both"/>
+        <w:rPr>
+          <w:sz w:val="24"/>
+          <w:szCs w:val="24"/>
+        </w:rPr>
+      </w:pPr>
+      <w:r>
+        <w:rPr>
+          <w:b/>
+          <w:bCs/>
+          <w:sz w:val="24"/>
+          <w:szCs w:val="24"/>
+        </w:rPr>
+        <w:t>Lift Weights</w:t>
+      </w:r>
+      <w:r>
+        <w:rPr>
+          <w:sz w:val="24"/>
+          <w:szCs w:val="24"/>
+        </w:rPr>
+        <w:t>: Building muscle mass increases your resting metabolic rate, as muscle tissue burns more calories than fat tissue</w:t>
+      </w:r>
+      <w:r>
+        <w:rPr>
+          <w:sz w:val="24"/>
+          <w:szCs w:val="24"/>
+        </w:rPr>
+        <w:t>.</w:t>
+      </w:r>
+    </w:p>
+    <w:p>
+      <w:pPr>
+        <w:numPr>
+          <w:ilvl w:val="0"/>
+          <w:numId w:val="10"/>
+        </w:numPr>
+        <w:jc w:val="both"/>
+        <w:rPr>
+          <w:sz w:val="24"/>
+          <w:szCs w:val="24"/>
+        </w:rPr>
+      </w:pPr>
+      <w:r>
+        <w:rPr>
+          <w:b/>
+          <w:bCs/>
+          <w:sz w:val="24"/>
+          <w:szCs w:val="24"/>
+        </w:rPr>
+        <w:t>Stay Active</w:t>
+      </w:r>
+      <w:r>
+        <w:rPr>
+          <w:sz w:val="24"/>
+          <w:szCs w:val="24"/>
+        </w:rPr>
+        <w:t>: Standing up more and reducing sedentary time can help increase your metabolism</w:t>
+      </w:r>
+      <w:r>
+        <w:rPr>
+          <w:sz w:val="24"/>
+          <w:szCs w:val="24"/>
+        </w:rPr>
+        <w:t>.</w:t>
+      </w:r>
+    </w:p>
+    <w:p>
+      <w:pPr>
+        <w:numPr>
+          <w:ilvl w:val="0"/>
+          <w:numId w:val="10"/>
+        </w:numPr>
+        <w:jc w:val="both"/>
+        <w:rPr>
+          <w:sz w:val="24"/>
+          <w:szCs w:val="24"/>
+        </w:rPr>
+      </w:pPr>
+      <w:r>
+        <w:rPr>
+          <w:b/>
+          <w:bCs/>
+          <w:sz w:val="24"/>
+          <w:szCs w:val="24"/>
+        </w:rPr>
+        <w:t>Drink Green Tea or Coffee</w:t>
+      </w:r>
+      <w:r>
+        <w:rPr>
+          <w:sz w:val="24"/>
+          <w:szCs w:val="24"/>
+        </w:rPr>
+        <w:t>: Both can temporarily boost metabolism due to their caffeine content.</w:t>
+      </w:r>
+    </w:p>
+    <w:p>
+      <w:pPr>
+        <w:numPr>
+          <w:ilvl w:val="0"/>
+          <w:numId w:val="10"/>
+        </w:numPr>
+        <w:jc w:val="both"/>
+        <w:rPr>
+          <w:sz w:val="24"/>
+          <w:szCs w:val="24"/>
+        </w:rPr>
+      </w:pPr>
+      <w:r>
+        <w:rPr>
+          <w:b/>
+          <w:bCs/>
+          <w:sz w:val="24"/>
+          <w:szCs w:val="24"/>
+        </w:rPr>
+        <w:t>Eat Spicy Foods</w:t>
+      </w:r>
+      <w:r>
+        <w:rPr>
+          <w:sz w:val="24"/>
+          <w:szCs w:val="24"/>
+        </w:rPr>
+        <w:t>: Foods containing capsaicin, like chili peppers, can increase your metabolic rate</w:t>
+      </w:r>
+      <w:r>
+        <w:rPr>
+          <w:sz w:val="24"/>
+          <w:szCs w:val="24"/>
+        </w:rPr>
+        <w:t>.</w:t>
+      </w:r>
+    </w:p>
+    <w:p>
+      <w:pPr>
+        <w:numPr>
+          <w:ilvl w:val="0"/>
+          <w:numId w:val="10"/>
+        </w:numPr>
+        <w:jc w:val="both"/>
+        <w:rPr>
+          <w:sz w:val="24"/>
+          <w:szCs w:val="24"/>
+        </w:rPr>
+      </w:pPr>
+      <w:r>
+        <w:rPr>
+          <w:b/>
+          <w:bCs/>
+          <w:sz w:val="24"/>
+          <w:szCs w:val="24"/>
+        </w:rPr>
+        <w:lastRenderedPageBreak/>
+        <w:t>Get Enough Sleep</w:t>
+      </w:r>
+      <w:r>
+        <w:rPr>
+          <w:sz w:val="24"/>
+          <w:szCs w:val="24"/>
+        </w:rPr>
+        <w:t>: Poor sleep can negatively affect your metabolism, so aim for quality sleep</w:t>
+      </w:r>
+    </w:p>
+    <w:p>
+      <w:pPr>
+        <w:ind w:left="360"/>
+        <w:jc w:val="both"/>
+        <w:rPr>
+          <w:sz w:val="24"/>
+          <w:szCs w:val="24"/>
+        </w:rPr>
+      </w:pPr>
+    </w:p>
+    <w:p>
+      <w:pPr>
+        <w:jc w:val="both"/>
+        <w:rPr>
+          <w:b/>
+          <w:bCs/>
+          <w:sz w:val="28"/>
+          <w:szCs w:val="28"/>
+        </w:rPr>
+      </w:pPr>
+      <w:r>
+        <w:rPr>
+          <w:b/>
+          <w:bCs/>
+          <w:sz w:val="28"/>
+          <w:szCs w:val="28"/>
+        </w:rPr>
+        <w:t>How Does Exercise Affect Metabolism?</w:t>
+      </w:r>
+    </w:p>
+    <w:p>
+      <w:pPr>
+        <w:jc w:val="both"/>
+        <w:rPr>
+          <w:sz w:val="24"/>
+          <w:szCs w:val="24"/>
+        </w:rPr>
+      </w:pPr>
+      <w:r>
+        <w:rPr>
+          <w:sz w:val="24"/>
+          <w:szCs w:val="24"/>
+        </w:rPr>
+        <w:t>Exercise has a profound impact on metabolism:</w:t>
+      </w:r>
+    </w:p>
+    <w:p>
+      <w:pPr>
+        <w:numPr>
+          <w:ilvl w:val="0"/>
+          <w:numId w:val="11"/>
+        </w:numPr>
+        <w:jc w:val="both"/>
+        <w:rPr>
+          <w:sz w:val="24"/>
+          <w:szCs w:val="24"/>
+        </w:rPr>
+      </w:pPr>
+      <w:r>
+        <w:rPr>
+          <w:b/>
+          <w:bCs/>
+          <w:sz w:val="24"/>
+          <w:szCs w:val="24"/>
+        </w:rPr>
+        <w:t>Increases Calorie Burning</w:t>
+      </w:r>
+      <w:r>
+        <w:rPr>
+          <w:sz w:val="24"/>
+          <w:szCs w:val="24"/>
+        </w:rPr>
+        <w:t>: Physical activity burns calories, which helps in weight management</w:t>
+      </w:r>
+      <w:r>
+        <w:rPr>
+          <w:sz w:val="24"/>
+          <w:szCs w:val="24"/>
+        </w:rPr>
+        <w:t>.</w:t>
+      </w:r>
+    </w:p>
+    <w:p>
+      <w:pPr>
+        <w:numPr>
+          <w:ilvl w:val="0"/>
+          <w:numId w:val="11"/>
+        </w:numPr>
+        <w:jc w:val="both"/>
+        <w:rPr>
+          <w:sz w:val="24"/>
+          <w:szCs w:val="24"/>
+        </w:rPr>
+      </w:pPr>
+      <w:r>
+        <w:rPr>
+          <w:b/>
+          <w:bCs/>
+          <w:sz w:val="24"/>
+          <w:szCs w:val="24"/>
+        </w:rPr>
+        <w:t>Boosts Resting Metabolic Rate</w:t>
+      </w:r>
+      <w:r>
+        <w:rPr>
+          <w:sz w:val="24"/>
+          <w:szCs w:val="24"/>
+        </w:rPr>
+        <w:t>: Regular exercise, especially strength training, increases muscle mass, which in turn raises your resting metabolic rate.</w:t>
+      </w:r>
+    </w:p>
+    <w:p>
+      <w:pPr>
+        <w:numPr>
+          <w:ilvl w:val="0"/>
+          <w:numId w:val="11"/>
+        </w:numPr>
+        <w:jc w:val="both"/>
+        <w:rPr>
+          <w:sz w:val="24"/>
+          <w:szCs w:val="24"/>
+        </w:rPr>
+      </w:pPr>
+      <w:r>
+        <w:rPr>
+          <w:b/>
+          <w:bCs/>
+          <w:sz w:val="24"/>
+          <w:szCs w:val="24"/>
+        </w:rPr>
+        <w:t>Enhances Metabolic Health</w:t>
+      </w:r>
+      <w:r>
+        <w:rPr>
+          <w:sz w:val="24"/>
+          <w:szCs w:val="24"/>
+        </w:rPr>
+        <w:t>: Exercise improves the efficiency of metabolic processes, including better glucose metabolism and insulin sensitivity</w:t>
+      </w:r>
+      <w:r>
+        <w:rPr>
+          <w:sz w:val="24"/>
+          <w:szCs w:val="24"/>
+        </w:rPr>
+        <w:t>.</w:t>
+      </w:r>
+    </w:p>
+    <w:p>
+      <w:pPr>
+        <w:numPr>
+          <w:ilvl w:val="0"/>
+          <w:numId w:val="11"/>
+        </w:numPr>
+        <w:jc w:val="both"/>
+        <w:rPr>
+          <w:sz w:val="24"/>
+          <w:szCs w:val="24"/>
+        </w:rPr>
+      </w:pPr>
+      <w:r>
+        <w:rPr>
+          <w:b/>
+          <w:bCs/>
+          <w:sz w:val="24"/>
+          <w:szCs w:val="24"/>
+        </w:rPr>
+        <w:t>Promotes Browning of Fat</w:t>
+      </w:r>
+      <w:r>
+        <w:rPr>
+          <w:sz w:val="24"/>
+          <w:szCs w:val="24"/>
+        </w:rPr>
+        <w:t>: Exercise can stimulate the conversion of white fat to brown fat, which is more metabolically active and burns more calories</w:t>
+      </w:r>
+      <w:r>
+        <w:rPr>
+          <w:sz w:val="24"/>
+          <w:szCs w:val="24"/>
+        </w:rPr>
+        <w:t>.</w:t>
+      </w:r>
+    </w:p>
+    <w:p>
+      <w:pPr>
+        <w:jc w:val="both"/>
+        <w:rPr>
+          <w:sz w:val="24"/>
+          <w:szCs w:val="24"/>
+        </w:rPr>
+      </w:pPr>
+    </w:p>
+    <w:p>
+      <w:pPr>
+        <w:ind w:left="360"/>
+        <w:jc w:val="both"/>
+        <w:rPr>
+          <w:sz w:val="24"/>
+          <w:szCs w:val="24"/>
+        </w:rPr>
+      </w:pPr>
     </w:p>
     <w:p>
       <w:pPr>
@@ -1649,6 +2364,304 @@
     </w:lvl>
   </w:abstractNum>
   <w:abstractNum w:abstractNumId="2" w15:restartNumberingAfterBreak="0">
+    <w:nsid w:val="116D3FBA"/>
+    <w:multiLevelType w:val="multilevel"/>
+    <w:tmpl w:val="06F2D440"/>
+    <w:lvl w:ilvl="0">
+      <w:start w:val="1"/>
+      <w:numFmt w:val="bullet"/>
+      <w:lvlText w:val=""/>
+      <w:lvlJc w:val="left"/>
+      <w:pPr>
+        <w:tabs>
+          <w:tab w:val="num" w:pos="720"/>
+        </w:tabs>
+        <w:ind w:left="720" w:hanging="360"/>
+      </w:pPr>
+      <w:rPr>
+        <w:rFonts w:ascii="Symbol" w:hAnsi="Symbol" w:hint="default"/>
+        <w:sz w:val="20"/>
+      </w:rPr>
+    </w:lvl>
+    <w:lvl w:ilvl="1" w:tentative="1">
+      <w:start w:val="1"/>
+      <w:numFmt w:val="bullet"/>
+      <w:lvlText w:val="o"/>
+      <w:lvlJc w:val="left"/>
+      <w:pPr>
+        <w:tabs>
+          <w:tab w:val="num" w:pos="1440"/>
+        </w:tabs>
+        <w:ind w:left="1440" w:hanging="360"/>
+      </w:pPr>
+      <w:rPr>
+        <w:rFonts w:ascii="Courier New" w:hAnsi="Courier New" w:hint="default"/>
+        <w:sz w:val="20"/>
+      </w:rPr>
+    </w:lvl>
+    <w:lvl w:ilvl="2" w:tentative="1">
+      <w:start w:val="1"/>
+      <w:numFmt w:val="bullet"/>
+      <w:lvlText w:val=""/>
+      <w:lvlJc w:val="left"/>
+      <w:pPr>
+        <w:tabs>
+          <w:tab w:val="num" w:pos="2160"/>
+        </w:tabs>
+        <w:ind w:left="2160" w:hanging="360"/>
+      </w:pPr>
+      <w:rPr>
+        <w:rFonts w:ascii="Wingdings" w:hAnsi="Wingdings" w:hint="default"/>
+        <w:sz w:val="20"/>
+      </w:rPr>
+    </w:lvl>
+    <w:lvl w:ilvl="3" w:tentative="1">
+      <w:start w:val="1"/>
+      <w:numFmt w:val="bullet"/>
+      <w:lvlText w:val=""/>
+      <w:lvlJc w:val="left"/>
+      <w:pPr>
+        <w:tabs>
+          <w:tab w:val="num" w:pos="2880"/>
+        </w:tabs>
+        <w:ind w:left="2880" w:hanging="360"/>
+      </w:pPr>
+      <w:rPr>
+        <w:rFonts w:ascii="Wingdings" w:hAnsi="Wingdings" w:hint="default"/>
+        <w:sz w:val="20"/>
+      </w:rPr>
+    </w:lvl>
+    <w:lvl w:ilvl="4" w:tentative="1">
+      <w:start w:val="1"/>
+      <w:numFmt w:val="bullet"/>
+      <w:lvlText w:val=""/>
+      <w:lvlJc w:val="left"/>
+      <w:pPr>
+        <w:tabs>
+          <w:tab w:val="num" w:pos="3600"/>
+        </w:tabs>
+        <w:ind w:left="3600" w:hanging="360"/>
+      </w:pPr>
+      <w:rPr>
+        <w:rFonts w:ascii="Wingdings" w:hAnsi="Wingdings" w:hint="default"/>
+        <w:sz w:val="20"/>
+      </w:rPr>
+    </w:lvl>
+    <w:lvl w:ilvl="5" w:tentative="1">
+      <w:start w:val="1"/>
+      <w:numFmt w:val="bullet"/>
+      <w:lvlText w:val=""/>
+      <w:lvlJc w:val="left"/>
+      <w:pPr>
+        <w:tabs>
+          <w:tab w:val="num" w:pos="4320"/>
+        </w:tabs>
+        <w:ind w:left="4320" w:hanging="360"/>
+      </w:pPr>
+      <w:rPr>
+        <w:rFonts w:ascii="Wingdings" w:hAnsi="Wingdings" w:hint="default"/>
+        <w:sz w:val="20"/>
+      </w:rPr>
+    </w:lvl>
+    <w:lvl w:ilvl="6" w:tentative="1">
+      <w:start w:val="1"/>
+      <w:numFmt w:val="bullet"/>
+      <w:lvlText w:val=""/>
+      <w:lvlJc w:val="left"/>
+      <w:pPr>
+        <w:tabs>
+          <w:tab w:val="num" w:pos="5040"/>
+        </w:tabs>
+        <w:ind w:left="5040" w:hanging="360"/>
+      </w:pPr>
+      <w:rPr>
+        <w:rFonts w:ascii="Wingdings" w:hAnsi="Wingdings" w:hint="default"/>
+        <w:sz w:val="20"/>
+      </w:rPr>
+    </w:lvl>
+    <w:lvl w:ilvl="7" w:tentative="1">
+      <w:start w:val="1"/>
+      <w:numFmt w:val="bullet"/>
+      <w:lvlText w:val=""/>
+      <w:lvlJc w:val="left"/>
+      <w:pPr>
+        <w:tabs>
+          <w:tab w:val="num" w:pos="5760"/>
+        </w:tabs>
+        <w:ind w:left="5760" w:hanging="360"/>
+      </w:pPr>
+      <w:rPr>
+        <w:rFonts w:ascii="Wingdings" w:hAnsi="Wingdings" w:hint="default"/>
+        <w:sz w:val="20"/>
+      </w:rPr>
+    </w:lvl>
+    <w:lvl w:ilvl="8" w:tentative="1">
+      <w:start w:val="1"/>
+      <w:numFmt w:val="bullet"/>
+      <w:lvlText w:val=""/>
+      <w:lvlJc w:val="left"/>
+      <w:pPr>
+        <w:tabs>
+          <w:tab w:val="num" w:pos="6480"/>
+        </w:tabs>
+        <w:ind w:left="6480" w:hanging="360"/>
+      </w:pPr>
+      <w:rPr>
+        <w:rFonts w:ascii="Wingdings" w:hAnsi="Wingdings" w:hint="default"/>
+        <w:sz w:val="20"/>
+      </w:rPr>
+    </w:lvl>
+  </w:abstractNum>
+  <w:abstractNum w:abstractNumId="3" w15:restartNumberingAfterBreak="0">
+    <w:nsid w:val="1F245870"/>
+    <w:multiLevelType w:val="multilevel"/>
+    <w:tmpl w:val="017C5984"/>
+    <w:lvl w:ilvl="0">
+      <w:start w:val="1"/>
+      <w:numFmt w:val="bullet"/>
+      <w:lvlText w:val=""/>
+      <w:lvlJc w:val="left"/>
+      <w:pPr>
+        <w:tabs>
+          <w:tab w:val="num" w:pos="720"/>
+        </w:tabs>
+        <w:ind w:left="720" w:hanging="360"/>
+      </w:pPr>
+      <w:rPr>
+        <w:rFonts w:ascii="Symbol" w:hAnsi="Symbol" w:hint="default"/>
+        <w:sz w:val="20"/>
+      </w:rPr>
+    </w:lvl>
+    <w:lvl w:ilvl="1" w:tentative="1">
+      <w:start w:val="1"/>
+      <w:numFmt w:val="bullet"/>
+      <w:lvlText w:val="o"/>
+      <w:lvlJc w:val="left"/>
+      <w:pPr>
+        <w:tabs>
+          <w:tab w:val="num" w:pos="1440"/>
+        </w:tabs>
+        <w:ind w:left="1440" w:hanging="360"/>
+      </w:pPr>
+      <w:rPr>
+        <w:rFonts w:ascii="Courier New" w:hAnsi="Courier New" w:hint="default"/>
+        <w:sz w:val="20"/>
+      </w:rPr>
+    </w:lvl>
+    <w:lvl w:ilvl="2" w:tentative="1">
+      <w:start w:val="1"/>
+      <w:numFmt w:val="bullet"/>
+      <w:lvlText w:val=""/>
+      <w:lvlJc w:val="left"/>
+      <w:pPr>
+        <w:tabs>
+          <w:tab w:val="num" w:pos="2160"/>
+        </w:tabs>
+        <w:ind w:left="2160" w:hanging="360"/>
+      </w:pPr>
+      <w:rPr>
+        <w:rFonts w:ascii="Wingdings" w:hAnsi="Wingdings" w:hint="default"/>
+        <w:sz w:val="20"/>
+      </w:rPr>
+    </w:lvl>
+    <w:lvl w:ilvl="3" w:tentative="1">
+      <w:start w:val="1"/>
+      <w:numFmt w:val="bullet"/>
+      <w:lvlText w:val=""/>
+      <w:lvlJc w:val="left"/>
+      <w:pPr>
+        <w:tabs>
+          <w:tab w:val="num" w:pos="2880"/>
+        </w:tabs>
+        <w:ind w:left="2880" w:hanging="360"/>
+      </w:pPr>
+      <w:rPr>
+        <w:rFonts w:ascii="Wingdings" w:hAnsi="Wingdings" w:hint="default"/>
+        <w:sz w:val="20"/>
+      </w:rPr>
+    </w:lvl>
+    <w:lvl w:ilvl="4" w:tentative="1">
+      <w:start w:val="1"/>
+      <w:numFmt w:val="bullet"/>
+      <w:lvlText w:val=""/>
+      <w:lvlJc w:val="left"/>
+      <w:pPr>
+        <w:tabs>
+          <w:tab w:val="num" w:pos="3600"/>
+        </w:tabs>
+        <w:ind w:left="3600" w:hanging="360"/>
+      </w:pPr>
+      <w:rPr>
+        <w:rFonts w:ascii="Wingdings" w:hAnsi="Wingdings" w:hint="default"/>
+        <w:sz w:val="20"/>
+      </w:rPr>
+    </w:lvl>
+    <w:lvl w:ilvl="5" w:tentative="1">
+      <w:start w:val="1"/>
+      <w:numFmt w:val="bullet"/>
+      <w:lvlText w:val=""/>
+      <w:lvlJc w:val="left"/>
+      <w:pPr>
+        <w:tabs>
+          <w:tab w:val="num" w:pos="4320"/>
+        </w:tabs>
+        <w:ind w:left="4320" w:hanging="360"/>
+      </w:pPr>
+      <w:rPr>
+        <w:rFonts w:ascii="Wingdings" w:hAnsi="Wingdings" w:hint="default"/>
+        <w:sz w:val="20"/>
+      </w:rPr>
+    </w:lvl>
+    <w:lvl w:ilvl="6" w:tentative="1">
+      <w:start w:val="1"/>
+      <w:numFmt w:val="bullet"/>
+      <w:lvlText w:val=""/>
+      <w:lvlJc w:val="left"/>
+      <w:pPr>
+        <w:tabs>
+          <w:tab w:val="num" w:pos="5040"/>
+        </w:tabs>
+        <w:ind w:left="5040" w:hanging="360"/>
+      </w:pPr>
+      <w:rPr>
+        <w:rFonts w:ascii="Wingdings" w:hAnsi="Wingdings" w:hint="default"/>
+        <w:sz w:val="20"/>
+      </w:rPr>
+    </w:lvl>
+    <w:lvl w:ilvl="7" w:tentative="1">
+      <w:start w:val="1"/>
+      <w:numFmt w:val="bullet"/>
+      <w:lvlText w:val=""/>
+      <w:lvlJc w:val="left"/>
+      <w:pPr>
+        <w:tabs>
+          <w:tab w:val="num" w:pos="5760"/>
+        </w:tabs>
+        <w:ind w:left="5760" w:hanging="360"/>
+      </w:pPr>
+      <w:rPr>
+        <w:rFonts w:ascii="Wingdings" w:hAnsi="Wingdings" w:hint="default"/>
+        <w:sz w:val="20"/>
+      </w:rPr>
+    </w:lvl>
+    <w:lvl w:ilvl="8" w:tentative="1">
+      <w:start w:val="1"/>
+      <w:numFmt w:val="bullet"/>
+      <w:lvlText w:val=""/>
+      <w:lvlJc w:val="left"/>
+      <w:pPr>
+        <w:tabs>
+          <w:tab w:val="num" w:pos="6480"/>
+        </w:tabs>
+        <w:ind w:left="6480" w:hanging="360"/>
+      </w:pPr>
+      <w:rPr>
+        <w:rFonts w:ascii="Wingdings" w:hAnsi="Wingdings" w:hint="default"/>
+        <w:sz w:val="20"/>
+      </w:rPr>
+    </w:lvl>
+  </w:abstractNum>
+  <w:abstractNum w:abstractNumId="4" w15:restartNumberingAfterBreak="0">
     <w:nsid w:val="23A80FEB"/>
     <w:multiLevelType w:val="multilevel"/>
     <w:tmpl w:val="A1DCE8CA"/>
@@ -1797,7 +2810,123 @@
       </w:rPr>
     </w:lvl>
   </w:abstractNum>
-  <w:abstractNum w:abstractNumId="3" w15:restartNumberingAfterBreak="0">
+  <w:abstractNum w:abstractNumId="5" w15:restartNumberingAfterBreak="0">
+    <w:nsid w:val="2977066E"/>
+    <w:multiLevelType w:val="multilevel"/>
+    <w:tmpl w:val="D9342C68"/>
+    <w:lvl w:ilvl="0">
+      <w:start w:val="1"/>
+      <w:numFmt w:val="bullet"/>
+      <w:lvlText w:val=""/>
+      <w:lvlJc w:val="left"/>
+      <w:pPr>
+        <w:tabs>
+          <w:tab w:val="num" w:pos="720"/>
+        </w:tabs>
+        <w:ind w:left="720" w:hanging="360"/>
+      </w:pPr>
+      <w:rPr>
+        <w:rFonts w:ascii="Symbol" w:hAnsi="Symbol" w:hint="default"/>
+      </w:rPr>
+    </w:lvl>
+    <w:lvl w:ilvl="1" w:tentative="1">
+      <w:start w:val="1"/>
+      <w:numFmt w:val="decimal"/>
+      <w:lvlText w:val="%2."/>
+      <w:lvlJc w:val="left"/>
+      <w:pPr>
+        <w:tabs>
+          <w:tab w:val="num" w:pos="1440"/>
+        </w:tabs>
+        <w:ind w:left="1440" w:hanging="360"/>
+      </w:pPr>
+    </w:lvl>
+    <w:lvl w:ilvl="2" w:tentative="1">
+      <w:start w:val="1"/>
+      <w:numFmt w:val="decimal"/>
+      <w:lvlText w:val="%3."/>
+      <w:lvlJc w:val="left"/>
+      <w:pPr>
+        <w:tabs>
+          <w:tab w:val="num" w:pos="2160"/>
+        </w:tabs>
+        <w:ind w:left="2160" w:hanging="360"/>
+      </w:pPr>
+    </w:lvl>
+    <w:lvl w:ilvl="3" w:tentative="1">
+      <w:start w:val="1"/>
+      <w:numFmt w:val="decimal"/>
+      <w:lvlText w:val="%4."/>
+      <w:lvlJc w:val="left"/>
+      <w:pPr>
+        <w:tabs>
+          <w:tab w:val="num" w:pos="2880"/>
+        </w:tabs>
+        <w:ind w:left="2880" w:hanging="360"/>
+      </w:pPr>
+    </w:lvl>
+    <w:lvl w:ilvl="4" w:tentative="1">
+      <w:start w:val="1"/>
+      <w:numFmt w:val="decimal"/>
+      <w:lvlText w:val="%5."/>
+      <w:lvlJc w:val="left"/>
+      <w:pPr>
+        <w:tabs>
+          <w:tab w:val="num" w:pos="3600"/>
+        </w:tabs>
+        <w:ind w:left="3600" w:hanging="360"/>
+      </w:pPr>
+    </w:lvl>
+    <w:lvl w:ilvl="5" w:tentative="1">
+      <w:start w:val="1"/>
+      <w:numFmt w:val="decimal"/>
+      <w:lvlText w:val="%6."/>
+      <w:lvlJc w:val="left"/>
+      <w:pPr>
+        <w:tabs>
+          <w:tab w:val="num" w:pos="4320"/>
+        </w:tabs>
+        <w:ind w:left="4320" w:hanging="360"/>
+      </w:pPr>
+    </w:lvl>
+    <w:lvl w:ilvl="6" w:tentative="1">
+      <w:start w:val="1"/>
+      <w:numFmt w:val="decimal"/>
+      <w:lvlText w:val="%7."/>
+      <w:lvlJc w:val="left"/>
+      <w:pPr>
+        <w:tabs>
+          <w:tab w:val="num" w:pos="5040"/>
+        </w:tabs>
+        <w:ind w:left="5040" w:hanging="360"/>
+      </w:pPr>
+    </w:lvl>
+    <w:lvl w:ilvl="7" w:tentative="1">
+      <w:start w:val="1"/>
+      <w:numFmt w:val="decimal"/>
+      <w:lvlText w:val="%8."/>
+      <w:lvlJc w:val="left"/>
+      <w:pPr>
+        <w:tabs>
+          <w:tab w:val="num" w:pos="5760"/>
+        </w:tabs>
+        <w:ind w:left="5760" w:hanging="360"/>
+      </w:pPr>
+    </w:lvl>
+    <w:lvl w:ilvl="8" w:tentative="1">
+      <w:start w:val="1"/>
+      <w:numFmt w:val="decimal"/>
+      <w:lvlText w:val="%9."/>
+      <w:lvlJc w:val="left"/>
+      <w:pPr>
+        <w:tabs>
+          <w:tab w:val="num" w:pos="6480"/>
+        </w:tabs>
+        <w:ind w:left="6480" w:hanging="360"/>
+      </w:pPr>
+    </w:lvl>
+  </w:abstractNum>
+  <w:abstractNum w:abstractNumId="6" w15:restartNumberingAfterBreak="0">
     <w:nsid w:val="4B460D4E"/>
     <w:multiLevelType w:val="hybridMultilevel"/>
     <w:tmpl w:val="F176FFFC"/>
@@ -1916,7 +3045,7 @@
       </w:rPr>
     </w:lvl>
   </w:abstractNum>
-  <w:abstractNum w:abstractNumId="4" w15:restartNumberingAfterBreak="0">
+  <w:abstractNum w:abstractNumId="7" w15:restartNumberingAfterBreak="0">
     <w:nsid w:val="5AA121CF"/>
     <w:multiLevelType w:val="hybridMultilevel"/>
     <w:tmpl w:val="801E8B90"/>
@@ -2029,7 +3158,120 @@
       </w:rPr>
     </w:lvl>
   </w:abstractNum>
-  <w:abstractNum w:abstractNumId="5" w15:restartNumberingAfterBreak="0">
+  <w:abstractNum w:abstractNumId="8" w15:restartNumberingAfterBreak="0">
+    <w:nsid w:val="5F6A2377"/>
+    <w:multiLevelType w:val="multilevel"/>
+    <w:tmpl w:val="6F5EC60A"/>
+    <w:lvl w:ilvl="0">
+      <w:start w:val="1"/>
+      <w:numFmt w:val="decimal"/>
+      <w:lvlText w:val="%1."/>
+      <w:lvlJc w:val="left"/>
+      <w:pPr>
+        <w:tabs>
+          <w:tab w:val="num" w:pos="720"/>
+        </w:tabs>
+        <w:ind w:left="720" w:hanging="360"/>
+      </w:pPr>
+    </w:lvl>
+    <w:lvl w:ilvl="1" w:tentative="1">
+      <w:start w:val="1"/>
+      <w:numFmt w:val="decimal"/>
+      <w:lvlText w:val="%2."/>
+      <w:lvlJc w:val="left"/>
+      <w:pPr>
+        <w:tabs>
+          <w:tab w:val="num" w:pos="1440"/>
+        </w:tabs>
+        <w:ind w:left="1440" w:hanging="360"/>
+      </w:pPr>
+    </w:lvl>
+    <w:lvl w:ilvl="2" w:tentative="1">
+      <w:start w:val="1"/>
+      <w:numFmt w:val="decimal"/>
+      <w:lvlText w:val="%3."/>
+      <w:lvlJc w:val="left"/>
+      <w:pPr>
+        <w:tabs>
+          <w:tab w:val="num" w:pos="2160"/>
+        </w:tabs>
+        <w:ind w:left="2160" w:hanging="360"/>
+      </w:pPr>
+    </w:lvl>
+    <w:lvl w:ilvl="3" w:tentative="1">
+      <w:start w:val="1"/>
+      <w:numFmt w:val="decimal"/>
+      <w:lvlText w:val="%4."/>
+      <w:lvlJc w:val="left"/>
+      <w:pPr>
+        <w:tabs>
+          <w:tab w:val="num" w:pos="2880"/>
+        </w:tabs>
+        <w:ind w:left="2880" w:hanging="360"/>
+      </w:pPr>
+    </w:lvl>
+    <w:lvl w:ilvl="4" w:tentative="1">
+      <w:start w:val="1"/>
+      <w:numFmt w:val="decimal"/>
+      <w:lvlText w:val="%5."/>
+      <w:lvlJc w:val="left"/>
+      <w:pPr>
+        <w:tabs>
+          <w:tab w:val="num" w:pos="3600"/>
+        </w:tabs>
+        <w:ind w:left="3600" w:hanging="360"/>
+      </w:pPr>
+    </w:lvl>
+    <w:lvl w:ilvl="5" w:tentative="1">
+      <w:start w:val="1"/>
+      <w:numFmt w:val="decimal"/>
+      <w:lvlText w:val="%6."/>
+      <w:lvlJc w:val="left"/>
+      <w:pPr>
+        <w:tabs>
+          <w:tab w:val="num" w:pos="4320"/>
+        </w:tabs>
+        <w:ind w:left="4320" w:hanging="360"/>
+      </w:pPr>
+    </w:lvl>
+    <w:lvl w:ilvl="6" w:tentative="1">
+      <w:start w:val="1"/>
+      <w:numFmt w:val="decimal"/>
+      <w:lvlText w:val="%7."/>
+      <w:lvlJc w:val="left"/>
+      <w:pPr>
+        <w:tabs>
+          <w:tab w:val="num" w:pos="5040"/>
+        </w:tabs>
+        <w:ind w:left="5040" w:hanging="360"/>
+      </w:pPr>
+    </w:lvl>
+    <w:lvl w:ilvl="7" w:tentative="1">
+      <w:start w:val="1"/>
+      <w:numFmt w:val="decimal"/>
+      <w:lvlText w:val="%8."/>
+      <w:lvlJc w:val="left"/>
+      <w:pPr>
+        <w:tabs>
+          <w:tab w:val="num" w:pos="5760"/>
+        </w:tabs>
+        <w:ind w:left="5760" w:hanging="360"/>
+      </w:pPr>
+    </w:lvl>
+    <w:lvl w:ilvl="8" w:tentative="1">
+      <w:start w:val="1"/>
+      <w:numFmt w:val="decimal"/>
+      <w:lvlText w:val="%9."/>
+      <w:lvlJc w:val="left"/>
+      <w:pPr>
+        <w:tabs>
+          <w:tab w:val="num" w:pos="6480"/>
+        </w:tabs>
+        <w:ind w:left="6480" w:hanging="360"/>
+      </w:pPr>
+    </w:lvl>
+  </w:abstractNum>
+  <w:abstractNum w:abstractNumId="9" w15:restartNumberingAfterBreak="0">
     <w:nsid w:val="698F6CA7"/>
     <w:multiLevelType w:val="multilevel"/>
     <w:tmpl w:val="A1DCE8CA"/>
@@ -2178,7 +3420,7 @@
       </w:rPr>
     </w:lvl>
   </w:abstractNum>
-  <w:abstractNum w:abstractNumId="6" w15:restartNumberingAfterBreak="0">
+  <w:abstractNum w:abstractNumId="10" w15:restartNumberingAfterBreak="0">
     <w:nsid w:val="762C4577"/>
     <w:multiLevelType w:val="hybridMultilevel"/>
     <w:tmpl w:val="574203A2"/>
@@ -2295,22 +3537,34 @@
     <w:abstractNumId w:val="1"/>
   </w:num>
   <w:num w:numId="2" w16cid:durableId="616839644">
-    <w:abstractNumId w:val="4"/>
+    <w:abstractNumId w:val="7"/>
   </w:num>
   <w:num w:numId="3" w16cid:durableId="2039355559">
+    <w:abstractNumId w:val="10"/>
+  </w:num>
+  <w:num w:numId="4" w16cid:durableId="1868716406">
     <w:abstractNumId w:val="6"/>
   </w:num>
-  <w:num w:numId="4" w16cid:durableId="1868716406">
-    <w:abstractNumId w:val="3"/>
-  </w:num>
   <w:num w:numId="5" w16cid:durableId="661087690">
-    <w:abstractNumId w:val="2"/>
+    <w:abstractNumId w:val="4"/>
   </w:num>
   <w:num w:numId="6" w16cid:durableId="324624186">
     <w:abstractNumId w:val="0"/>
   </w:num>
   <w:num w:numId="7" w16cid:durableId="265699617">
+    <w:abstractNumId w:val="9"/>
+  </w:num>
+  <w:num w:numId="8" w16cid:durableId="637078836">
+    <w:abstractNumId w:val="2"/>
+  </w:num>
+  <w:num w:numId="9" w16cid:durableId="214465044">
+    <w:abstractNumId w:val="8"/>
+  </w:num>
+  <w:num w:numId="10" w16cid:durableId="1734935567">
     <w:abstractNumId w:val="5"/>
+  </w:num>
+  <w:num w:numId="11" w16cid:durableId="1194541750">
+    <w:abstractNumId w:val="3"/>
   </w:num>
 </w:numbering>
 </file>

</xml_diff>

<commit_message>
docs: Added Formular to Calculate Metabolism Rate and daily calorie intake.
</commit_message>
<xml_diff>
--- a/Nutrients/Weight Loss.docx
+++ b/Nutrients/Weight Loss.docx
@@ -137,7 +137,21 @@
           <w:sz w:val="24"/>
           <w:szCs w:val="24"/>
         </w:rPr>
-        <w:t>To Loss weight we need to exercise to burn fat and calories.</w:t>
+        <w:t xml:space="preserve">To </w:t>
+      </w:r>
+      <w:r>
+        <w:rPr>
+          <w:sz w:val="24"/>
+          <w:szCs w:val="24"/>
+        </w:rPr>
+        <w:t>Lose</w:t>
+      </w:r>
+      <w:r>
+        <w:rPr>
+          <w:sz w:val="24"/>
+          <w:szCs w:val="24"/>
+        </w:rPr>
+        <w:t xml:space="preserve"> weight we need to exercise to burn fat and calories.</w:t>
       </w:r>
       <w:r>
         <w:rPr>
@@ -2022,6 +2036,1094 @@
           <w:szCs w:val="24"/>
         </w:rPr>
       </w:pPr>
+    </w:p>
+    <w:p>
+      <w:pPr>
+        <w:jc w:val="both"/>
+        <w:rPr>
+          <w:sz w:val="24"/>
+          <w:szCs w:val="24"/>
+        </w:rPr>
+      </w:pPr>
+      <w:r>
+        <w:rPr>
+          <w:sz w:val="24"/>
+          <w:szCs w:val="24"/>
+        </w:rPr>
+        <w:t>Talking about metabolism, there are formulas to calculate metabolism rate. Whatsoever you can even base on the formular to calculate the daily calorie intake for a person of any agenda or age. Below briefly describe.</w:t>
+      </w:r>
+    </w:p>
+    <w:p>
+      <w:pPr>
+        <w:jc w:val="both"/>
+        <w:rPr>
+          <w:sz w:val="24"/>
+          <w:szCs w:val="24"/>
+        </w:rPr>
+      </w:pPr>
+    </w:p>
+    <w:p>
+      <w:pPr>
+        <w:jc w:val="both"/>
+        <w:rPr>
+          <w:b/>
+          <w:bCs/>
+          <w:sz w:val="28"/>
+          <w:szCs w:val="28"/>
+        </w:rPr>
+      </w:pPr>
+      <w:r>
+        <w:rPr>
+          <w:b/>
+          <w:bCs/>
+          <w:sz w:val="28"/>
+          <w:szCs w:val="28"/>
+        </w:rPr>
+        <w:t>Harris-Benedict Equation</w:t>
+      </w:r>
+    </w:p>
+    <w:p>
+      <w:pPr>
+        <w:jc w:val="both"/>
+        <w:rPr>
+          <w:b/>
+          <w:bCs/>
+          <w:sz w:val="24"/>
+          <w:szCs w:val="24"/>
+        </w:rPr>
+      </w:pPr>
+      <w:r>
+        <w:rPr>
+          <w:b/>
+          <w:bCs/>
+          <w:sz w:val="24"/>
+          <w:szCs w:val="24"/>
+        </w:rPr>
+        <w:t>For men</w:t>
+      </w:r>
+      <w:r>
+        <w:rPr>
+          <w:b/>
+          <w:bCs/>
+          <w:sz w:val="24"/>
+          <w:szCs w:val="24"/>
+        </w:rPr>
+        <w:t xml:space="preserve"> (BMR Basic Metabolism Rate)</w:t>
+      </w:r>
+      <w:r>
+        <w:rPr>
+          <w:b/>
+          <w:bCs/>
+          <w:sz w:val="24"/>
+          <w:szCs w:val="24"/>
+        </w:rPr>
+        <w:t>:</w:t>
+      </w:r>
+    </w:p>
+    <w:p>
+      <w:pPr>
+        <w:jc w:val="both"/>
+        <w:rPr>
+          <w:sz w:val="24"/>
+          <w:szCs w:val="24"/>
+        </w:rPr>
+      </w:pPr>
+      <w:r>
+        <w:rPr>
+          <w:sz w:val="24"/>
+          <w:szCs w:val="24"/>
+        </w:rPr>
+        <w:t>BMR=66.5+(13.75×weight in </w:t>
+      </w:r>
+      <w:r>
+        <w:rPr>
+          <w:sz w:val="24"/>
+          <w:szCs w:val="24"/>
+        </w:rPr>
+        <w:t>kg) +(</w:t>
+      </w:r>
+      <w:r>
+        <w:rPr>
+          <w:sz w:val="24"/>
+          <w:szCs w:val="24"/>
+        </w:rPr>
+        <w:t>5.003×height in </w:t>
+      </w:r>
+      <w:r>
+        <w:rPr>
+          <w:sz w:val="24"/>
+          <w:szCs w:val="24"/>
+        </w:rPr>
+        <w:t>cm) −(</w:t>
+      </w:r>
+      <w:r>
+        <w:rPr>
+          <w:sz w:val="24"/>
+          <w:szCs w:val="24"/>
+        </w:rPr>
+        <w:t>6.75×age in years)</w:t>
+      </w:r>
+    </w:p>
+    <w:p>
+      <w:pPr>
+        <w:jc w:val="both"/>
+        <w:rPr>
+          <w:b/>
+          <w:bCs/>
+          <w:sz w:val="24"/>
+          <w:szCs w:val="24"/>
+        </w:rPr>
+      </w:pPr>
+      <w:r>
+        <w:rPr>
+          <w:b/>
+          <w:bCs/>
+          <w:sz w:val="24"/>
+          <w:szCs w:val="24"/>
+        </w:rPr>
+        <w:t>For women</w:t>
+      </w:r>
+      <w:r>
+        <w:rPr>
+          <w:b/>
+          <w:bCs/>
+          <w:sz w:val="24"/>
+          <w:szCs w:val="24"/>
+        </w:rPr>
+        <w:t xml:space="preserve"> </w:t>
+      </w:r>
+      <w:r>
+        <w:rPr>
+          <w:b/>
+          <w:bCs/>
+          <w:sz w:val="24"/>
+          <w:szCs w:val="24"/>
+        </w:rPr>
+        <w:t>(BMR Basic Metabolism Rate)</w:t>
+      </w:r>
+      <w:r>
+        <w:rPr>
+          <w:b/>
+          <w:bCs/>
+          <w:sz w:val="24"/>
+          <w:szCs w:val="24"/>
+        </w:rPr>
+        <w:t>:</w:t>
+      </w:r>
+    </w:p>
+    <w:p>
+      <w:pPr>
+        <w:jc w:val="both"/>
+        <w:rPr>
+          <w:sz w:val="24"/>
+          <w:szCs w:val="24"/>
+        </w:rPr>
+      </w:pPr>
+      <w:r>
+        <w:rPr>
+          <w:sz w:val="24"/>
+          <w:szCs w:val="24"/>
+        </w:rPr>
+        <w:t>BMR=655.1+(9.563×weight in </w:t>
+      </w:r>
+      <w:r>
+        <w:rPr>
+          <w:sz w:val="24"/>
+          <w:szCs w:val="24"/>
+        </w:rPr>
+        <w:t>kg) +(</w:t>
+      </w:r>
+      <w:r>
+        <w:rPr>
+          <w:sz w:val="24"/>
+          <w:szCs w:val="24"/>
+        </w:rPr>
+        <w:t>1.850×height in </w:t>
+      </w:r>
+      <w:r>
+        <w:rPr>
+          <w:sz w:val="24"/>
+          <w:szCs w:val="24"/>
+        </w:rPr>
+        <w:t>cm) −(</w:t>
+      </w:r>
+      <w:r>
+        <w:rPr>
+          <w:sz w:val="24"/>
+          <w:szCs w:val="24"/>
+        </w:rPr>
+        <w:t>4.676×age in years)</w:t>
+      </w:r>
+    </w:p>
+    <w:p>
+      <w:pPr>
+        <w:jc w:val="both"/>
+        <w:rPr>
+          <w:sz w:val="24"/>
+          <w:szCs w:val="24"/>
+        </w:rPr>
+      </w:pPr>
+    </w:p>
+    <w:p>
+      <w:pPr>
+        <w:jc w:val="both"/>
+        <w:rPr>
+          <w:b/>
+          <w:bCs/>
+          <w:sz w:val="28"/>
+          <w:szCs w:val="28"/>
+        </w:rPr>
+      </w:pPr>
+      <w:r>
+        <w:rPr>
+          <w:b/>
+          <w:bCs/>
+          <w:sz w:val="28"/>
+          <w:szCs w:val="28"/>
+        </w:rPr>
+        <w:t>Mifflin-St Jeor Equation</w:t>
+      </w:r>
+    </w:p>
+    <w:p>
+      <w:pPr>
+        <w:jc w:val="both"/>
+        <w:rPr>
+          <w:b/>
+          <w:bCs/>
+          <w:sz w:val="24"/>
+          <w:szCs w:val="24"/>
+        </w:rPr>
+      </w:pPr>
+      <w:r>
+        <w:rPr>
+          <w:b/>
+          <w:bCs/>
+          <w:sz w:val="24"/>
+          <w:szCs w:val="24"/>
+        </w:rPr>
+        <w:t>For men</w:t>
+      </w:r>
+      <w:r>
+        <w:rPr>
+          <w:b/>
+          <w:bCs/>
+          <w:sz w:val="24"/>
+          <w:szCs w:val="24"/>
+        </w:rPr>
+        <w:t xml:space="preserve"> </w:t>
+      </w:r>
+      <w:r>
+        <w:rPr>
+          <w:b/>
+          <w:bCs/>
+          <w:sz w:val="24"/>
+          <w:szCs w:val="24"/>
+        </w:rPr>
+        <w:t>(BMR Basic Metabolism Rate)</w:t>
+      </w:r>
+      <w:r>
+        <w:rPr>
+          <w:b/>
+          <w:bCs/>
+          <w:sz w:val="24"/>
+          <w:szCs w:val="24"/>
+        </w:rPr>
+        <w:t>:</w:t>
+      </w:r>
+    </w:p>
+    <w:p>
+      <w:pPr>
+        <w:jc w:val="both"/>
+        <w:rPr>
+          <w:sz w:val="24"/>
+          <w:szCs w:val="24"/>
+        </w:rPr>
+      </w:pPr>
+      <w:r>
+        <w:rPr>
+          <w:sz w:val="24"/>
+          <w:szCs w:val="24"/>
+        </w:rPr>
+        <w:t>BMR</w:t>
+      </w:r>
+      <w:r>
+        <w:rPr>
+          <w:sz w:val="24"/>
+          <w:szCs w:val="24"/>
+        </w:rPr>
+        <w:t>= (</w:t>
+      </w:r>
+      <w:r>
+        <w:rPr>
+          <w:sz w:val="24"/>
+          <w:szCs w:val="24"/>
+        </w:rPr>
+        <w:t>10×weight in </w:t>
+      </w:r>
+      <w:r>
+        <w:rPr>
+          <w:sz w:val="24"/>
+          <w:szCs w:val="24"/>
+        </w:rPr>
+        <w:t>kg) +(</w:t>
+      </w:r>
+      <w:r>
+        <w:rPr>
+          <w:sz w:val="24"/>
+          <w:szCs w:val="24"/>
+        </w:rPr>
+        <w:t>6.25×height in </w:t>
+      </w:r>
+      <w:r>
+        <w:rPr>
+          <w:sz w:val="24"/>
+          <w:szCs w:val="24"/>
+        </w:rPr>
+        <w:t>cm) −(</w:t>
+      </w:r>
+      <w:r>
+        <w:rPr>
+          <w:sz w:val="24"/>
+          <w:szCs w:val="24"/>
+        </w:rPr>
+        <w:t>5×age in </w:t>
+      </w:r>
+      <w:r>
+        <w:rPr>
+          <w:sz w:val="24"/>
+          <w:szCs w:val="24"/>
+        </w:rPr>
+        <w:t>years) +</w:t>
+      </w:r>
+      <w:r>
+        <w:rPr>
+          <w:sz w:val="24"/>
+          <w:szCs w:val="24"/>
+        </w:rPr>
+        <w:t>5</w:t>
+      </w:r>
+    </w:p>
+    <w:p>
+      <w:pPr>
+        <w:jc w:val="both"/>
+        <w:rPr>
+          <w:b/>
+          <w:bCs/>
+          <w:sz w:val="24"/>
+          <w:szCs w:val="24"/>
+        </w:rPr>
+      </w:pPr>
+      <w:r>
+        <w:rPr>
+          <w:b/>
+          <w:bCs/>
+          <w:sz w:val="24"/>
+          <w:szCs w:val="24"/>
+        </w:rPr>
+        <w:t>For women</w:t>
+      </w:r>
+      <w:r>
+        <w:rPr>
+          <w:b/>
+          <w:bCs/>
+          <w:sz w:val="24"/>
+          <w:szCs w:val="24"/>
+        </w:rPr>
+        <w:t xml:space="preserve"> </w:t>
+      </w:r>
+      <w:r>
+        <w:rPr>
+          <w:b/>
+          <w:bCs/>
+          <w:sz w:val="24"/>
+          <w:szCs w:val="24"/>
+        </w:rPr>
+        <w:t>(BMR Basic Metabolism Rate)</w:t>
+      </w:r>
+      <w:r>
+        <w:rPr>
+          <w:b/>
+          <w:bCs/>
+          <w:sz w:val="24"/>
+          <w:szCs w:val="24"/>
+        </w:rPr>
+        <w:t>:</w:t>
+      </w:r>
+    </w:p>
+    <w:p>
+      <w:pPr>
+        <w:jc w:val="both"/>
+        <w:rPr>
+          <w:sz w:val="24"/>
+          <w:szCs w:val="24"/>
+        </w:rPr>
+      </w:pPr>
+      <w:r>
+        <w:rPr>
+          <w:sz w:val="24"/>
+          <w:szCs w:val="24"/>
+        </w:rPr>
+        <w:t>BMR</w:t>
+      </w:r>
+      <w:r>
+        <w:rPr>
+          <w:sz w:val="24"/>
+          <w:szCs w:val="24"/>
+        </w:rPr>
+        <w:t>= (</w:t>
+      </w:r>
+      <w:r>
+        <w:rPr>
+          <w:sz w:val="24"/>
+          <w:szCs w:val="24"/>
+        </w:rPr>
+        <w:t>10×weight in </w:t>
+      </w:r>
+      <w:r>
+        <w:rPr>
+          <w:sz w:val="24"/>
+          <w:szCs w:val="24"/>
+        </w:rPr>
+        <w:t>kg) +(</w:t>
+      </w:r>
+      <w:r>
+        <w:rPr>
+          <w:sz w:val="24"/>
+          <w:szCs w:val="24"/>
+        </w:rPr>
+        <w:t>6.25×height in </w:t>
+      </w:r>
+      <w:r>
+        <w:rPr>
+          <w:sz w:val="24"/>
+          <w:szCs w:val="24"/>
+        </w:rPr>
+        <w:t>cm) −(</w:t>
+      </w:r>
+      <w:r>
+        <w:rPr>
+          <w:sz w:val="24"/>
+          <w:szCs w:val="24"/>
+        </w:rPr>
+        <w:t>5×age in </w:t>
+      </w:r>
+      <w:r>
+        <w:rPr>
+          <w:sz w:val="24"/>
+          <w:szCs w:val="24"/>
+        </w:rPr>
+        <w:t>years) −</w:t>
+      </w:r>
+      <w:r>
+        <w:rPr>
+          <w:sz w:val="24"/>
+          <w:szCs w:val="24"/>
+        </w:rPr>
+        <w:t>161</w:t>
+      </w:r>
+    </w:p>
+    <w:p>
+      <w:pPr>
+        <w:jc w:val="both"/>
+        <w:rPr>
+          <w:sz w:val="24"/>
+          <w:szCs w:val="24"/>
+        </w:rPr>
+      </w:pPr>
+    </w:p>
+    <w:p>
+      <w:pPr>
+        <w:jc w:val="both"/>
+        <w:rPr>
+          <w:sz w:val="24"/>
+          <w:szCs w:val="24"/>
+        </w:rPr>
+      </w:pPr>
+    </w:p>
+    <w:p>
+      <w:pPr>
+        <w:ind w:left="360"/>
+        <w:jc w:val="both"/>
+        <w:rPr>
+          <w:b/>
+          <w:bCs/>
+          <w:sz w:val="28"/>
+          <w:szCs w:val="28"/>
+        </w:rPr>
+      </w:pPr>
+      <w:r>
+        <w:rPr>
+          <w:b/>
+          <w:bCs/>
+          <w:sz w:val="28"/>
+          <w:szCs w:val="28"/>
+        </w:rPr>
+        <w:lastRenderedPageBreak/>
+        <w:t>Example Calculation</w:t>
+      </w:r>
+    </w:p>
+    <w:p>
+      <w:pPr>
+        <w:ind w:left="360"/>
+        <w:jc w:val="both"/>
+        <w:rPr>
+          <w:sz w:val="24"/>
+          <w:szCs w:val="24"/>
+        </w:rPr>
+      </w:pPr>
+      <w:r>
+        <w:rPr>
+          <w:sz w:val="24"/>
+          <w:szCs w:val="24"/>
+        </w:rPr>
+        <w:t>For a 45-year-old male weighing 116 kg and 180 cm tall using the Mifflin-St Jeor equation:</w:t>
+      </w:r>
+    </w:p>
+    <w:p>
+      <w:pPr>
+        <w:ind w:left="360"/>
+        <w:jc w:val="both"/>
+        <w:rPr>
+          <w:sz w:val="24"/>
+          <w:szCs w:val="24"/>
+        </w:rPr>
+      </w:pPr>
+      <w:r>
+        <w:rPr>
+          <w:sz w:val="24"/>
+          <w:szCs w:val="24"/>
+        </w:rPr>
+        <w:t>BMR</w:t>
+      </w:r>
+      <w:r>
+        <w:rPr>
+          <w:sz w:val="24"/>
+          <w:szCs w:val="24"/>
+        </w:rPr>
+        <w:t>= (</w:t>
+      </w:r>
+      <w:r>
+        <w:rPr>
+          <w:sz w:val="24"/>
+          <w:szCs w:val="24"/>
+        </w:rPr>
+        <w:t>10×</w:t>
+      </w:r>
+      <w:r>
+        <w:rPr>
+          <w:sz w:val="24"/>
+          <w:szCs w:val="24"/>
+        </w:rPr>
+        <w:t>116) +(</w:t>
+      </w:r>
+      <w:r>
+        <w:rPr>
+          <w:sz w:val="24"/>
+          <w:szCs w:val="24"/>
+        </w:rPr>
+        <w:t>6.25×</w:t>
+      </w:r>
+      <w:r>
+        <w:rPr>
+          <w:sz w:val="24"/>
+          <w:szCs w:val="24"/>
+        </w:rPr>
+        <w:t>180) −(</w:t>
+      </w:r>
+      <w:r>
+        <w:rPr>
+          <w:sz w:val="24"/>
+          <w:szCs w:val="24"/>
+        </w:rPr>
+        <w:t>5×</w:t>
+      </w:r>
+      <w:r>
+        <w:rPr>
+          <w:sz w:val="24"/>
+          <w:szCs w:val="24"/>
+        </w:rPr>
+        <w:t>45) +</w:t>
+      </w:r>
+      <w:r>
+        <w:rPr>
+          <w:sz w:val="24"/>
+          <w:szCs w:val="24"/>
+        </w:rPr>
+        <w:t>5=1160+1125−225+5=2065calories/day</w:t>
+      </w:r>
+    </w:p>
+    <w:p>
+      <w:pPr>
+        <w:ind w:left="360"/>
+        <w:jc w:val="both"/>
+        <w:rPr>
+          <w:sz w:val="24"/>
+          <w:szCs w:val="24"/>
+        </w:rPr>
+      </w:pPr>
+    </w:p>
+    <w:p>
+      <w:pPr>
+        <w:ind w:left="360"/>
+        <w:jc w:val="both"/>
+        <w:rPr>
+          <w:b/>
+          <w:bCs/>
+          <w:sz w:val="28"/>
+          <w:szCs w:val="28"/>
+        </w:rPr>
+      </w:pPr>
+      <w:r>
+        <w:rPr>
+          <w:b/>
+          <w:bCs/>
+          <w:sz w:val="28"/>
+          <w:szCs w:val="28"/>
+        </w:rPr>
+        <w:t>Total Daily Energy Expenditure (TDEE)</w:t>
+      </w:r>
+    </w:p>
+    <w:p>
+      <w:pPr>
+        <w:ind w:left="360"/>
+        <w:jc w:val="both"/>
+        <w:rPr>
+          <w:sz w:val="24"/>
+          <w:szCs w:val="24"/>
+        </w:rPr>
+      </w:pPr>
+      <w:r>
+        <w:rPr>
+          <w:sz w:val="24"/>
+          <w:szCs w:val="24"/>
+        </w:rPr>
+        <w:t>To get a more accurate picture of your daily calorie needs, you can calculate your Total Daily Energy Expenditure (TDEE) by multiplying your BMR by an activity factor:</w:t>
+      </w:r>
+    </w:p>
+    <w:p>
+      <w:pPr>
+        <w:numPr>
+          <w:ilvl w:val="0"/>
+          <w:numId w:val="12"/>
+        </w:numPr>
+        <w:jc w:val="both"/>
+        <w:rPr>
+          <w:sz w:val="24"/>
+          <w:szCs w:val="24"/>
+        </w:rPr>
+      </w:pPr>
+      <w:r>
+        <w:rPr>
+          <w:sz w:val="24"/>
+          <w:szCs w:val="24"/>
+        </w:rPr>
+        <w:t>Sedentary (little or no exercise): BMR (\times) 1.2</w:t>
+      </w:r>
+    </w:p>
+    <w:p>
+      <w:pPr>
+        <w:numPr>
+          <w:ilvl w:val="0"/>
+          <w:numId w:val="12"/>
+        </w:numPr>
+        <w:jc w:val="both"/>
+        <w:rPr>
+          <w:sz w:val="24"/>
+          <w:szCs w:val="24"/>
+        </w:rPr>
+      </w:pPr>
+      <w:r>
+        <w:rPr>
+          <w:sz w:val="24"/>
+          <w:szCs w:val="24"/>
+        </w:rPr>
+        <w:t>Lightly active (light exercise/sports 1-3 days/week): BMR (\times) 1.375</w:t>
+      </w:r>
+    </w:p>
+    <w:p>
+      <w:pPr>
+        <w:numPr>
+          <w:ilvl w:val="0"/>
+          <w:numId w:val="12"/>
+        </w:numPr>
+        <w:jc w:val="both"/>
+        <w:rPr>
+          <w:sz w:val="24"/>
+          <w:szCs w:val="24"/>
+        </w:rPr>
+      </w:pPr>
+      <w:r>
+        <w:rPr>
+          <w:sz w:val="24"/>
+          <w:szCs w:val="24"/>
+        </w:rPr>
+        <w:t>Moderately active (moderate exercise/sports 3-5 days/week): BMR (\times) 1.55</w:t>
+      </w:r>
+    </w:p>
+    <w:p>
+      <w:pPr>
+        <w:numPr>
+          <w:ilvl w:val="0"/>
+          <w:numId w:val="12"/>
+        </w:numPr>
+        <w:jc w:val="both"/>
+        <w:rPr>
+          <w:sz w:val="24"/>
+          <w:szCs w:val="24"/>
+        </w:rPr>
+      </w:pPr>
+      <w:r>
+        <w:rPr>
+          <w:sz w:val="24"/>
+          <w:szCs w:val="24"/>
+        </w:rPr>
+        <w:t>Very active (hard exercise/sports 6-7 days a week): BMR (\times) 1.725</w:t>
+      </w:r>
+    </w:p>
+    <w:p>
+      <w:pPr>
+        <w:numPr>
+          <w:ilvl w:val="0"/>
+          <w:numId w:val="12"/>
+        </w:numPr>
+        <w:jc w:val="both"/>
+        <w:rPr>
+          <w:sz w:val="24"/>
+          <w:szCs w:val="24"/>
+        </w:rPr>
+      </w:pPr>
+      <w:r>
+        <w:rPr>
+          <w:sz w:val="24"/>
+          <w:szCs w:val="24"/>
+        </w:rPr>
+        <w:t>Super active (very hard exercise/physical job): BMR (\times) 1.9</w:t>
+      </w:r>
+    </w:p>
+    <w:p>
+      <w:pPr>
+        <w:jc w:val="both"/>
+        <w:rPr>
+          <w:sz w:val="24"/>
+          <w:szCs w:val="24"/>
+        </w:rPr>
+      </w:pPr>
+    </w:p>
+    <w:p>
+      <w:pPr>
+        <w:ind w:left="360"/>
+        <w:jc w:val="both"/>
+        <w:rPr>
+          <w:b/>
+          <w:bCs/>
+          <w:sz w:val="28"/>
+          <w:szCs w:val="28"/>
+        </w:rPr>
+      </w:pPr>
+      <w:r>
+        <w:rPr>
+          <w:b/>
+          <w:bCs/>
+          <w:sz w:val="28"/>
+          <w:szCs w:val="28"/>
+        </w:rPr>
+        <w:t>Another Example:</w:t>
+      </w:r>
+    </w:p>
+    <w:p>
+      <w:pPr>
+        <w:ind w:left="360"/>
+        <w:jc w:val="both"/>
+        <w:rPr>
+          <w:sz w:val="24"/>
+          <w:szCs w:val="24"/>
+        </w:rPr>
+      </w:pPr>
+      <w:r>
+        <w:rPr>
+          <w:sz w:val="24"/>
+          <w:szCs w:val="24"/>
+        </w:rPr>
+        <w:t>W</w:t>
+      </w:r>
+      <w:r>
+        <w:rPr>
+          <w:sz w:val="24"/>
+          <w:szCs w:val="24"/>
+        </w:rPr>
+        <w:t xml:space="preserve">hat is the daily calorie needs for a </w:t>
+      </w:r>
+      <w:r>
+        <w:rPr>
+          <w:sz w:val="24"/>
+          <w:szCs w:val="24"/>
+        </w:rPr>
+        <w:t>45-year-old</w:t>
+      </w:r>
+      <w:r>
+        <w:rPr>
+          <w:sz w:val="24"/>
+          <w:szCs w:val="24"/>
+        </w:rPr>
+        <w:t xml:space="preserve"> male</w:t>
+      </w:r>
+      <w:r>
+        <w:rPr>
+          <w:sz w:val="24"/>
+          <w:szCs w:val="24"/>
+        </w:rPr>
+        <w:t xml:space="preserve"> weighting 116kg and 180cm tall</w:t>
+      </w:r>
+      <w:r>
+        <w:rPr>
+          <w:sz w:val="24"/>
+          <w:szCs w:val="24"/>
+        </w:rPr>
+        <w:t>?</w:t>
+      </w:r>
+    </w:p>
+    <w:p>
+      <w:pPr>
+        <w:ind w:left="360"/>
+        <w:jc w:val="both"/>
+        <w:rPr>
+          <w:sz w:val="24"/>
+          <w:szCs w:val="24"/>
+        </w:rPr>
+      </w:pPr>
+    </w:p>
+    <w:p>
+      <w:pPr>
+        <w:ind w:left="360"/>
+        <w:jc w:val="both"/>
+        <w:rPr>
+          <w:sz w:val="24"/>
+          <w:szCs w:val="24"/>
+        </w:rPr>
+      </w:pPr>
+      <w:r>
+        <w:rPr>
+          <w:sz w:val="24"/>
+          <w:szCs w:val="24"/>
+        </w:rPr>
+        <w:t>For a 45-year-old male weighing 116 kg and 180 cm tall</w:t>
+      </w:r>
+      <w:r>
+        <w:rPr>
+          <w:sz w:val="24"/>
+          <w:szCs w:val="24"/>
+        </w:rPr>
+        <w:t xml:space="preserve"> (by </w:t>
+      </w:r>
+      <w:r>
+        <w:rPr>
+          <w:sz w:val="24"/>
+          <w:szCs w:val="24"/>
+        </w:rPr>
+        <w:t>using the Mifflin-St Jeor equation</w:t>
+      </w:r>
+      <w:r>
+        <w:rPr>
+          <w:sz w:val="24"/>
+          <w:szCs w:val="24"/>
+        </w:rPr>
+        <w:t>)</w:t>
+      </w:r>
+      <w:r>
+        <w:rPr>
+          <w:sz w:val="24"/>
+          <w:szCs w:val="24"/>
+        </w:rPr>
+        <w:t>:</w:t>
+      </w:r>
+    </w:p>
+    <w:p>
+      <w:pPr>
+        <w:numPr>
+          <w:ilvl w:val="0"/>
+          <w:numId w:val="13"/>
+        </w:numPr>
+        <w:jc w:val="both"/>
+        <w:rPr>
+          <w:sz w:val="24"/>
+          <w:szCs w:val="24"/>
+        </w:rPr>
+      </w:pPr>
+      <w:r>
+        <w:rPr>
+          <w:b/>
+          <w:bCs/>
+          <w:sz w:val="24"/>
+          <w:szCs w:val="24"/>
+        </w:rPr>
+        <w:t>BMR</w:t>
+      </w:r>
+      <w:r>
+        <w:rPr>
+          <w:sz w:val="24"/>
+          <w:szCs w:val="24"/>
+        </w:rPr>
+        <w:t>:</w:t>
+      </w:r>
+    </w:p>
+    <w:p>
+      <w:pPr>
+        <w:ind w:left="360"/>
+        <w:jc w:val="both"/>
+        <w:rPr>
+          <w:sz w:val="24"/>
+          <w:szCs w:val="24"/>
+        </w:rPr>
+      </w:pPr>
+      <w:r>
+        <w:rPr>
+          <w:sz w:val="24"/>
+          <w:szCs w:val="24"/>
+        </w:rPr>
+        <w:t>BMR</w:t>
+      </w:r>
+      <w:r>
+        <w:rPr>
+          <w:sz w:val="24"/>
+          <w:szCs w:val="24"/>
+        </w:rPr>
+        <w:t>= (</w:t>
+      </w:r>
+      <w:r>
+        <w:rPr>
+          <w:sz w:val="24"/>
+          <w:szCs w:val="24"/>
+        </w:rPr>
+        <w:t>10×</w:t>
+      </w:r>
+      <w:r>
+        <w:rPr>
+          <w:sz w:val="24"/>
+          <w:szCs w:val="24"/>
+        </w:rPr>
+        <w:t>116) +(</w:t>
+      </w:r>
+      <w:r>
+        <w:rPr>
+          <w:sz w:val="24"/>
+          <w:szCs w:val="24"/>
+        </w:rPr>
+        <w:t>6.25×</w:t>
+      </w:r>
+      <w:r>
+        <w:rPr>
+          <w:sz w:val="24"/>
+          <w:szCs w:val="24"/>
+        </w:rPr>
+        <w:t>180) −(</w:t>
+      </w:r>
+      <w:r>
+        <w:rPr>
+          <w:sz w:val="24"/>
+          <w:szCs w:val="24"/>
+        </w:rPr>
+        <w:t>5×</w:t>
+      </w:r>
+      <w:r>
+        <w:rPr>
+          <w:sz w:val="24"/>
+          <w:szCs w:val="24"/>
+        </w:rPr>
+        <w:t>45) +</w:t>
+      </w:r>
+      <w:r>
+        <w:rPr>
+          <w:sz w:val="24"/>
+          <w:szCs w:val="24"/>
+        </w:rPr>
+        <w:t>5=2065calories/day</w:t>
+      </w:r>
+    </w:p>
+    <w:p>
+      <w:pPr>
+        <w:numPr>
+          <w:ilvl w:val="0"/>
+          <w:numId w:val="13"/>
+        </w:numPr>
+        <w:jc w:val="both"/>
+        <w:rPr>
+          <w:sz w:val="24"/>
+          <w:szCs w:val="24"/>
+        </w:rPr>
+      </w:pPr>
+      <w:r>
+        <w:rPr>
+          <w:b/>
+          <w:bCs/>
+          <w:sz w:val="24"/>
+          <w:szCs w:val="24"/>
+        </w:rPr>
+        <w:t>TDEE</w:t>
+      </w:r>
+      <w:r>
+        <w:rPr>
+          <w:sz w:val="24"/>
+          <w:szCs w:val="24"/>
+        </w:rPr>
+        <w:t xml:space="preserve"> (assuming a moderately active lifestyle):</w:t>
+      </w:r>
+    </w:p>
+    <w:p>
+      <w:pPr>
+        <w:ind w:left="360"/>
+        <w:jc w:val="both"/>
+        <w:rPr>
+          <w:sz w:val="24"/>
+          <w:szCs w:val="24"/>
+        </w:rPr>
+      </w:pPr>
+      <w:r>
+        <w:rPr>
+          <w:sz w:val="24"/>
+          <w:szCs w:val="24"/>
+        </w:rPr>
+        <w:t>TDEE=2065×1.55=3190.75calories/day</w:t>
+      </w:r>
+    </w:p>
+    <w:p>
+      <w:pPr>
+        <w:ind w:left="360"/>
+        <w:jc w:val="both"/>
+        <w:rPr>
+          <w:sz w:val="24"/>
+          <w:szCs w:val="24"/>
+        </w:rPr>
+      </w:pPr>
+      <w:r>
+        <w:rPr>
+          <w:sz w:val="24"/>
+          <w:szCs w:val="24"/>
+        </w:rPr>
+        <w:t xml:space="preserve">So, a moderately active 45-year-old male weighing 116 kg and 180 cm tall would need approximately </w:t>
+      </w:r>
+      <w:r>
+        <w:rPr>
+          <w:b/>
+          <w:bCs/>
+          <w:sz w:val="24"/>
+          <w:szCs w:val="24"/>
+        </w:rPr>
+        <w:t>3,191 calories per day</w:t>
+      </w:r>
+      <w:r>
+        <w:rPr>
+          <w:sz w:val="24"/>
+          <w:szCs w:val="24"/>
+        </w:rPr>
+        <w:t xml:space="preserve"> to maintain his current weight</w:t>
+      </w:r>
+      <w:r>
+        <w:rPr>
+          <w:sz w:val="24"/>
+          <w:szCs w:val="24"/>
+        </w:rPr>
+        <w:t>.</w:t>
+      </w:r>
     </w:p>
     <w:p>
       <w:pPr>
@@ -3046,6 +4148,119 @@
     </w:lvl>
   </w:abstractNum>
   <w:abstractNum w:abstractNumId="7" w15:restartNumberingAfterBreak="0">
+    <w:nsid w:val="58C12BCE"/>
+    <w:multiLevelType w:val="multilevel"/>
+    <w:tmpl w:val="54362AFC"/>
+    <w:lvl w:ilvl="0">
+      <w:start w:val="1"/>
+      <w:numFmt w:val="decimal"/>
+      <w:lvlText w:val="%1."/>
+      <w:lvlJc w:val="left"/>
+      <w:pPr>
+        <w:tabs>
+          <w:tab w:val="num" w:pos="720"/>
+        </w:tabs>
+        <w:ind w:left="720" w:hanging="360"/>
+      </w:pPr>
+    </w:lvl>
+    <w:lvl w:ilvl="1" w:tentative="1">
+      <w:start w:val="1"/>
+      <w:numFmt w:val="decimal"/>
+      <w:lvlText w:val="%2."/>
+      <w:lvlJc w:val="left"/>
+      <w:pPr>
+        <w:tabs>
+          <w:tab w:val="num" w:pos="1440"/>
+        </w:tabs>
+        <w:ind w:left="1440" w:hanging="360"/>
+      </w:pPr>
+    </w:lvl>
+    <w:lvl w:ilvl="2" w:tentative="1">
+      <w:start w:val="1"/>
+      <w:numFmt w:val="decimal"/>
+      <w:lvlText w:val="%3."/>
+      <w:lvlJc w:val="left"/>
+      <w:pPr>
+        <w:tabs>
+          <w:tab w:val="num" w:pos="2160"/>
+        </w:tabs>
+        <w:ind w:left="2160" w:hanging="360"/>
+      </w:pPr>
+    </w:lvl>
+    <w:lvl w:ilvl="3" w:tentative="1">
+      <w:start w:val="1"/>
+      <w:numFmt w:val="decimal"/>
+      <w:lvlText w:val="%4."/>
+      <w:lvlJc w:val="left"/>
+      <w:pPr>
+        <w:tabs>
+          <w:tab w:val="num" w:pos="2880"/>
+        </w:tabs>
+        <w:ind w:left="2880" w:hanging="360"/>
+      </w:pPr>
+    </w:lvl>
+    <w:lvl w:ilvl="4" w:tentative="1">
+      <w:start w:val="1"/>
+      <w:numFmt w:val="decimal"/>
+      <w:lvlText w:val="%5."/>
+      <w:lvlJc w:val="left"/>
+      <w:pPr>
+        <w:tabs>
+          <w:tab w:val="num" w:pos="3600"/>
+        </w:tabs>
+        <w:ind w:left="3600" w:hanging="360"/>
+      </w:pPr>
+    </w:lvl>
+    <w:lvl w:ilvl="5" w:tentative="1">
+      <w:start w:val="1"/>
+      <w:numFmt w:val="decimal"/>
+      <w:lvlText w:val="%6."/>
+      <w:lvlJc w:val="left"/>
+      <w:pPr>
+        <w:tabs>
+          <w:tab w:val="num" w:pos="4320"/>
+        </w:tabs>
+        <w:ind w:left="4320" w:hanging="360"/>
+      </w:pPr>
+    </w:lvl>
+    <w:lvl w:ilvl="6" w:tentative="1">
+      <w:start w:val="1"/>
+      <w:numFmt w:val="decimal"/>
+      <w:lvlText w:val="%7."/>
+      <w:lvlJc w:val="left"/>
+      <w:pPr>
+        <w:tabs>
+          <w:tab w:val="num" w:pos="5040"/>
+        </w:tabs>
+        <w:ind w:left="5040" w:hanging="360"/>
+      </w:pPr>
+    </w:lvl>
+    <w:lvl w:ilvl="7" w:tentative="1">
+      <w:start w:val="1"/>
+      <w:numFmt w:val="decimal"/>
+      <w:lvlText w:val="%8."/>
+      <w:lvlJc w:val="left"/>
+      <w:pPr>
+        <w:tabs>
+          <w:tab w:val="num" w:pos="5760"/>
+        </w:tabs>
+        <w:ind w:left="5760" w:hanging="360"/>
+      </w:pPr>
+    </w:lvl>
+    <w:lvl w:ilvl="8" w:tentative="1">
+      <w:start w:val="1"/>
+      <w:numFmt w:val="decimal"/>
+      <w:lvlText w:val="%9."/>
+      <w:lvlJc w:val="left"/>
+      <w:pPr>
+        <w:tabs>
+          <w:tab w:val="num" w:pos="6480"/>
+        </w:tabs>
+        <w:ind w:left="6480" w:hanging="360"/>
+      </w:pPr>
+    </w:lvl>
+  </w:abstractNum>
+  <w:abstractNum w:abstractNumId="8" w15:restartNumberingAfterBreak="0">
     <w:nsid w:val="5AA121CF"/>
     <w:multiLevelType w:val="hybridMultilevel"/>
     <w:tmpl w:val="801E8B90"/>
@@ -3158,7 +4373,7 @@
       </w:rPr>
     </w:lvl>
   </w:abstractNum>
-  <w:abstractNum w:abstractNumId="8" w15:restartNumberingAfterBreak="0">
+  <w:abstractNum w:abstractNumId="9" w15:restartNumberingAfterBreak="0">
     <w:nsid w:val="5F6A2377"/>
     <w:multiLevelType w:val="multilevel"/>
     <w:tmpl w:val="6F5EC60A"/>
@@ -3271,7 +4486,7 @@
       </w:pPr>
     </w:lvl>
   </w:abstractNum>
-  <w:abstractNum w:abstractNumId="9" w15:restartNumberingAfterBreak="0">
+  <w:abstractNum w:abstractNumId="10" w15:restartNumberingAfterBreak="0">
     <w:nsid w:val="698F6CA7"/>
     <w:multiLevelType w:val="multilevel"/>
     <w:tmpl w:val="A1DCE8CA"/>
@@ -3420,7 +4635,156 @@
       </w:rPr>
     </w:lvl>
   </w:abstractNum>
-  <w:abstractNum w:abstractNumId="10" w15:restartNumberingAfterBreak="0">
+  <w:abstractNum w:abstractNumId="11" w15:restartNumberingAfterBreak="0">
+    <w:nsid w:val="6DB3410E"/>
+    <w:multiLevelType w:val="multilevel"/>
+    <w:tmpl w:val="EC5AFCAC"/>
+    <w:lvl w:ilvl="0">
+      <w:start w:val="1"/>
+      <w:numFmt w:val="bullet"/>
+      <w:lvlText w:val=""/>
+      <w:lvlJc w:val="left"/>
+      <w:pPr>
+        <w:tabs>
+          <w:tab w:val="num" w:pos="720"/>
+        </w:tabs>
+        <w:ind w:left="720" w:hanging="360"/>
+      </w:pPr>
+      <w:rPr>
+        <w:rFonts w:ascii="Symbol" w:hAnsi="Symbol" w:hint="default"/>
+        <w:sz w:val="20"/>
+      </w:rPr>
+    </w:lvl>
+    <w:lvl w:ilvl="1" w:tentative="1">
+      <w:start w:val="1"/>
+      <w:numFmt w:val="bullet"/>
+      <w:lvlText w:val="o"/>
+      <w:lvlJc w:val="left"/>
+      <w:pPr>
+        <w:tabs>
+          <w:tab w:val="num" w:pos="1440"/>
+        </w:tabs>
+        <w:ind w:left="1440" w:hanging="360"/>
+      </w:pPr>
+      <w:rPr>
+        <w:rFonts w:ascii="Courier New" w:hAnsi="Courier New" w:hint="default"/>
+        <w:sz w:val="20"/>
+      </w:rPr>
+    </w:lvl>
+    <w:lvl w:ilvl="2" w:tentative="1">
+      <w:start w:val="1"/>
+      <w:numFmt w:val="bullet"/>
+      <w:lvlText w:val=""/>
+      <w:lvlJc w:val="left"/>
+      <w:pPr>
+        <w:tabs>
+          <w:tab w:val="num" w:pos="2160"/>
+        </w:tabs>
+        <w:ind w:left="2160" w:hanging="360"/>
+      </w:pPr>
+      <w:rPr>
+        <w:rFonts w:ascii="Wingdings" w:hAnsi="Wingdings" w:hint="default"/>
+        <w:sz w:val="20"/>
+      </w:rPr>
+    </w:lvl>
+    <w:lvl w:ilvl="3" w:tentative="1">
+      <w:start w:val="1"/>
+      <w:numFmt w:val="bullet"/>
+      <w:lvlText w:val=""/>
+      <w:lvlJc w:val="left"/>
+      <w:pPr>
+        <w:tabs>
+          <w:tab w:val="num" w:pos="2880"/>
+        </w:tabs>
+        <w:ind w:left="2880" w:hanging="360"/>
+      </w:pPr>
+      <w:rPr>
+        <w:rFonts w:ascii="Wingdings" w:hAnsi="Wingdings" w:hint="default"/>
+        <w:sz w:val="20"/>
+      </w:rPr>
+    </w:lvl>
+    <w:lvl w:ilvl="4" w:tentative="1">
+      <w:start w:val="1"/>
+      <w:numFmt w:val="bullet"/>
+      <w:lvlText w:val=""/>
+      <w:lvlJc w:val="left"/>
+      <w:pPr>
+        <w:tabs>
+          <w:tab w:val="num" w:pos="3600"/>
+        </w:tabs>
+        <w:ind w:left="3600" w:hanging="360"/>
+      </w:pPr>
+      <w:rPr>
+        <w:rFonts w:ascii="Wingdings" w:hAnsi="Wingdings" w:hint="default"/>
+        <w:sz w:val="20"/>
+      </w:rPr>
+    </w:lvl>
+    <w:lvl w:ilvl="5" w:tentative="1">
+      <w:start w:val="1"/>
+      <w:numFmt w:val="bullet"/>
+      <w:lvlText w:val=""/>
+      <w:lvlJc w:val="left"/>
+      <w:pPr>
+        <w:tabs>
+          <w:tab w:val="num" w:pos="4320"/>
+        </w:tabs>
+        <w:ind w:left="4320" w:hanging="360"/>
+      </w:pPr>
+      <w:rPr>
+        <w:rFonts w:ascii="Wingdings" w:hAnsi="Wingdings" w:hint="default"/>
+        <w:sz w:val="20"/>
+      </w:rPr>
+    </w:lvl>
+    <w:lvl w:ilvl="6" w:tentative="1">
+      <w:start w:val="1"/>
+      <w:numFmt w:val="bullet"/>
+      <w:lvlText w:val=""/>
+      <w:lvlJc w:val="left"/>
+      <w:pPr>
+        <w:tabs>
+          <w:tab w:val="num" w:pos="5040"/>
+        </w:tabs>
+        <w:ind w:left="5040" w:hanging="360"/>
+      </w:pPr>
+      <w:rPr>
+        <w:rFonts w:ascii="Wingdings" w:hAnsi="Wingdings" w:hint="default"/>
+        <w:sz w:val="20"/>
+      </w:rPr>
+    </w:lvl>
+    <w:lvl w:ilvl="7" w:tentative="1">
+      <w:start w:val="1"/>
+      <w:numFmt w:val="bullet"/>
+      <w:lvlText w:val=""/>
+      <w:lvlJc w:val="left"/>
+      <w:pPr>
+        <w:tabs>
+          <w:tab w:val="num" w:pos="5760"/>
+        </w:tabs>
+        <w:ind w:left="5760" w:hanging="360"/>
+      </w:pPr>
+      <w:rPr>
+        <w:rFonts w:ascii="Wingdings" w:hAnsi="Wingdings" w:hint="default"/>
+        <w:sz w:val="20"/>
+      </w:rPr>
+    </w:lvl>
+    <w:lvl w:ilvl="8" w:tentative="1">
+      <w:start w:val="1"/>
+      <w:numFmt w:val="bullet"/>
+      <w:lvlText w:val=""/>
+      <w:lvlJc w:val="left"/>
+      <w:pPr>
+        <w:tabs>
+          <w:tab w:val="num" w:pos="6480"/>
+        </w:tabs>
+        <w:ind w:left="6480" w:hanging="360"/>
+      </w:pPr>
+      <w:rPr>
+        <w:rFonts w:ascii="Wingdings" w:hAnsi="Wingdings" w:hint="default"/>
+        <w:sz w:val="20"/>
+      </w:rPr>
+    </w:lvl>
+  </w:abstractNum>
+  <w:abstractNum w:abstractNumId="12" w15:restartNumberingAfterBreak="0">
     <w:nsid w:val="762C4577"/>
     <w:multiLevelType w:val="hybridMultilevel"/>
     <w:tmpl w:val="574203A2"/>
@@ -3537,10 +4901,10 @@
     <w:abstractNumId w:val="1"/>
   </w:num>
   <w:num w:numId="2" w16cid:durableId="616839644">
-    <w:abstractNumId w:val="7"/>
+    <w:abstractNumId w:val="8"/>
   </w:num>
   <w:num w:numId="3" w16cid:durableId="2039355559">
-    <w:abstractNumId w:val="10"/>
+    <w:abstractNumId w:val="12"/>
   </w:num>
   <w:num w:numId="4" w16cid:durableId="1868716406">
     <w:abstractNumId w:val="6"/>
@@ -3552,19 +4916,25 @@
     <w:abstractNumId w:val="0"/>
   </w:num>
   <w:num w:numId="7" w16cid:durableId="265699617">
-    <w:abstractNumId w:val="9"/>
+    <w:abstractNumId w:val="10"/>
   </w:num>
   <w:num w:numId="8" w16cid:durableId="637078836">
     <w:abstractNumId w:val="2"/>
   </w:num>
   <w:num w:numId="9" w16cid:durableId="214465044">
-    <w:abstractNumId w:val="8"/>
+    <w:abstractNumId w:val="9"/>
   </w:num>
   <w:num w:numId="10" w16cid:durableId="1734935567">
     <w:abstractNumId w:val="5"/>
   </w:num>
   <w:num w:numId="11" w16cid:durableId="1194541750">
     <w:abstractNumId w:val="3"/>
+  </w:num>
+  <w:num w:numId="12" w16cid:durableId="2132703009">
+    <w:abstractNumId w:val="11"/>
+  </w:num>
+  <w:num w:numId="13" w16cid:durableId="1171144280">
+    <w:abstractNumId w:val="7"/>
   </w:num>
 </w:numbering>
 </file>
@@ -4014,6 +5384,27 @@
       <w:szCs w:val="24"/>
     </w:rPr>
   </w:style>
+  <w:style w:type="paragraph" w:styleId="Heading5">
+    <w:name w:val="heading 5"/>
+    <w:basedOn w:val="Normal"/>
+    <w:next w:val="Normal"/>
+    <w:link w:val="Heading5Char"/>
+    <w:uiPriority w:val="9"/>
+    <w:semiHidden/>
+    <w:unhideWhenUsed/>
+    <w:qFormat/>
+    <w:rsid w:val="00C4769E"/>
+    <w:pPr>
+      <w:keepNext/>
+      <w:keepLines/>
+      <w:spacing w:before="40" w:after="0"/>
+      <w:outlineLvl w:val="4"/>
+    </w:pPr>
+    <w:rPr>
+      <w:rFonts w:asciiTheme="majorHAnsi" w:eastAsiaTheme="majorEastAsia" w:hAnsiTheme="majorHAnsi" w:cstheme="majorBidi"/>
+      <w:color w:val="2F5496" w:themeColor="accent1" w:themeShade="BF"/>
+    </w:rPr>
+  </w:style>
   <w:style w:type="character" w:default="1" w:styleId="DefaultParagraphFont">
     <w:name w:val="Default Paragraph Font"/>
     <w:uiPriority w:val="1"/>
@@ -4144,6 +5535,18 @@
       <w:color w:val="1F3763" w:themeColor="accent1" w:themeShade="7F"/>
       <w:sz w:val="24"/>
       <w:szCs w:val="24"/>
+    </w:rPr>
+  </w:style>
+  <w:style w:type="character" w:customStyle="1" w:styleId="Heading5Char">
+    <w:name w:val="Heading 5 Char"/>
+    <w:basedOn w:val="DefaultParagraphFont"/>
+    <w:link w:val="Heading5"/>
+    <w:uiPriority w:val="9"/>
+    <w:semiHidden/>
+    <w:rsid w:val="00C4769E"/>
+    <w:rPr>
+      <w:rFonts w:asciiTheme="majorHAnsi" w:eastAsiaTheme="majorEastAsia" w:hAnsiTheme="majorHAnsi" w:cstheme="majorBidi"/>
+      <w:color w:val="2F5496" w:themeColor="accent1" w:themeShade="BF"/>
     </w:rPr>
   </w:style>
 </w:styles>

</xml_diff>

<commit_message>
docs: Update Metabolism rate Calculation
</commit_message>
<xml_diff>
--- a/Nutrients/Weight Loss.docx
+++ b/Nutrients/Weight Loss.docx
@@ -2050,7 +2050,21 @@
           <w:sz w:val="24"/>
           <w:szCs w:val="24"/>
         </w:rPr>
-        <w:t>Talking about metabolism, there are formulas to calculate metabolism rate. Whatsoever you can even base on the formular to calculate the daily calorie intake for a person of any agenda or age. Below briefly describe.</w:t>
+        <w:t>Talking about metabolism, there are formulas to calculate metabolism rate. Whatsoever you can even base on the formular to calculate the daily calorie intake for a person of any agenda or age</w:t>
+      </w:r>
+      <w:r>
+        <w:rPr>
+          <w:sz w:val="24"/>
+          <w:szCs w:val="24"/>
+        </w:rPr>
+        <w:t xml:space="preserve"> on any weight</w:t>
+      </w:r>
+      <w:r>
+        <w:rPr>
+          <w:sz w:val="24"/>
+          <w:szCs w:val="24"/>
+        </w:rPr>
+        <w:t>. Below briefly describe.</w:t>
       </w:r>
     </w:p>
     <w:p>
@@ -2133,35 +2147,7 @@
           <w:sz w:val="24"/>
           <w:szCs w:val="24"/>
         </w:rPr>
-        <w:t>BMR=66.5+(13.75×weight in </w:t>
-      </w:r>
-      <w:r>
-        <w:rPr>
-          <w:sz w:val="24"/>
-          <w:szCs w:val="24"/>
-        </w:rPr>
-        <w:t>kg) +(</w:t>
-      </w:r>
-      <w:r>
-        <w:rPr>
-          <w:sz w:val="24"/>
-          <w:szCs w:val="24"/>
-        </w:rPr>
-        <w:t>5.003×height in </w:t>
-      </w:r>
-      <w:r>
-        <w:rPr>
-          <w:sz w:val="24"/>
-          <w:szCs w:val="24"/>
-        </w:rPr>
-        <w:t>cm) −(</w:t>
-      </w:r>
-      <w:r>
-        <w:rPr>
-          <w:sz w:val="24"/>
-          <w:szCs w:val="24"/>
-        </w:rPr>
-        <w:t>6.75×age in years)</w:t>
+        <w:t>BMR=66.5+(13.75×weight in kg) +(5.003×height in cm) −(6.75×age in years)</w:t>
       </w:r>
     </w:p>
     <w:p>
@@ -2190,16 +2176,7 @@
           <w:sz w:val="24"/>
           <w:szCs w:val="24"/>
         </w:rPr>
-        <w:t xml:space="preserve"> </w:t>
-      </w:r>
-      <w:r>
-        <w:rPr>
-          <w:b/>
-          <w:bCs/>
-          <w:sz w:val="24"/>
-          <w:szCs w:val="24"/>
-        </w:rPr>
-        <w:t>(BMR Basic Metabolism Rate)</w:t>
+        <w:t xml:space="preserve"> (BMR Basic Metabolism Rate)</w:t>
       </w:r>
       <w:r>
         <w:rPr>
@@ -2224,35 +2201,7 @@
           <w:sz w:val="24"/>
           <w:szCs w:val="24"/>
         </w:rPr>
-        <w:t>BMR=655.1+(9.563×weight in </w:t>
-      </w:r>
-      <w:r>
-        <w:rPr>
-          <w:sz w:val="24"/>
-          <w:szCs w:val="24"/>
-        </w:rPr>
-        <w:t>kg) +(</w:t>
-      </w:r>
-      <w:r>
-        <w:rPr>
-          <w:sz w:val="24"/>
-          <w:szCs w:val="24"/>
-        </w:rPr>
-        <w:t>1.850×height in </w:t>
-      </w:r>
-      <w:r>
-        <w:rPr>
-          <w:sz w:val="24"/>
-          <w:szCs w:val="24"/>
-        </w:rPr>
-        <w:t>cm) −(</w:t>
-      </w:r>
-      <w:r>
-        <w:rPr>
-          <w:sz w:val="24"/>
-          <w:szCs w:val="24"/>
-        </w:rPr>
-        <w:t>4.676×age in years)</w:t>
+        <w:t>BMR=655.1+(9.563×weight in kg) +(1.850×height in cm) −(4.676×age in years)</w:t>
       </w:r>
     </w:p>
     <w:p>
@@ -2310,16 +2259,7 @@
           <w:sz w:val="24"/>
           <w:szCs w:val="24"/>
         </w:rPr>
-        <w:t xml:space="preserve"> </w:t>
-      </w:r>
-      <w:r>
-        <w:rPr>
-          <w:b/>
-          <w:bCs/>
-          <w:sz w:val="24"/>
-          <w:szCs w:val="24"/>
-        </w:rPr>
-        <w:t>(BMR Basic Metabolism Rate)</w:t>
+        <w:t xml:space="preserve"> (BMR Basic Metabolism Rate)</w:t>
       </w:r>
       <w:r>
         <w:rPr>
@@ -2344,63 +2284,7 @@
           <w:sz w:val="24"/>
           <w:szCs w:val="24"/>
         </w:rPr>
-        <w:t>BMR</w:t>
-      </w:r>
-      <w:r>
-        <w:rPr>
-          <w:sz w:val="24"/>
-          <w:szCs w:val="24"/>
-        </w:rPr>
-        <w:t>= (</w:t>
-      </w:r>
-      <w:r>
-        <w:rPr>
-          <w:sz w:val="24"/>
-          <w:szCs w:val="24"/>
-        </w:rPr>
-        <w:t>10×weight in </w:t>
-      </w:r>
-      <w:r>
-        <w:rPr>
-          <w:sz w:val="24"/>
-          <w:szCs w:val="24"/>
-        </w:rPr>
-        <w:t>kg) +(</w:t>
-      </w:r>
-      <w:r>
-        <w:rPr>
-          <w:sz w:val="24"/>
-          <w:szCs w:val="24"/>
-        </w:rPr>
-        <w:t>6.25×height in </w:t>
-      </w:r>
-      <w:r>
-        <w:rPr>
-          <w:sz w:val="24"/>
-          <w:szCs w:val="24"/>
-        </w:rPr>
-        <w:t>cm) −(</w:t>
-      </w:r>
-      <w:r>
-        <w:rPr>
-          <w:sz w:val="24"/>
-          <w:szCs w:val="24"/>
-        </w:rPr>
-        <w:t>5×age in </w:t>
-      </w:r>
-      <w:r>
-        <w:rPr>
-          <w:sz w:val="24"/>
-          <w:szCs w:val="24"/>
-        </w:rPr>
-        <w:t>years) +</w:t>
-      </w:r>
-      <w:r>
-        <w:rPr>
-          <w:sz w:val="24"/>
-          <w:szCs w:val="24"/>
-        </w:rPr>
-        <w:t>5</w:t>
+        <w:t>BMR= (10×weight in kg) +(6.25×height in cm) −(5×age in years) +5</w:t>
       </w:r>
     </w:p>
     <w:p>
@@ -2429,16 +2313,7 @@
           <w:sz w:val="24"/>
           <w:szCs w:val="24"/>
         </w:rPr>
-        <w:t xml:space="preserve"> </w:t>
-      </w:r>
-      <w:r>
-        <w:rPr>
-          <w:b/>
-          <w:bCs/>
-          <w:sz w:val="24"/>
-          <w:szCs w:val="24"/>
-        </w:rPr>
-        <w:t>(BMR Basic Metabolism Rate)</w:t>
+        <w:t xml:space="preserve"> (BMR Basic Metabolism Rate)</w:t>
       </w:r>
       <w:r>
         <w:rPr>
@@ -2463,63 +2338,7 @@
           <w:sz w:val="24"/>
           <w:szCs w:val="24"/>
         </w:rPr>
-        <w:t>BMR</w:t>
-      </w:r>
-      <w:r>
-        <w:rPr>
-          <w:sz w:val="24"/>
-          <w:szCs w:val="24"/>
-        </w:rPr>
-        <w:t>= (</w:t>
-      </w:r>
-      <w:r>
-        <w:rPr>
-          <w:sz w:val="24"/>
-          <w:szCs w:val="24"/>
-        </w:rPr>
-        <w:t>10×weight in </w:t>
-      </w:r>
-      <w:r>
-        <w:rPr>
-          <w:sz w:val="24"/>
-          <w:szCs w:val="24"/>
-        </w:rPr>
-        <w:t>kg) +(</w:t>
-      </w:r>
-      <w:r>
-        <w:rPr>
-          <w:sz w:val="24"/>
-          <w:szCs w:val="24"/>
-        </w:rPr>
-        <w:t>6.25×height in </w:t>
-      </w:r>
-      <w:r>
-        <w:rPr>
-          <w:sz w:val="24"/>
-          <w:szCs w:val="24"/>
-        </w:rPr>
-        <w:t>cm) −(</w:t>
-      </w:r>
-      <w:r>
-        <w:rPr>
-          <w:sz w:val="24"/>
-          <w:szCs w:val="24"/>
-        </w:rPr>
-        <w:t>5×age in </w:t>
-      </w:r>
-      <w:r>
-        <w:rPr>
-          <w:sz w:val="24"/>
-          <w:szCs w:val="24"/>
-        </w:rPr>
-        <w:t>years) −</w:t>
-      </w:r>
-      <w:r>
-        <w:rPr>
-          <w:sz w:val="24"/>
-          <w:szCs w:val="24"/>
-        </w:rPr>
-        <w:t>161</w:t>
+        <w:t>BMR= (10×weight in kg) +(6.25×height in cm) −(5×age in years) −161</w:t>
       </w:r>
     </w:p>
     <w:p>
@@ -2593,63 +2412,7 @@
           <w:sz w:val="24"/>
           <w:szCs w:val="24"/>
         </w:rPr>
-        <w:t>BMR</w:t>
-      </w:r>
-      <w:r>
-        <w:rPr>
-          <w:sz w:val="24"/>
-          <w:szCs w:val="24"/>
-        </w:rPr>
-        <w:t>= (</w:t>
-      </w:r>
-      <w:r>
-        <w:rPr>
-          <w:sz w:val="24"/>
-          <w:szCs w:val="24"/>
-        </w:rPr>
-        <w:t>10×</w:t>
-      </w:r>
-      <w:r>
-        <w:rPr>
-          <w:sz w:val="24"/>
-          <w:szCs w:val="24"/>
-        </w:rPr>
-        <w:t>116) +(</w:t>
-      </w:r>
-      <w:r>
-        <w:rPr>
-          <w:sz w:val="24"/>
-          <w:szCs w:val="24"/>
-        </w:rPr>
-        <w:t>6.25×</w:t>
-      </w:r>
-      <w:r>
-        <w:rPr>
-          <w:sz w:val="24"/>
-          <w:szCs w:val="24"/>
-        </w:rPr>
-        <w:t>180) −(</w:t>
-      </w:r>
-      <w:r>
-        <w:rPr>
-          <w:sz w:val="24"/>
-          <w:szCs w:val="24"/>
-        </w:rPr>
-        <w:t>5×</w:t>
-      </w:r>
-      <w:r>
-        <w:rPr>
-          <w:sz w:val="24"/>
-          <w:szCs w:val="24"/>
-        </w:rPr>
-        <w:t>45) +</w:t>
-      </w:r>
-      <w:r>
-        <w:rPr>
-          <w:sz w:val="24"/>
-          <w:szCs w:val="24"/>
-        </w:rPr>
-        <w:t>5=1160+1125−225+5=2065calories/day</w:t>
+        <w:t>BMR= (10×116) +(6.25×180) −(5×45) +5=1160+1125−225+5=2065calories/day</w:t>
       </w:r>
     </w:p>
     <w:p>
@@ -2851,21 +2614,21 @@
           <w:sz w:val="24"/>
           <w:szCs w:val="24"/>
         </w:rPr>
-        <w:t xml:space="preserve">hat is the daily calorie needs for a </w:t>
-      </w:r>
-      <w:r>
-        <w:rPr>
-          <w:sz w:val="24"/>
-          <w:szCs w:val="24"/>
-        </w:rPr>
-        <w:t>45-year-old</w:t>
-      </w:r>
-      <w:r>
-        <w:rPr>
-          <w:sz w:val="24"/>
-          <w:szCs w:val="24"/>
-        </w:rPr>
-        <w:t xml:space="preserve"> male</w:t>
+        <w:t xml:space="preserve">hat is the </w:t>
+      </w:r>
+      <w:r>
+        <w:rPr>
+          <w:sz w:val="24"/>
+          <w:szCs w:val="24"/>
+        </w:rPr>
+        <w:t xml:space="preserve">total </w:t>
+      </w:r>
+      <w:r>
+        <w:rPr>
+          <w:sz w:val="24"/>
+          <w:szCs w:val="24"/>
+        </w:rPr>
+        <w:t>daily calorie needs for a 45-year-old male</w:t>
       </w:r>
       <w:r>
         <w:rPr>
@@ -2873,6 +2636,13 @@
           <w:szCs w:val="24"/>
         </w:rPr>
         <w:t xml:space="preserve"> weighting 116kg and 180cm tall</w:t>
+      </w:r>
+      <w:r>
+        <w:rPr>
+          <w:sz w:val="24"/>
+          <w:szCs w:val="24"/>
+        </w:rPr>
+        <w:t xml:space="preserve"> with moderate excercise</w:t>
       </w:r>
       <w:r>
         <w:rPr>
@@ -2980,21 +2750,7 @@
           <w:sz w:val="24"/>
           <w:szCs w:val="24"/>
         </w:rPr>
-        <w:t>BMR</w:t>
-      </w:r>
-      <w:r>
-        <w:rPr>
-          <w:sz w:val="24"/>
-          <w:szCs w:val="24"/>
-        </w:rPr>
-        <w:t>= (</w:t>
-      </w:r>
-      <w:r>
-        <w:rPr>
-          <w:sz w:val="24"/>
-          <w:szCs w:val="24"/>
-        </w:rPr>
-        <w:t>10×</w:t>
+        <w:t>BMR= (10×</w:t>
       </w:r>
       <w:r>
         <w:rPr>
@@ -3124,16 +2880,6 @@
         </w:rPr>
         <w:t>.</w:t>
       </w:r>
-    </w:p>
-    <w:p>
-      <w:pPr>
-        <w:ind w:left="360"/>
-        <w:jc w:val="both"/>
-        <w:rPr>
-          <w:sz w:val="24"/>
-          <w:szCs w:val="24"/>
-        </w:rPr>
-      </w:pPr>
     </w:p>
     <w:p>
       <w:pPr>
@@ -5408,6 +5154,7 @@
   <w:style w:type="character" w:default="1" w:styleId="DefaultParagraphFont">
     <w:name w:val="Default Paragraph Font"/>
     <w:uiPriority w:val="1"/>
+    <w:semiHidden/>
     <w:unhideWhenUsed/>
   </w:style>
   <w:style w:type="table" w:default="1" w:styleId="TableNormal">

</xml_diff>

<commit_message>
docs: Added Factors affects Metabolism rate.
</commit_message>
<xml_diff>
--- a/Nutrients/Weight Loss.docx
+++ b/Nutrients/Weight Loss.docx
@@ -2642,7 +2642,14 @@
           <w:sz w:val="24"/>
           <w:szCs w:val="24"/>
         </w:rPr>
-        <w:t xml:space="preserve"> with moderate excercise</w:t>
+        <w:t xml:space="preserve"> with moderate </w:t>
+      </w:r>
+      <w:r>
+        <w:rPr>
+          <w:sz w:val="24"/>
+          <w:szCs w:val="24"/>
+        </w:rPr>
+        <w:t>exercise</w:t>
       </w:r>
       <w:r>
         <w:rPr>
@@ -2883,7 +2890,117 @@
     </w:p>
     <w:p>
       <w:pPr>
-        <w:jc w:val="both"/>
+        <w:rPr>
+          <w:sz w:val="24"/>
+          <w:szCs w:val="24"/>
+        </w:rPr>
+      </w:pPr>
+      <w:r>
+        <w:rPr>
+          <w:sz w:val="24"/>
+          <w:szCs w:val="24"/>
+        </w:rPr>
+        <w:br w:type="page"/>
+      </w:r>
+    </w:p>
+    <w:p>
+      <w:pPr>
+        <w:jc w:val="both"/>
+        <w:rPr>
+          <w:b/>
+          <w:bCs/>
+          <w:sz w:val="28"/>
+          <w:szCs w:val="28"/>
+        </w:rPr>
+      </w:pPr>
+      <w:r>
+        <w:rPr>
+          <w:b/>
+          <w:bCs/>
+          <w:sz w:val="28"/>
+          <w:szCs w:val="28"/>
+        </w:rPr>
+        <w:lastRenderedPageBreak/>
+        <w:t>Factors</w:t>
+      </w:r>
+      <w:r>
+        <w:rPr>
+          <w:b/>
+          <w:bCs/>
+          <w:sz w:val="28"/>
+          <w:szCs w:val="28"/>
+        </w:rPr>
+        <w:t xml:space="preserve"> </w:t>
+      </w:r>
+      <w:r>
+        <w:rPr>
+          <w:b/>
+          <w:bCs/>
+          <w:sz w:val="28"/>
+          <w:szCs w:val="28"/>
+        </w:rPr>
+        <w:t>decrease</w:t>
+      </w:r>
+      <w:r>
+        <w:rPr>
+          <w:b/>
+          <w:bCs/>
+          <w:sz w:val="28"/>
+          <w:szCs w:val="28"/>
+        </w:rPr>
+        <w:t xml:space="preserve"> </w:t>
+      </w:r>
+      <w:r>
+        <w:rPr>
+          <w:b/>
+          <w:bCs/>
+          <w:sz w:val="28"/>
+          <w:szCs w:val="28"/>
+        </w:rPr>
+        <w:t>m</w:t>
+      </w:r>
+      <w:r>
+        <w:rPr>
+          <w:b/>
+          <w:bCs/>
+          <w:sz w:val="28"/>
+          <w:szCs w:val="28"/>
+        </w:rPr>
+        <w:t>etabolism</w:t>
+      </w:r>
+      <w:r>
+        <w:rPr>
+          <w:b/>
+          <w:bCs/>
+          <w:sz w:val="28"/>
+          <w:szCs w:val="28"/>
+        </w:rPr>
+        <w:t xml:space="preserve"> rate</w:t>
+      </w:r>
+    </w:p>
+    <w:p>
+      <w:pPr>
+        <w:jc w:val="both"/>
+        <w:rPr>
+          <w:sz w:val="24"/>
+          <w:szCs w:val="24"/>
+        </w:rPr>
+      </w:pPr>
+      <w:r>
+        <w:rPr>
+          <w:sz w:val="24"/>
+          <w:szCs w:val="24"/>
+        </w:rPr>
+        <w:t>Several factors can decrease your metabolism rate</w:t>
+      </w:r>
+      <w:r>
+        <w:rPr>
+          <w:sz w:val="24"/>
+          <w:szCs w:val="24"/>
+        </w:rPr>
+        <w:t>,</w:t>
+      </w:r>
+      <w:r>
         <w:rPr>
           <w:b/>
           <w:bCs/>
@@ -2891,10 +3008,703 @@
           <w:sz w:val="24"/>
           <w:szCs w:val="24"/>
         </w:rPr>
-      </w:pPr>
-    </w:p>
-    <w:p>
-      <w:pPr>
+        <w:t xml:space="preserve"> making it harder to burn calories and lose weight</w:t>
+      </w:r>
+      <w:r>
+        <w:rPr>
+          <w:sz w:val="24"/>
+          <w:szCs w:val="24"/>
+        </w:rPr>
+        <w:t>. Here are some key factors:</w:t>
+      </w:r>
+    </w:p>
+    <w:p>
+      <w:pPr>
+        <w:pStyle w:val="ListParagraph"/>
+        <w:numPr>
+          <w:ilvl w:val="0"/>
+          <w:numId w:val="15"/>
+        </w:numPr>
+        <w:jc w:val="both"/>
+        <w:rPr>
+          <w:b/>
+          <w:bCs/>
+          <w:sz w:val="24"/>
+          <w:szCs w:val="24"/>
+        </w:rPr>
+      </w:pPr>
+      <w:r>
+        <w:rPr>
+          <w:b/>
+          <w:bCs/>
+          <w:sz w:val="24"/>
+          <w:szCs w:val="24"/>
+        </w:rPr>
+        <w:t>Age</w:t>
+      </w:r>
+    </w:p>
+    <w:p>
+      <w:pPr>
+        <w:ind w:left="720"/>
+        <w:jc w:val="both"/>
+        <w:rPr>
+          <w:sz w:val="24"/>
+          <w:szCs w:val="24"/>
+        </w:rPr>
+      </w:pPr>
+      <w:r>
+        <w:rPr>
+          <w:sz w:val="24"/>
+          <w:szCs w:val="24"/>
+        </w:rPr>
+        <w:t>As you get older, your metabolism naturally slows down due to a decrease in muscle mass and hormonal changes</w:t>
+      </w:r>
+      <w:r>
+        <w:rPr>
+          <w:sz w:val="24"/>
+          <w:szCs w:val="24"/>
+        </w:rPr>
+        <w:t>.</w:t>
+      </w:r>
+    </w:p>
+    <w:p>
+      <w:pPr>
+        <w:pStyle w:val="ListParagraph"/>
+        <w:numPr>
+          <w:ilvl w:val="0"/>
+          <w:numId w:val="15"/>
+        </w:numPr>
+        <w:jc w:val="both"/>
+        <w:rPr>
+          <w:b/>
+          <w:bCs/>
+          <w:sz w:val="24"/>
+          <w:szCs w:val="24"/>
+        </w:rPr>
+      </w:pPr>
+      <w:r>
+        <w:rPr>
+          <w:b/>
+          <w:bCs/>
+          <w:sz w:val="24"/>
+          <w:szCs w:val="24"/>
+        </w:rPr>
+        <w:t>Muscle Mass</w:t>
+      </w:r>
+    </w:p>
+    <w:p>
+      <w:pPr>
+        <w:ind w:left="720"/>
+        <w:jc w:val="both"/>
+        <w:rPr>
+          <w:sz w:val="24"/>
+          <w:szCs w:val="24"/>
+        </w:rPr>
+      </w:pPr>
+      <w:r>
+        <w:rPr>
+          <w:sz w:val="24"/>
+          <w:szCs w:val="24"/>
+        </w:rPr>
+        <w:t>Having less muscle mass can lower your metabolic rate since muscle tissue burns more calories at rest compared to fat tissue</w:t>
+      </w:r>
+      <w:r>
+        <w:rPr>
+          <w:sz w:val="24"/>
+          <w:szCs w:val="24"/>
+        </w:rPr>
+        <w:t>.</w:t>
+      </w:r>
+    </w:p>
+    <w:p>
+      <w:pPr>
+        <w:pStyle w:val="ListParagraph"/>
+        <w:numPr>
+          <w:ilvl w:val="0"/>
+          <w:numId w:val="15"/>
+        </w:numPr>
+        <w:jc w:val="both"/>
+        <w:rPr>
+          <w:b/>
+          <w:bCs/>
+          <w:sz w:val="24"/>
+          <w:szCs w:val="24"/>
+        </w:rPr>
+      </w:pPr>
+      <w:r>
+        <w:rPr>
+          <w:b/>
+          <w:bCs/>
+          <w:sz w:val="24"/>
+          <w:szCs w:val="24"/>
+        </w:rPr>
+        <w:t>Physical Activity</w:t>
+      </w:r>
+    </w:p>
+    <w:p>
+      <w:pPr>
+        <w:ind w:left="720"/>
+        <w:jc w:val="both"/>
+        <w:rPr>
+          <w:sz w:val="24"/>
+          <w:szCs w:val="24"/>
+        </w:rPr>
+      </w:pPr>
+      <w:r>
+        <w:rPr>
+          <w:sz w:val="24"/>
+          <w:szCs w:val="24"/>
+        </w:rPr>
+        <w:t>A sedentary lifestyle can significantly reduce your metabolism. Regular physical activity helps maintain muscle mass and boosts your metabolic rate</w:t>
+      </w:r>
+      <w:r>
+        <w:rPr>
+          <w:sz w:val="24"/>
+          <w:szCs w:val="24"/>
+        </w:rPr>
+        <w:t>.</w:t>
+      </w:r>
+    </w:p>
+    <w:p>
+      <w:pPr>
+        <w:pStyle w:val="ListParagraph"/>
+        <w:numPr>
+          <w:ilvl w:val="0"/>
+          <w:numId w:val="15"/>
+        </w:numPr>
+        <w:jc w:val="both"/>
+        <w:rPr>
+          <w:b/>
+          <w:bCs/>
+          <w:sz w:val="24"/>
+          <w:szCs w:val="24"/>
+        </w:rPr>
+      </w:pPr>
+      <w:r>
+        <w:rPr>
+          <w:b/>
+          <w:bCs/>
+          <w:sz w:val="24"/>
+          <w:szCs w:val="24"/>
+        </w:rPr>
+        <w:t>Diet</w:t>
+      </w:r>
+    </w:p>
+    <w:p>
+      <w:pPr>
+        <w:pStyle w:val="ListParagraph"/>
+        <w:numPr>
+          <w:ilvl w:val="2"/>
+          <w:numId w:val="6"/>
+        </w:numPr>
+        <w:jc w:val="both"/>
+        <w:rPr>
+          <w:b/>
+          <w:bCs/>
+          <w:sz w:val="24"/>
+          <w:szCs w:val="24"/>
+        </w:rPr>
+      </w:pPr>
+      <w:r>
+        <w:rPr>
+          <w:sz w:val="24"/>
+          <w:szCs w:val="24"/>
+        </w:rPr>
+        <w:t xml:space="preserve">Low-Calorie Diets: Consuming too few calories can cause your body to conserve </w:t>
+      </w:r>
+      <w:r>
+        <w:rPr>
+          <w:sz w:val="24"/>
+          <w:szCs w:val="24"/>
+        </w:rPr>
+        <w:tab/>
+      </w:r>
+      <w:r>
+        <w:rPr>
+          <w:sz w:val="24"/>
+          <w:szCs w:val="24"/>
+        </w:rPr>
+        <w:t>energy, slowing down your metabolism</w:t>
+      </w:r>
+      <w:r>
+        <w:rPr>
+          <w:sz w:val="24"/>
+          <w:szCs w:val="24"/>
+        </w:rPr>
+        <w:t>.</w:t>
+      </w:r>
+    </w:p>
+    <w:p>
+      <w:pPr>
+        <w:pStyle w:val="ListParagraph"/>
+        <w:numPr>
+          <w:ilvl w:val="2"/>
+          <w:numId w:val="6"/>
+        </w:numPr>
+        <w:jc w:val="both"/>
+        <w:rPr>
+          <w:b/>
+          <w:bCs/>
+          <w:sz w:val="24"/>
+          <w:szCs w:val="24"/>
+        </w:rPr>
+      </w:pPr>
+      <w:r>
+        <w:rPr>
+          <w:sz w:val="24"/>
+          <w:szCs w:val="24"/>
+        </w:rPr>
+        <w:t xml:space="preserve">Lack of Protein: Not eating enough protein can reduce muscle mass and lower </w:t>
+      </w:r>
+      <w:r>
+        <w:rPr>
+          <w:sz w:val="24"/>
+          <w:szCs w:val="24"/>
+        </w:rPr>
+        <w:tab/>
+      </w:r>
+      <w:r>
+        <w:rPr>
+          <w:sz w:val="24"/>
+          <w:szCs w:val="24"/>
+        </w:rPr>
+        <w:t>your metabolic rate</w:t>
+      </w:r>
+      <w:r>
+        <w:rPr>
+          <w:sz w:val="24"/>
+          <w:szCs w:val="24"/>
+        </w:rPr>
+        <w:t>.</w:t>
+      </w:r>
+    </w:p>
+    <w:p>
+      <w:pPr>
+        <w:pStyle w:val="ListParagraph"/>
+        <w:numPr>
+          <w:ilvl w:val="0"/>
+          <w:numId w:val="15"/>
+        </w:numPr>
+        <w:jc w:val="both"/>
+        <w:rPr>
+          <w:b/>
+          <w:bCs/>
+          <w:sz w:val="24"/>
+          <w:szCs w:val="24"/>
+        </w:rPr>
+      </w:pPr>
+      <w:r>
+        <w:rPr>
+          <w:b/>
+          <w:bCs/>
+          <w:sz w:val="24"/>
+          <w:szCs w:val="24"/>
+        </w:rPr>
+        <w:t>Hormonal Imbalances</w:t>
+      </w:r>
+      <w:r>
+        <w:rPr>
+          <w:b/>
+          <w:bCs/>
+          <w:sz w:val="24"/>
+          <w:szCs w:val="24"/>
+        </w:rPr>
+        <w:t xml:space="preserve"> </w:t>
+      </w:r>
+    </w:p>
+    <w:p>
+      <w:pPr>
+        <w:pStyle w:val="ListParagraph"/>
+        <w:numPr>
+          <w:ilvl w:val="2"/>
+          <w:numId w:val="6"/>
+        </w:numPr>
+        <w:jc w:val="both"/>
+        <w:rPr>
+          <w:b/>
+          <w:bCs/>
+          <w:sz w:val="24"/>
+          <w:szCs w:val="24"/>
+        </w:rPr>
+      </w:pPr>
+      <w:r>
+        <w:rPr>
+          <w:sz w:val="24"/>
+          <w:szCs w:val="24"/>
+        </w:rPr>
+        <w:t xml:space="preserve">Conditions like hypothyroidism (underactive thyroid) can slow down your </w:t>
+      </w:r>
+      <w:r>
+        <w:rPr>
+          <w:sz w:val="24"/>
+          <w:szCs w:val="24"/>
+        </w:rPr>
+        <w:tab/>
+      </w:r>
+      <w:r>
+        <w:rPr>
+          <w:sz w:val="24"/>
+          <w:szCs w:val="24"/>
+        </w:rPr>
+        <w:t>metabolism. </w:t>
+      </w:r>
+      <w:r>
+        <w:rPr>
+          <w:sz w:val="24"/>
+          <w:szCs w:val="24"/>
+        </w:rPr>
+        <w:t xml:space="preserve">Hormonal changes due to stress or other medical conditions can </w:t>
+      </w:r>
+      <w:r>
+        <w:rPr>
+          <w:sz w:val="24"/>
+          <w:szCs w:val="24"/>
+        </w:rPr>
+        <w:tab/>
+      </w:r>
+      <w:r>
+        <w:rPr>
+          <w:sz w:val="24"/>
+          <w:szCs w:val="24"/>
+        </w:rPr>
+        <w:t>also affect your metabolic rate</w:t>
+      </w:r>
+      <w:r>
+        <w:rPr>
+          <w:sz w:val="24"/>
+          <w:szCs w:val="24"/>
+        </w:rPr>
+        <w:t>.</w:t>
+      </w:r>
+    </w:p>
+    <w:p>
+      <w:pPr>
+        <w:pStyle w:val="ListParagraph"/>
+        <w:numPr>
+          <w:ilvl w:val="0"/>
+          <w:numId w:val="15"/>
+        </w:numPr>
+        <w:jc w:val="both"/>
+        <w:rPr>
+          <w:b/>
+          <w:bCs/>
+          <w:sz w:val="24"/>
+          <w:szCs w:val="24"/>
+        </w:rPr>
+      </w:pPr>
+      <w:r>
+        <w:rPr>
+          <w:b/>
+          <w:bCs/>
+          <w:sz w:val="24"/>
+          <w:szCs w:val="24"/>
+        </w:rPr>
+        <w:t>Sleep</w:t>
+      </w:r>
+    </w:p>
+    <w:p>
+      <w:pPr>
+        <w:pStyle w:val="ListParagraph"/>
+        <w:numPr>
+          <w:ilvl w:val="2"/>
+          <w:numId w:val="6"/>
+        </w:numPr>
+        <w:jc w:val="both"/>
+        <w:rPr>
+          <w:sz w:val="24"/>
+          <w:szCs w:val="24"/>
+        </w:rPr>
+      </w:pPr>
+      <w:r>
+        <w:rPr>
+          <w:sz w:val="24"/>
+          <w:szCs w:val="24"/>
+        </w:rPr>
+        <w:t xml:space="preserve">Poor sleep quality or insufficient sleep can negatively impact your metabolism </w:t>
+      </w:r>
+      <w:r>
+        <w:rPr>
+          <w:sz w:val="24"/>
+          <w:szCs w:val="24"/>
+        </w:rPr>
+        <w:tab/>
+      </w:r>
+      <w:r>
+        <w:rPr>
+          <w:sz w:val="24"/>
+          <w:szCs w:val="24"/>
+        </w:rPr>
+        <w:t>and increase the risk of weight gain</w:t>
+      </w:r>
+      <w:r>
+        <w:rPr>
+          <w:sz w:val="24"/>
+          <w:szCs w:val="24"/>
+        </w:rPr>
+        <w:t>.</w:t>
+      </w:r>
+    </w:p>
+    <w:p>
+      <w:pPr>
+        <w:pStyle w:val="ListParagraph"/>
+        <w:numPr>
+          <w:ilvl w:val="0"/>
+          <w:numId w:val="15"/>
+        </w:numPr>
+        <w:jc w:val="both"/>
+        <w:rPr>
+          <w:b/>
+          <w:bCs/>
+          <w:sz w:val="24"/>
+          <w:szCs w:val="24"/>
+        </w:rPr>
+      </w:pPr>
+      <w:r>
+        <w:rPr>
+          <w:b/>
+          <w:bCs/>
+          <w:sz w:val="24"/>
+          <w:szCs w:val="24"/>
+        </w:rPr>
+        <w:t>Hydration</w:t>
+      </w:r>
+    </w:p>
+    <w:p>
+      <w:pPr>
+        <w:pStyle w:val="ListParagraph"/>
+        <w:numPr>
+          <w:ilvl w:val="2"/>
+          <w:numId w:val="6"/>
+        </w:numPr>
+        <w:jc w:val="both"/>
+        <w:rPr>
+          <w:sz w:val="24"/>
+          <w:szCs w:val="24"/>
+        </w:rPr>
+      </w:pPr>
+      <w:r>
+        <w:rPr>
+          <w:sz w:val="24"/>
+          <w:szCs w:val="24"/>
+        </w:rPr>
+        <w:t>Dehydration can slow down your metabolism. </w:t>
+      </w:r>
+      <w:r>
+        <w:rPr>
+          <w:sz w:val="24"/>
+          <w:szCs w:val="24"/>
+        </w:rPr>
+        <w:t xml:space="preserve">Drinking enough water is </w:t>
+      </w:r>
+      <w:r>
+        <w:rPr>
+          <w:sz w:val="24"/>
+          <w:szCs w:val="24"/>
+        </w:rPr>
+        <w:tab/>
+      </w:r>
+      <w:r>
+        <w:rPr>
+          <w:sz w:val="24"/>
+          <w:szCs w:val="24"/>
+        </w:rPr>
+        <w:t>essential for maintaining metabolic processes</w:t>
+      </w:r>
+      <w:r>
+        <w:rPr>
+          <w:sz w:val="24"/>
+          <w:szCs w:val="24"/>
+        </w:rPr>
+        <w:t>.</w:t>
+      </w:r>
+    </w:p>
+    <w:p>
+      <w:pPr>
+        <w:pStyle w:val="ListParagraph"/>
+        <w:numPr>
+          <w:ilvl w:val="0"/>
+          <w:numId w:val="15"/>
+        </w:numPr>
+        <w:jc w:val="both"/>
+        <w:rPr>
+          <w:b/>
+          <w:bCs/>
+          <w:sz w:val="24"/>
+          <w:szCs w:val="24"/>
+        </w:rPr>
+      </w:pPr>
+      <w:r>
+        <w:rPr>
+          <w:b/>
+          <w:bCs/>
+          <w:sz w:val="24"/>
+          <w:szCs w:val="24"/>
+        </w:rPr>
+        <w:t>Stress</w:t>
+      </w:r>
+    </w:p>
+    <w:p>
+      <w:pPr>
+        <w:pStyle w:val="ListParagraph"/>
+        <w:numPr>
+          <w:ilvl w:val="2"/>
+          <w:numId w:val="6"/>
+        </w:numPr>
+        <w:jc w:val="both"/>
+        <w:rPr>
+          <w:sz w:val="24"/>
+          <w:szCs w:val="24"/>
+        </w:rPr>
+      </w:pPr>
+      <w:r>
+        <w:rPr>
+          <w:sz w:val="24"/>
+          <w:szCs w:val="24"/>
+        </w:rPr>
+        <w:t xml:space="preserve">Chronic stress can lead to hormonal imbalances that slow down your </w:t>
+      </w:r>
+      <w:r>
+        <w:rPr>
+          <w:sz w:val="24"/>
+          <w:szCs w:val="24"/>
+        </w:rPr>
+        <w:tab/>
+      </w:r>
+      <w:r>
+        <w:rPr>
+          <w:sz w:val="24"/>
+          <w:szCs w:val="24"/>
+        </w:rPr>
+        <w:t>metabolism. </w:t>
+      </w:r>
+      <w:r>
+        <w:rPr>
+          <w:sz w:val="24"/>
+          <w:szCs w:val="24"/>
+        </w:rPr>
+        <w:t xml:space="preserve">Managing stress through relaxation techniques can help maintain </w:t>
+      </w:r>
+      <w:r>
+        <w:rPr>
+          <w:sz w:val="24"/>
+          <w:szCs w:val="24"/>
+        </w:rPr>
+        <w:tab/>
+      </w:r>
+      <w:r>
+        <w:rPr>
+          <w:sz w:val="24"/>
+          <w:szCs w:val="24"/>
+        </w:rPr>
+        <w:t>a healthy metabolic rate</w:t>
+      </w:r>
+      <w:r>
+        <w:rPr>
+          <w:sz w:val="24"/>
+          <w:szCs w:val="24"/>
+        </w:rPr>
+        <w:t>.</w:t>
+      </w:r>
+    </w:p>
+    <w:p>
+      <w:pPr>
+        <w:pStyle w:val="ListParagraph"/>
+        <w:numPr>
+          <w:ilvl w:val="0"/>
+          <w:numId w:val="15"/>
+        </w:numPr>
+        <w:jc w:val="both"/>
+        <w:rPr>
+          <w:b/>
+          <w:bCs/>
+          <w:sz w:val="24"/>
+          <w:szCs w:val="24"/>
+        </w:rPr>
+      </w:pPr>
+      <w:r>
+        <w:rPr>
+          <w:b/>
+          <w:bCs/>
+          <w:sz w:val="24"/>
+          <w:szCs w:val="24"/>
+        </w:rPr>
+        <w:t>Medications</w:t>
+      </w:r>
+    </w:p>
+    <w:p>
+      <w:pPr>
+        <w:pStyle w:val="ListParagraph"/>
+        <w:numPr>
+          <w:ilvl w:val="2"/>
+          <w:numId w:val="6"/>
+        </w:numPr>
+        <w:jc w:val="both"/>
+        <w:rPr>
+          <w:sz w:val="24"/>
+          <w:szCs w:val="24"/>
+        </w:rPr>
+      </w:pPr>
+      <w:r>
+        <w:rPr>
+          <w:sz w:val="24"/>
+          <w:szCs w:val="24"/>
+        </w:rPr>
+        <w:t xml:space="preserve">Certain medications, such as antidepressants and steroids, can slow down your </w:t>
+      </w:r>
+      <w:r>
+        <w:rPr>
+          <w:sz w:val="24"/>
+          <w:szCs w:val="24"/>
+        </w:rPr>
+        <w:tab/>
+      </w:r>
+      <w:r>
+        <w:rPr>
+          <w:sz w:val="24"/>
+          <w:szCs w:val="24"/>
+        </w:rPr>
+        <w:t>metabolism as a side effect</w:t>
+      </w:r>
+      <w:r>
+        <w:rPr>
+          <w:sz w:val="24"/>
+          <w:szCs w:val="24"/>
+        </w:rPr>
+        <w:t>.</w:t>
+      </w:r>
+    </w:p>
+    <w:p>
+      <w:pPr>
+        <w:pStyle w:val="ListParagraph"/>
+        <w:numPr>
+          <w:ilvl w:val="0"/>
+          <w:numId w:val="15"/>
+        </w:numPr>
+        <w:jc w:val="both"/>
+        <w:rPr>
+          <w:b/>
+          <w:bCs/>
+          <w:sz w:val="24"/>
+          <w:szCs w:val="24"/>
+        </w:rPr>
+      </w:pPr>
+      <w:r>
+        <w:rPr>
+          <w:b/>
+          <w:bCs/>
+          <w:sz w:val="24"/>
+          <w:szCs w:val="24"/>
+        </w:rPr>
+        <w:t>Genetics</w:t>
+      </w:r>
+    </w:p>
+    <w:p>
+      <w:pPr>
+        <w:pStyle w:val="ListParagraph"/>
+        <w:numPr>
+          <w:ilvl w:val="2"/>
+          <w:numId w:val="6"/>
+        </w:numPr>
         <w:jc w:val="both"/>
         <w:rPr>
           <w:rStyle w:val="Strong"/>
@@ -2905,37 +3715,41 @@
           <w:szCs w:val="24"/>
         </w:rPr>
       </w:pPr>
-    </w:p>
-    <w:p>
-      <w:pPr>
-        <w:jc w:val="both"/>
-        <w:rPr>
-          <w:rStyle w:val="Strong"/>
-          <w:b w:val="0"/>
-          <w:bCs w:val="0"/>
-          <w:color w:val="FF0000"/>
-          <w:sz w:val="24"/>
-          <w:szCs w:val="24"/>
-        </w:rPr>
-      </w:pPr>
-    </w:p>
-    <w:p>
-      <w:pPr>
-        <w:jc w:val="both"/>
-        <w:rPr>
-          <w:sz w:val="24"/>
-          <w:szCs w:val="24"/>
-        </w:rPr>
-      </w:pPr>
-    </w:p>
-    <w:p>
-      <w:pPr>
-        <w:jc w:val="both"/>
-        <w:rPr>
-          <w:sz w:val="24"/>
-          <w:szCs w:val="24"/>
-        </w:rPr>
-      </w:pPr>
+      <w:r>
+        <w:rPr>
+          <w:sz w:val="24"/>
+          <w:szCs w:val="24"/>
+        </w:rPr>
+        <w:t xml:space="preserve">Your genetic makeup plays a significant role in determining your metabolic </w:t>
+      </w:r>
+      <w:r>
+        <w:rPr>
+          <w:sz w:val="24"/>
+          <w:szCs w:val="24"/>
+        </w:rPr>
+        <w:tab/>
+      </w:r>
+      <w:r>
+        <w:rPr>
+          <w:sz w:val="24"/>
+          <w:szCs w:val="24"/>
+        </w:rPr>
+        <w:t>rate. </w:t>
+      </w:r>
+      <w:r>
+        <w:rPr>
+          <w:sz w:val="24"/>
+          <w:szCs w:val="24"/>
+        </w:rPr>
+        <w:t>Some people naturally have a slower metabolism due to their genes</w:t>
+      </w:r>
+      <w:r>
+        <w:rPr>
+          <w:sz w:val="24"/>
+          <w:szCs w:val="24"/>
+        </w:rPr>
+        <w:t>.</w:t>
+      </w:r>
     </w:p>
     <w:sectPr>
       <w:pgSz w:w="11906" w:h="16838"/>
@@ -2952,7 +3766,7 @@
   <w:abstractNum w:abstractNumId="0" w15:restartNumberingAfterBreak="0">
     <w:nsid w:val="008D571D"/>
     <w:multiLevelType w:val="multilevel"/>
-    <w:tmpl w:val="A1DCE8CA"/>
+    <w:tmpl w:val="A316138A"/>
     <w:lvl w:ilvl="0">
       <w:start w:val="1"/>
       <w:numFmt w:val="bullet"/>
@@ -2985,120 +3799,265 @@
         <w:sz w:val="20"/>
       </w:rPr>
     </w:lvl>
-    <w:lvl w:ilvl="2" w:tentative="1">
+    <w:lvl w:ilvl="2">
+      <w:numFmt w:val="bullet"/>
+      <w:lvlText w:val="-"/>
+      <w:lvlJc w:val="left"/>
+      <w:pPr>
+        <w:ind w:left="1134" w:firstLine="0"/>
+      </w:pPr>
+      <w:rPr>
+        <w:rFonts w:ascii="Calibri" w:hAnsi="Calibri" w:hint="default"/>
+        <w:b w:val="0"/>
+      </w:rPr>
+    </w:lvl>
+    <w:lvl w:ilvl="3">
       <w:start w:val="1"/>
       <w:numFmt w:val="bullet"/>
       <w:lvlText w:val=""/>
       <w:lvlJc w:val="left"/>
       <w:pPr>
         <w:tabs>
-          <w:tab w:val="num" w:pos="2160"/>
-        </w:tabs>
-        <w:ind w:left="2160" w:hanging="360"/>
+          <w:tab w:val="num" w:pos="2880"/>
+        </w:tabs>
+        <w:ind w:left="2880" w:hanging="360"/>
       </w:pPr>
       <w:rPr>
         <w:rFonts w:ascii="Wingdings" w:hAnsi="Wingdings" w:hint="default"/>
         <w:sz w:val="20"/>
       </w:rPr>
     </w:lvl>
-    <w:lvl w:ilvl="3" w:tentative="1">
+    <w:lvl w:ilvl="4">
       <w:start w:val="1"/>
       <w:numFmt w:val="bullet"/>
       <w:lvlText w:val=""/>
       <w:lvlJc w:val="left"/>
       <w:pPr>
         <w:tabs>
-          <w:tab w:val="num" w:pos="2880"/>
-        </w:tabs>
-        <w:ind w:left="2880" w:hanging="360"/>
+          <w:tab w:val="num" w:pos="3600"/>
+        </w:tabs>
+        <w:ind w:left="3600" w:hanging="360"/>
       </w:pPr>
       <w:rPr>
         <w:rFonts w:ascii="Wingdings" w:hAnsi="Wingdings" w:hint="default"/>
         <w:sz w:val="20"/>
       </w:rPr>
     </w:lvl>
-    <w:lvl w:ilvl="4" w:tentative="1">
+    <w:lvl w:ilvl="5">
       <w:start w:val="1"/>
       <w:numFmt w:val="bullet"/>
       <w:lvlText w:val=""/>
       <w:lvlJc w:val="left"/>
       <w:pPr>
         <w:tabs>
-          <w:tab w:val="num" w:pos="3600"/>
-        </w:tabs>
-        <w:ind w:left="3600" w:hanging="360"/>
+          <w:tab w:val="num" w:pos="4320"/>
+        </w:tabs>
+        <w:ind w:left="4320" w:hanging="360"/>
       </w:pPr>
       <w:rPr>
         <w:rFonts w:ascii="Wingdings" w:hAnsi="Wingdings" w:hint="default"/>
         <w:sz w:val="20"/>
       </w:rPr>
     </w:lvl>
-    <w:lvl w:ilvl="5" w:tentative="1">
+    <w:lvl w:ilvl="6">
       <w:start w:val="1"/>
       <w:numFmt w:val="bullet"/>
       <w:lvlText w:val=""/>
       <w:lvlJc w:val="left"/>
       <w:pPr>
         <w:tabs>
-          <w:tab w:val="num" w:pos="4320"/>
-        </w:tabs>
-        <w:ind w:left="4320" w:hanging="360"/>
+          <w:tab w:val="num" w:pos="5040"/>
+        </w:tabs>
+        <w:ind w:left="5040" w:hanging="360"/>
       </w:pPr>
       <w:rPr>
         <w:rFonts w:ascii="Wingdings" w:hAnsi="Wingdings" w:hint="default"/>
         <w:sz w:val="20"/>
       </w:rPr>
     </w:lvl>
-    <w:lvl w:ilvl="6" w:tentative="1">
+    <w:lvl w:ilvl="7">
       <w:start w:val="1"/>
       <w:numFmt w:val="bullet"/>
       <w:lvlText w:val=""/>
       <w:lvlJc w:val="left"/>
       <w:pPr>
         <w:tabs>
-          <w:tab w:val="num" w:pos="5040"/>
-        </w:tabs>
-        <w:ind w:left="5040" w:hanging="360"/>
+          <w:tab w:val="num" w:pos="5760"/>
+        </w:tabs>
+        <w:ind w:left="5760" w:hanging="360"/>
       </w:pPr>
       <w:rPr>
         <w:rFonts w:ascii="Wingdings" w:hAnsi="Wingdings" w:hint="default"/>
         <w:sz w:val="20"/>
       </w:rPr>
     </w:lvl>
-    <w:lvl w:ilvl="7" w:tentative="1">
+    <w:lvl w:ilvl="8">
       <w:start w:val="1"/>
       <w:numFmt w:val="bullet"/>
       <w:lvlText w:val=""/>
       <w:lvlJc w:val="left"/>
       <w:pPr>
         <w:tabs>
-          <w:tab w:val="num" w:pos="5760"/>
-        </w:tabs>
-        <w:ind w:left="5760" w:hanging="360"/>
+          <w:tab w:val="num" w:pos="6480"/>
+        </w:tabs>
+        <w:ind w:left="6480" w:hanging="360"/>
       </w:pPr>
       <w:rPr>
         <w:rFonts w:ascii="Wingdings" w:hAnsi="Wingdings" w:hint="default"/>
         <w:sz w:val="20"/>
       </w:rPr>
     </w:lvl>
-    <w:lvl w:ilvl="8" w:tentative="1">
+  </w:abstractNum>
+  <w:abstractNum w:abstractNumId="1" w15:restartNumberingAfterBreak="0">
+    <w:nsid w:val="0294188B"/>
+    <w:multiLevelType w:val="multilevel"/>
+    <w:tmpl w:val="92E6E5CC"/>
+    <w:lvl w:ilvl="0">
+      <w:start w:val="1"/>
+      <w:numFmt w:val="bullet"/>
+      <w:lvlText w:val=""/>
+      <w:lvlJc w:val="left"/>
+      <w:pPr>
+        <w:tabs>
+          <w:tab w:val="num" w:pos="1080"/>
+        </w:tabs>
+        <w:ind w:left="1080" w:hanging="360"/>
+      </w:pPr>
+      <w:rPr>
+        <w:rFonts w:ascii="Symbol" w:hAnsi="Symbol" w:hint="default"/>
+        <w:sz w:val="20"/>
+      </w:rPr>
+    </w:lvl>
+    <w:lvl w:ilvl="1">
+      <w:start w:val="1"/>
+      <w:numFmt w:val="bullet"/>
+      <w:lvlText w:val="o"/>
+      <w:lvlJc w:val="left"/>
+      <w:pPr>
+        <w:tabs>
+          <w:tab w:val="num" w:pos="1800"/>
+        </w:tabs>
+        <w:ind w:left="1800" w:hanging="360"/>
+      </w:pPr>
+      <w:rPr>
+        <w:rFonts w:ascii="Courier New" w:hAnsi="Courier New" w:hint="default"/>
+        <w:sz w:val="20"/>
+      </w:rPr>
+    </w:lvl>
+    <w:lvl w:ilvl="2" w:tentative="1">
       <w:start w:val="1"/>
       <w:numFmt w:val="bullet"/>
       <w:lvlText w:val=""/>
       <w:lvlJc w:val="left"/>
       <w:pPr>
         <w:tabs>
-          <w:tab w:val="num" w:pos="6480"/>
-        </w:tabs>
-        <w:ind w:left="6480" w:hanging="360"/>
+          <w:tab w:val="num" w:pos="2520"/>
+        </w:tabs>
+        <w:ind w:left="2520" w:hanging="360"/>
       </w:pPr>
       <w:rPr>
         <w:rFonts w:ascii="Wingdings" w:hAnsi="Wingdings" w:hint="default"/>
         <w:sz w:val="20"/>
       </w:rPr>
     </w:lvl>
+    <w:lvl w:ilvl="3" w:tentative="1">
+      <w:start w:val="1"/>
+      <w:numFmt w:val="bullet"/>
+      <w:lvlText w:val=""/>
+      <w:lvlJc w:val="left"/>
+      <w:pPr>
+        <w:tabs>
+          <w:tab w:val="num" w:pos="3240"/>
+        </w:tabs>
+        <w:ind w:left="3240" w:hanging="360"/>
+      </w:pPr>
+      <w:rPr>
+        <w:rFonts w:ascii="Wingdings" w:hAnsi="Wingdings" w:hint="default"/>
+        <w:sz w:val="20"/>
+      </w:rPr>
+    </w:lvl>
+    <w:lvl w:ilvl="4" w:tentative="1">
+      <w:start w:val="1"/>
+      <w:numFmt w:val="bullet"/>
+      <w:lvlText w:val=""/>
+      <w:lvlJc w:val="left"/>
+      <w:pPr>
+        <w:tabs>
+          <w:tab w:val="num" w:pos="3960"/>
+        </w:tabs>
+        <w:ind w:left="3960" w:hanging="360"/>
+      </w:pPr>
+      <w:rPr>
+        <w:rFonts w:ascii="Wingdings" w:hAnsi="Wingdings" w:hint="default"/>
+        <w:sz w:val="20"/>
+      </w:rPr>
+    </w:lvl>
+    <w:lvl w:ilvl="5" w:tentative="1">
+      <w:start w:val="1"/>
+      <w:numFmt w:val="bullet"/>
+      <w:lvlText w:val=""/>
+      <w:lvlJc w:val="left"/>
+      <w:pPr>
+        <w:tabs>
+          <w:tab w:val="num" w:pos="4680"/>
+        </w:tabs>
+        <w:ind w:left="4680" w:hanging="360"/>
+      </w:pPr>
+      <w:rPr>
+        <w:rFonts w:ascii="Wingdings" w:hAnsi="Wingdings" w:hint="default"/>
+        <w:sz w:val="20"/>
+      </w:rPr>
+    </w:lvl>
+    <w:lvl w:ilvl="6" w:tentative="1">
+      <w:start w:val="1"/>
+      <w:numFmt w:val="bullet"/>
+      <w:lvlText w:val=""/>
+      <w:lvlJc w:val="left"/>
+      <w:pPr>
+        <w:tabs>
+          <w:tab w:val="num" w:pos="5400"/>
+        </w:tabs>
+        <w:ind w:left="5400" w:hanging="360"/>
+      </w:pPr>
+      <w:rPr>
+        <w:rFonts w:ascii="Wingdings" w:hAnsi="Wingdings" w:hint="default"/>
+        <w:sz w:val="20"/>
+      </w:rPr>
+    </w:lvl>
+    <w:lvl w:ilvl="7" w:tentative="1">
+      <w:start w:val="1"/>
+      <w:numFmt w:val="bullet"/>
+      <w:lvlText w:val=""/>
+      <w:lvlJc w:val="left"/>
+      <w:pPr>
+        <w:tabs>
+          <w:tab w:val="num" w:pos="6120"/>
+        </w:tabs>
+        <w:ind w:left="6120" w:hanging="360"/>
+      </w:pPr>
+      <w:rPr>
+        <w:rFonts w:ascii="Wingdings" w:hAnsi="Wingdings" w:hint="default"/>
+        <w:sz w:val="20"/>
+      </w:rPr>
+    </w:lvl>
+    <w:lvl w:ilvl="8" w:tentative="1">
+      <w:start w:val="1"/>
+      <w:numFmt w:val="bullet"/>
+      <w:lvlText w:val=""/>
+      <w:lvlJc w:val="left"/>
+      <w:pPr>
+        <w:tabs>
+          <w:tab w:val="num" w:pos="6840"/>
+        </w:tabs>
+        <w:ind w:left="6840" w:hanging="360"/>
+      </w:pPr>
+      <w:rPr>
+        <w:rFonts w:ascii="Wingdings" w:hAnsi="Wingdings" w:hint="default"/>
+        <w:sz w:val="20"/>
+      </w:rPr>
+    </w:lvl>
   </w:abstractNum>
-  <w:abstractNum w:abstractNumId="1" w15:restartNumberingAfterBreak="0">
+  <w:abstractNum w:abstractNumId="2" w15:restartNumberingAfterBreak="0">
     <w:nsid w:val="066F10BD"/>
     <w:multiLevelType w:val="hybridMultilevel"/>
     <w:tmpl w:val="98F445F4"/>
@@ -3211,7 +4170,7 @@
       </w:rPr>
     </w:lvl>
   </w:abstractNum>
-  <w:abstractNum w:abstractNumId="2" w15:restartNumberingAfterBreak="0">
+  <w:abstractNum w:abstractNumId="3" w15:restartNumberingAfterBreak="0">
     <w:nsid w:val="116D3FBA"/>
     <w:multiLevelType w:val="multilevel"/>
     <w:tmpl w:val="06F2D440"/>
@@ -3360,7 +4319,7 @@
       </w:rPr>
     </w:lvl>
   </w:abstractNum>
-  <w:abstractNum w:abstractNumId="3" w15:restartNumberingAfterBreak="0">
+  <w:abstractNum w:abstractNumId="4" w15:restartNumberingAfterBreak="0">
     <w:nsid w:val="1F245870"/>
     <w:multiLevelType w:val="multilevel"/>
     <w:tmpl w:val="017C5984"/>
@@ -3509,7 +4468,7 @@
       </w:rPr>
     </w:lvl>
   </w:abstractNum>
-  <w:abstractNum w:abstractNumId="4" w15:restartNumberingAfterBreak="0">
+  <w:abstractNum w:abstractNumId="5" w15:restartNumberingAfterBreak="0">
     <w:nsid w:val="23A80FEB"/>
     <w:multiLevelType w:val="multilevel"/>
     <w:tmpl w:val="A1DCE8CA"/>
@@ -3658,7 +4617,7 @@
       </w:rPr>
     </w:lvl>
   </w:abstractNum>
-  <w:abstractNum w:abstractNumId="5" w15:restartNumberingAfterBreak="0">
+  <w:abstractNum w:abstractNumId="6" w15:restartNumberingAfterBreak="0">
     <w:nsid w:val="2977066E"/>
     <w:multiLevelType w:val="multilevel"/>
     <w:tmpl w:val="D9342C68"/>
@@ -3774,7 +4733,7 @@
       </w:pPr>
     </w:lvl>
   </w:abstractNum>
-  <w:abstractNum w:abstractNumId="6" w15:restartNumberingAfterBreak="0">
+  <w:abstractNum w:abstractNumId="7" w15:restartNumberingAfterBreak="0">
     <w:nsid w:val="4B460D4E"/>
     <w:multiLevelType w:val="hybridMultilevel"/>
     <w:tmpl w:val="F176FFFC"/>
@@ -3893,7 +4852,7 @@
       </w:rPr>
     </w:lvl>
   </w:abstractNum>
-  <w:abstractNum w:abstractNumId="7" w15:restartNumberingAfterBreak="0">
+  <w:abstractNum w:abstractNumId="8" w15:restartNumberingAfterBreak="0">
     <w:nsid w:val="58C12BCE"/>
     <w:multiLevelType w:val="multilevel"/>
     <w:tmpl w:val="54362AFC"/>
@@ -4006,7 +4965,7 @@
       </w:pPr>
     </w:lvl>
   </w:abstractNum>
-  <w:abstractNum w:abstractNumId="8" w15:restartNumberingAfterBreak="0">
+  <w:abstractNum w:abstractNumId="9" w15:restartNumberingAfterBreak="0">
     <w:nsid w:val="5AA121CF"/>
     <w:multiLevelType w:val="hybridMultilevel"/>
     <w:tmpl w:val="801E8B90"/>
@@ -4119,7 +5078,7 @@
       </w:rPr>
     </w:lvl>
   </w:abstractNum>
-  <w:abstractNum w:abstractNumId="9" w15:restartNumberingAfterBreak="0">
+  <w:abstractNum w:abstractNumId="10" w15:restartNumberingAfterBreak="0">
     <w:nsid w:val="5F6A2377"/>
     <w:multiLevelType w:val="multilevel"/>
     <w:tmpl w:val="6F5EC60A"/>
@@ -4232,7 +5191,120 @@
       </w:pPr>
     </w:lvl>
   </w:abstractNum>
-  <w:abstractNum w:abstractNumId="10" w15:restartNumberingAfterBreak="0">
+  <w:abstractNum w:abstractNumId="11" w15:restartNumberingAfterBreak="0">
+    <w:nsid w:val="68FB3A87"/>
+    <w:multiLevelType w:val="hybridMultilevel"/>
+    <w:tmpl w:val="34E8EEEE"/>
+    <w:lvl w:ilvl="0" w:tplc="64CEBACA">
+      <w:start w:val="1"/>
+      <w:numFmt w:val="bullet"/>
+      <w:lvlText w:val=""/>
+      <w:lvlJc w:val="left"/>
+      <w:pPr>
+        <w:ind w:left="284" w:firstLine="76"/>
+      </w:pPr>
+      <w:rPr>
+        <w:rFonts w:ascii="Symbol" w:hAnsi="Symbol" w:hint="default"/>
+      </w:rPr>
+    </w:lvl>
+    <w:lvl w:ilvl="1" w:tplc="3C090003" w:tentative="1">
+      <w:start w:val="1"/>
+      <w:numFmt w:val="bullet"/>
+      <w:lvlText w:val="o"/>
+      <w:lvlJc w:val="left"/>
+      <w:pPr>
+        <w:ind w:left="1440" w:hanging="360"/>
+      </w:pPr>
+      <w:rPr>
+        <w:rFonts w:ascii="Courier New" w:hAnsi="Courier New" w:cs="Courier New" w:hint="default"/>
+      </w:rPr>
+    </w:lvl>
+    <w:lvl w:ilvl="2" w:tplc="3C090005" w:tentative="1">
+      <w:start w:val="1"/>
+      <w:numFmt w:val="bullet"/>
+      <w:lvlText w:val=""/>
+      <w:lvlJc w:val="left"/>
+      <w:pPr>
+        <w:ind w:left="2160" w:hanging="360"/>
+      </w:pPr>
+      <w:rPr>
+        <w:rFonts w:ascii="Wingdings" w:hAnsi="Wingdings" w:hint="default"/>
+      </w:rPr>
+    </w:lvl>
+    <w:lvl w:ilvl="3" w:tplc="3C090001" w:tentative="1">
+      <w:start w:val="1"/>
+      <w:numFmt w:val="bullet"/>
+      <w:lvlText w:val=""/>
+      <w:lvlJc w:val="left"/>
+      <w:pPr>
+        <w:ind w:left="2880" w:hanging="360"/>
+      </w:pPr>
+      <w:rPr>
+        <w:rFonts w:ascii="Symbol" w:hAnsi="Symbol" w:hint="default"/>
+      </w:rPr>
+    </w:lvl>
+    <w:lvl w:ilvl="4" w:tplc="3C090003" w:tentative="1">
+      <w:start w:val="1"/>
+      <w:numFmt w:val="bullet"/>
+      <w:lvlText w:val="o"/>
+      <w:lvlJc w:val="left"/>
+      <w:pPr>
+        <w:ind w:left="3600" w:hanging="360"/>
+      </w:pPr>
+      <w:rPr>
+        <w:rFonts w:ascii="Courier New" w:hAnsi="Courier New" w:cs="Courier New" w:hint="default"/>
+      </w:rPr>
+    </w:lvl>
+    <w:lvl w:ilvl="5" w:tplc="3C090005" w:tentative="1">
+      <w:start w:val="1"/>
+      <w:numFmt w:val="bullet"/>
+      <w:lvlText w:val=""/>
+      <w:lvlJc w:val="left"/>
+      <w:pPr>
+        <w:ind w:left="4320" w:hanging="360"/>
+      </w:pPr>
+      <w:rPr>
+        <w:rFonts w:ascii="Wingdings" w:hAnsi="Wingdings" w:hint="default"/>
+      </w:rPr>
+    </w:lvl>
+    <w:lvl w:ilvl="6" w:tplc="3C090001" w:tentative="1">
+      <w:start w:val="1"/>
+      <w:numFmt w:val="bullet"/>
+      <w:lvlText w:val=""/>
+      <w:lvlJc w:val="left"/>
+      <w:pPr>
+        <w:ind w:left="5040" w:hanging="360"/>
+      </w:pPr>
+      <w:rPr>
+        <w:rFonts w:ascii="Symbol" w:hAnsi="Symbol" w:hint="default"/>
+      </w:rPr>
+    </w:lvl>
+    <w:lvl w:ilvl="7" w:tplc="3C090003" w:tentative="1">
+      <w:start w:val="1"/>
+      <w:numFmt w:val="bullet"/>
+      <w:lvlText w:val="o"/>
+      <w:lvlJc w:val="left"/>
+      <w:pPr>
+        <w:ind w:left="5760" w:hanging="360"/>
+      </w:pPr>
+      <w:rPr>
+        <w:rFonts w:ascii="Courier New" w:hAnsi="Courier New" w:cs="Courier New" w:hint="default"/>
+      </w:rPr>
+    </w:lvl>
+    <w:lvl w:ilvl="8" w:tplc="3C090005" w:tentative="1">
+      <w:start w:val="1"/>
+      <w:numFmt w:val="bullet"/>
+      <w:lvlText w:val=""/>
+      <w:lvlJc w:val="left"/>
+      <w:pPr>
+        <w:ind w:left="6480" w:hanging="360"/>
+      </w:pPr>
+      <w:rPr>
+        <w:rFonts w:ascii="Wingdings" w:hAnsi="Wingdings" w:hint="default"/>
+      </w:rPr>
+    </w:lvl>
+  </w:abstractNum>
+  <w:abstractNum w:abstractNumId="12" w15:restartNumberingAfterBreak="0">
     <w:nsid w:val="698F6CA7"/>
     <w:multiLevelType w:val="multilevel"/>
     <w:tmpl w:val="A1DCE8CA"/>
@@ -4381,7 +5453,7 @@
       </w:rPr>
     </w:lvl>
   </w:abstractNum>
-  <w:abstractNum w:abstractNumId="11" w15:restartNumberingAfterBreak="0">
+  <w:abstractNum w:abstractNumId="13" w15:restartNumberingAfterBreak="0">
     <w:nsid w:val="6DB3410E"/>
     <w:multiLevelType w:val="multilevel"/>
     <w:tmpl w:val="EC5AFCAC"/>
@@ -4530,7 +5602,7 @@
       </w:rPr>
     </w:lvl>
   </w:abstractNum>
-  <w:abstractNum w:abstractNumId="12" w15:restartNumberingAfterBreak="0">
+  <w:abstractNum w:abstractNumId="14" w15:restartNumberingAfterBreak="0">
     <w:nsid w:val="762C4577"/>
     <w:multiLevelType w:val="hybridMultilevel"/>
     <w:tmpl w:val="574203A2"/>
@@ -4644,43 +5716,49 @@
     </w:lvl>
   </w:abstractNum>
   <w:num w:numId="1" w16cid:durableId="1733233544">
-    <w:abstractNumId w:val="1"/>
+    <w:abstractNumId w:val="2"/>
   </w:num>
   <w:num w:numId="2" w16cid:durableId="616839644">
-    <w:abstractNumId w:val="8"/>
+    <w:abstractNumId w:val="9"/>
   </w:num>
   <w:num w:numId="3" w16cid:durableId="2039355559">
-    <w:abstractNumId w:val="12"/>
+    <w:abstractNumId w:val="14"/>
   </w:num>
   <w:num w:numId="4" w16cid:durableId="1868716406">
-    <w:abstractNumId w:val="6"/>
+    <w:abstractNumId w:val="7"/>
   </w:num>
   <w:num w:numId="5" w16cid:durableId="661087690">
-    <w:abstractNumId w:val="4"/>
+    <w:abstractNumId w:val="5"/>
   </w:num>
   <w:num w:numId="6" w16cid:durableId="324624186">
     <w:abstractNumId w:val="0"/>
   </w:num>
   <w:num w:numId="7" w16cid:durableId="265699617">
+    <w:abstractNumId w:val="12"/>
+  </w:num>
+  <w:num w:numId="8" w16cid:durableId="637078836">
+    <w:abstractNumId w:val="3"/>
+  </w:num>
+  <w:num w:numId="9" w16cid:durableId="214465044">
     <w:abstractNumId w:val="10"/>
   </w:num>
-  <w:num w:numId="8" w16cid:durableId="637078836">
-    <w:abstractNumId w:val="2"/>
-  </w:num>
-  <w:num w:numId="9" w16cid:durableId="214465044">
-    <w:abstractNumId w:val="9"/>
-  </w:num>
   <w:num w:numId="10" w16cid:durableId="1734935567">
-    <w:abstractNumId w:val="5"/>
+    <w:abstractNumId w:val="6"/>
   </w:num>
   <w:num w:numId="11" w16cid:durableId="1194541750">
-    <w:abstractNumId w:val="3"/>
+    <w:abstractNumId w:val="4"/>
   </w:num>
   <w:num w:numId="12" w16cid:durableId="2132703009">
-    <w:abstractNumId w:val="11"/>
+    <w:abstractNumId w:val="13"/>
   </w:num>
   <w:num w:numId="13" w16cid:durableId="1171144280">
-    <w:abstractNumId w:val="7"/>
+    <w:abstractNumId w:val="8"/>
+  </w:num>
+  <w:num w:numId="14" w16cid:durableId="1150488785">
+    <w:abstractNumId w:val="1"/>
+  </w:num>
+  <w:num w:numId="15" w16cid:durableId="222915286">
+    <w:abstractNumId w:val="11"/>
   </w:num>
 </w:numbering>
 </file>
@@ -5154,7 +6232,6 @@
   <w:style w:type="character" w:default="1" w:styleId="DefaultParagraphFont">
     <w:name w:val="Default Paragraph Font"/>
     <w:uiPriority w:val="1"/>
-    <w:semiHidden/>
     <w:unhideWhenUsed/>
   </w:style>
   <w:style w:type="table" w:default="1" w:styleId="TableNormal">

</xml_diff>

<commit_message>
docs: added Strengthen Excercise for Weight loss.
</commit_message>
<xml_diff>
--- a/Nutrients/Weight Loss.docx
+++ b/Nutrients/Weight Loss.docx
@@ -3346,14 +3346,7 @@
           <w:sz w:val="24"/>
           <w:szCs w:val="24"/>
         </w:rPr>
-        <w:t>metabolism. </w:t>
-      </w:r>
-      <w:r>
-        <w:rPr>
-          <w:sz w:val="24"/>
-          <w:szCs w:val="24"/>
-        </w:rPr>
-        <w:t xml:space="preserve">Hormonal changes due to stress or other medical conditions can </w:t>
+        <w:t xml:space="preserve">metabolism. Hormonal changes due to stress or other medical conditions can </w:t>
       </w:r>
       <w:r>
         <w:rPr>
@@ -3487,14 +3480,7 @@
           <w:sz w:val="24"/>
           <w:szCs w:val="24"/>
         </w:rPr>
-        <w:t>Dehydration can slow down your metabolism. </w:t>
-      </w:r>
-      <w:r>
-        <w:rPr>
-          <w:sz w:val="24"/>
-          <w:szCs w:val="24"/>
-        </w:rPr>
-        <w:t xml:space="preserve">Drinking enough water is </w:t>
+        <w:t xml:space="preserve">Dehydration can slow down your metabolism. Drinking enough water is </w:t>
       </w:r>
       <w:r>
         <w:rPr>
@@ -3575,14 +3561,7 @@
           <w:sz w:val="24"/>
           <w:szCs w:val="24"/>
         </w:rPr>
-        <w:t>metabolism. </w:t>
-      </w:r>
-      <w:r>
-        <w:rPr>
-          <w:sz w:val="24"/>
-          <w:szCs w:val="24"/>
-        </w:rPr>
-        <w:t xml:space="preserve">Managing stress through relaxation techniques can help maintain </w:t>
+        <w:t xml:space="preserve">metabolism. Managing stress through relaxation techniques can help maintain </w:t>
       </w:r>
       <w:r>
         <w:rPr>
@@ -3707,48 +3686,730 @@
         </w:numPr>
         <w:jc w:val="both"/>
         <w:rPr>
+          <w:sz w:val="24"/>
+          <w:szCs w:val="24"/>
+        </w:rPr>
+      </w:pPr>
+      <w:r>
+        <w:rPr>
+          <w:sz w:val="24"/>
+          <w:szCs w:val="24"/>
+        </w:rPr>
+        <w:t xml:space="preserve">Your genetic makeup plays a significant role in determining your metabolic </w:t>
+      </w:r>
+      <w:r>
+        <w:rPr>
+          <w:sz w:val="24"/>
+          <w:szCs w:val="24"/>
+        </w:rPr>
+        <w:tab/>
+      </w:r>
+      <w:r>
+        <w:rPr>
+          <w:sz w:val="24"/>
+          <w:szCs w:val="24"/>
+        </w:rPr>
+        <w:t>rate. Some people naturally have a slower metabolism due to their genes</w:t>
+      </w:r>
+      <w:r>
+        <w:rPr>
+          <w:sz w:val="24"/>
+          <w:szCs w:val="24"/>
+        </w:rPr>
+        <w:t>.</w:t>
+      </w:r>
+    </w:p>
+    <w:p>
+      <w:pPr>
+        <w:jc w:val="both"/>
+        <w:rPr>
+          <w:sz w:val="24"/>
+          <w:szCs w:val="24"/>
+        </w:rPr>
+      </w:pPr>
+      <w:r>
+        <w:rPr>
+          <w:sz w:val="24"/>
+          <w:szCs w:val="24"/>
+        </w:rPr>
+        <w:br w:type="page"/>
+      </w:r>
+      <w:r>
+        <w:rPr>
+          <w:sz w:val="24"/>
+          <w:szCs w:val="24"/>
+        </w:rPr>
+        <w:lastRenderedPageBreak/>
+        <w:t xml:space="preserve">We now know what fat is. However, burning calories or fat for weight loss is not just </w:t>
+      </w:r>
+      <w:r>
+        <w:rPr>
+          <w:sz w:val="24"/>
+          <w:szCs w:val="24"/>
+        </w:rPr>
+        <w:t>the</w:t>
+      </w:r>
+      <w:r>
+        <w:rPr>
+          <w:sz w:val="24"/>
+          <w:szCs w:val="24"/>
+        </w:rPr>
+        <w:t xml:space="preserve"> only way. When we are doing exercise for example running (cardio exercise), what we are bunning is almost the fat that stored in our muscle. In order to efficiently or perhaps increase the chance for weight loss, we need to do some strengthen exercise (for example heavy weight lifting), which we are now dealing not fat but muscle. </w:t>
+      </w:r>
+      <w:r>
+        <w:rPr>
+          <w:sz w:val="24"/>
+          <w:szCs w:val="24"/>
+        </w:rPr>
+        <w:t xml:space="preserve">Below describe how strengthen exercise will help for burning calories for weight loss. </w:t>
+      </w:r>
+    </w:p>
+    <w:p>
+      <w:pPr>
+        <w:jc w:val="both"/>
+        <w:rPr>
+          <w:sz w:val="24"/>
+          <w:szCs w:val="24"/>
+        </w:rPr>
+      </w:pPr>
+    </w:p>
+    <w:p>
+      <w:pPr>
+        <w:jc w:val="both"/>
+        <w:rPr>
+          <w:b/>
+          <w:bCs/>
+          <w:sz w:val="28"/>
+          <w:szCs w:val="28"/>
+        </w:rPr>
+      </w:pPr>
+      <w:r>
+        <w:rPr>
+          <w:b/>
+          <w:bCs/>
+          <w:sz w:val="28"/>
+          <w:szCs w:val="28"/>
+        </w:rPr>
+        <w:t>Strengthen Exercise</w:t>
+      </w:r>
+    </w:p>
+    <w:p>
+      <w:pPr>
+        <w:jc w:val="both"/>
+        <w:rPr>
+          <w:sz w:val="24"/>
+          <w:szCs w:val="24"/>
+        </w:rPr>
+      </w:pPr>
+      <w:r>
+        <w:rPr>
+          <w:sz w:val="24"/>
+          <w:szCs w:val="24"/>
+        </w:rPr>
+        <w:t>Lifting heavy weights can significantly impact calorie and fat burning in several ways:</w:t>
+      </w:r>
+    </w:p>
+    <w:p>
+      <w:pPr>
+        <w:numPr>
+          <w:ilvl w:val="0"/>
+          <w:numId w:val="16"/>
+        </w:numPr>
+        <w:tabs>
+          <w:tab w:val="num" w:pos="720"/>
+        </w:tabs>
+        <w:jc w:val="both"/>
+        <w:rPr>
+          <w:sz w:val="24"/>
+          <w:szCs w:val="24"/>
+        </w:rPr>
+      </w:pPr>
+      <w:r>
+        <w:rPr>
+          <w:b/>
+          <w:bCs/>
+          <w:sz w:val="24"/>
+          <w:szCs w:val="24"/>
+        </w:rPr>
+        <w:t>Increased Calorie Burn</w:t>
+      </w:r>
+      <w:r>
+        <w:rPr>
+          <w:sz w:val="24"/>
+          <w:szCs w:val="24"/>
+        </w:rPr>
+        <w:t>: Weightlifting, especially heavy lifting, burns calories during the workout. The number of calories burned depends on the intensity and duration of the session</w:t>
+      </w:r>
+      <w:r>
+        <w:rPr>
+          <w:sz w:val="24"/>
+          <w:szCs w:val="24"/>
+        </w:rPr>
+        <w:t>.</w:t>
+      </w:r>
+    </w:p>
+    <w:p>
+      <w:pPr>
+        <w:numPr>
+          <w:ilvl w:val="0"/>
+          <w:numId w:val="16"/>
+        </w:numPr>
+        <w:tabs>
+          <w:tab w:val="num" w:pos="720"/>
+        </w:tabs>
+        <w:jc w:val="both"/>
+        <w:rPr>
+          <w:sz w:val="24"/>
+          <w:szCs w:val="24"/>
+        </w:rPr>
+      </w:pPr>
+      <w:r>
+        <w:rPr>
+          <w:b/>
+          <w:bCs/>
+          <w:sz w:val="24"/>
+          <w:szCs w:val="24"/>
+        </w:rPr>
+        <w:t>Muscle Growth</w:t>
+      </w:r>
+      <w:r>
+        <w:rPr>
+          <w:sz w:val="24"/>
+          <w:szCs w:val="24"/>
+        </w:rPr>
+        <w:t>: Building muscle through heavy lifting increases your basal metabolic rate (BMR), which means you burn more calories even at rest. Muscle tissue is more metabolically active than fat tissue</w:t>
+      </w:r>
+      <w:r>
+        <w:rPr>
+          <w:sz w:val="24"/>
+          <w:szCs w:val="24"/>
+        </w:rPr>
+        <w:t>.</w:t>
+      </w:r>
+    </w:p>
+    <w:p>
+      <w:pPr>
+        <w:numPr>
+          <w:ilvl w:val="0"/>
+          <w:numId w:val="16"/>
+        </w:numPr>
+        <w:tabs>
+          <w:tab w:val="num" w:pos="720"/>
+        </w:tabs>
+        <w:jc w:val="both"/>
+        <w:rPr>
+          <w:sz w:val="24"/>
+          <w:szCs w:val="24"/>
+        </w:rPr>
+      </w:pPr>
+      <w:r>
+        <w:rPr>
+          <w:b/>
+          <w:bCs/>
+          <w:sz w:val="24"/>
+          <w:szCs w:val="24"/>
+        </w:rPr>
+        <w:t>Excess Post-Exercise Oxygen Consumption (EPOC)</w:t>
+      </w:r>
+      <w:r>
+        <w:rPr>
+          <w:sz w:val="24"/>
+          <w:szCs w:val="24"/>
+        </w:rPr>
+        <w:t>: After a heavy lifting session, your body continues to burn calories at an elevated rate as it recovers. This phenomenon, known as EPOC, can last for hours or even days, depending on the workout’s intensity</w:t>
+      </w:r>
+      <w:r>
+        <w:rPr>
+          <w:sz w:val="24"/>
+          <w:szCs w:val="24"/>
+        </w:rPr>
+        <w:t>.</w:t>
+      </w:r>
+    </w:p>
+    <w:p>
+      <w:pPr>
+        <w:numPr>
+          <w:ilvl w:val="0"/>
+          <w:numId w:val="16"/>
+        </w:numPr>
+        <w:tabs>
+          <w:tab w:val="num" w:pos="720"/>
+        </w:tabs>
+        <w:jc w:val="both"/>
+        <w:rPr>
+          <w:sz w:val="24"/>
+          <w:szCs w:val="24"/>
+        </w:rPr>
+      </w:pPr>
+      <w:r>
+        <w:rPr>
+          <w:b/>
+          <w:bCs/>
+          <w:sz w:val="24"/>
+          <w:szCs w:val="24"/>
+        </w:rPr>
+        <w:t>Fat Loss</w:t>
+      </w:r>
+      <w:r>
+        <w:rPr>
+          <w:sz w:val="24"/>
+          <w:szCs w:val="24"/>
+        </w:rPr>
+        <w:t>: While cardio is often associated with fat loss, weightlifting can be equally effective. The muscle gained from lifting weights helps to burn more fat over time. Additionally, weightlifting can help preserve muscle mass during a calorie deficit, which is crucial for maintaining a healthy metabolism</w:t>
+      </w:r>
+      <w:r>
+        <w:rPr>
+          <w:sz w:val="24"/>
+          <w:szCs w:val="24"/>
+        </w:rPr>
+        <w:t>.</w:t>
+      </w:r>
+    </w:p>
+    <w:p>
+      <w:pPr>
+        <w:jc w:val="both"/>
+        <w:rPr>
+          <w:sz w:val="24"/>
+          <w:szCs w:val="24"/>
+        </w:rPr>
+      </w:pPr>
+    </w:p>
+    <w:p>
+      <w:pPr>
+        <w:jc w:val="both"/>
+        <w:rPr>
+          <w:sz w:val="24"/>
+          <w:szCs w:val="24"/>
+        </w:rPr>
+      </w:pPr>
+      <w:r>
+        <w:rPr>
+          <w:sz w:val="24"/>
+          <w:szCs w:val="24"/>
+        </w:rPr>
+        <w:t>In summary, heavy weightlifting not only burns calories during the workout but also boosts your metabolism and promotes long-term fat loss. </w:t>
+      </w:r>
+    </w:p>
+    <w:p>
+      <w:pPr>
+        <w:jc w:val="both"/>
+        <w:rPr>
+          <w:sz w:val="24"/>
+          <w:szCs w:val="24"/>
+        </w:rPr>
+      </w:pPr>
+      <w:r>
+        <w:rPr>
+          <w:sz w:val="24"/>
+          <w:szCs w:val="24"/>
+        </w:rPr>
+        <w:t xml:space="preserve"> </w:t>
+      </w:r>
+    </w:p>
+    <w:p>
+      <w:pPr>
+        <w:jc w:val="both"/>
+        <w:rPr>
+          <w:sz w:val="24"/>
+          <w:szCs w:val="24"/>
+        </w:rPr>
+      </w:pPr>
+      <w:r>
+        <w:rPr>
+          <w:sz w:val="24"/>
+          <w:szCs w:val="24"/>
+        </w:rPr>
+        <w:t xml:space="preserve">You may ask, which is better to lift a not too heavy weight for longer duration or perhaps lift a much heavier weight at a shorter duration. Below describe the </w:t>
+      </w:r>
+      <w:r>
+        <w:rPr>
+          <w:sz w:val="24"/>
+          <w:szCs w:val="24"/>
+        </w:rPr>
+        <w:t>differences:</w:t>
+      </w:r>
+    </w:p>
+    <w:p>
+      <w:pPr>
+        <w:jc w:val="both"/>
+        <w:rPr>
+          <w:sz w:val="24"/>
+          <w:szCs w:val="24"/>
+        </w:rPr>
+      </w:pPr>
+    </w:p>
+    <w:p>
+      <w:pPr>
+        <w:jc w:val="both"/>
+        <w:rPr>
+          <w:b/>
+          <w:bCs/>
+          <w:sz w:val="28"/>
+          <w:szCs w:val="28"/>
+        </w:rPr>
+      </w:pPr>
+      <w:r>
+        <w:rPr>
+          <w:b/>
+          <w:bCs/>
+          <w:sz w:val="28"/>
+          <w:szCs w:val="28"/>
+        </w:rPr>
+        <w:t>Lifting Lighter Weights for Longer Duration</w:t>
+      </w:r>
+    </w:p>
+    <w:p>
+      <w:pPr>
+        <w:numPr>
+          <w:ilvl w:val="0"/>
+          <w:numId w:val="17"/>
+        </w:numPr>
+        <w:jc w:val="both"/>
+        <w:rPr>
+          <w:sz w:val="24"/>
+          <w:szCs w:val="24"/>
+        </w:rPr>
+      </w:pPr>
+      <w:r>
+        <w:rPr>
+          <w:b/>
+          <w:bCs/>
+          <w:sz w:val="24"/>
+          <w:szCs w:val="24"/>
+        </w:rPr>
+        <w:t>Endurance</w:t>
+      </w:r>
+      <w:r>
+        <w:rPr>
+          <w:sz w:val="24"/>
+          <w:szCs w:val="24"/>
+        </w:rPr>
+        <w:t>: This method improves muscular endurance, allowing your muscles to perform for extended periods.</w:t>
+      </w:r>
+    </w:p>
+    <w:p>
+      <w:pPr>
+        <w:numPr>
+          <w:ilvl w:val="0"/>
+          <w:numId w:val="17"/>
+        </w:numPr>
+        <w:jc w:val="both"/>
+        <w:rPr>
+          <w:sz w:val="24"/>
+          <w:szCs w:val="24"/>
+        </w:rPr>
+      </w:pPr>
+      <w:r>
+        <w:rPr>
+          <w:b/>
+          <w:bCs/>
+          <w:sz w:val="24"/>
+          <w:szCs w:val="24"/>
+        </w:rPr>
+        <w:t>Calorie Burn</w:t>
+      </w:r>
+      <w:r>
+        <w:rPr>
+          <w:sz w:val="24"/>
+          <w:szCs w:val="24"/>
+        </w:rPr>
+        <w:t>: Longer sessions can burn more calories during the workout.</w:t>
+      </w:r>
+    </w:p>
+    <w:p>
+      <w:pPr>
+        <w:numPr>
+          <w:ilvl w:val="0"/>
+          <w:numId w:val="17"/>
+        </w:numPr>
+        <w:jc w:val="both"/>
+        <w:rPr>
+          <w:sz w:val="24"/>
+          <w:szCs w:val="24"/>
+        </w:rPr>
+      </w:pPr>
+      <w:r>
+        <w:rPr>
+          <w:b/>
+          <w:bCs/>
+          <w:sz w:val="24"/>
+          <w:szCs w:val="24"/>
+        </w:rPr>
+        <w:t>Technique</w:t>
+      </w:r>
+      <w:r>
+        <w:rPr>
+          <w:sz w:val="24"/>
+          <w:szCs w:val="24"/>
+        </w:rPr>
+        <w:t>: It’s easier to maintain proper form with lighter weights, reducing the risk of injury.</w:t>
+      </w:r>
+    </w:p>
+    <w:p>
+      <w:pPr>
+        <w:jc w:val="both"/>
+        <w:rPr>
+          <w:b/>
+          <w:bCs/>
+          <w:sz w:val="28"/>
+          <w:szCs w:val="28"/>
+        </w:rPr>
+      </w:pPr>
+      <w:r>
+        <w:rPr>
+          <w:b/>
+          <w:bCs/>
+          <w:sz w:val="28"/>
+          <w:szCs w:val="28"/>
+        </w:rPr>
+        <w:lastRenderedPageBreak/>
+        <w:t>Lifting Heavier Weights for Shorter Duration</w:t>
+      </w:r>
+    </w:p>
+    <w:p>
+      <w:pPr>
+        <w:numPr>
+          <w:ilvl w:val="0"/>
+          <w:numId w:val="18"/>
+        </w:numPr>
+        <w:jc w:val="both"/>
+        <w:rPr>
+          <w:sz w:val="24"/>
+          <w:szCs w:val="24"/>
+        </w:rPr>
+      </w:pPr>
+      <w:r>
+        <w:rPr>
+          <w:b/>
+          <w:bCs/>
+          <w:sz w:val="24"/>
+          <w:szCs w:val="24"/>
+        </w:rPr>
+        <w:t>Strength</w:t>
+      </w:r>
+      <w:r>
+        <w:rPr>
+          <w:sz w:val="24"/>
+          <w:szCs w:val="24"/>
+        </w:rPr>
+        <w:t>: This approach is more effective for building muscle strength and power.</w:t>
+      </w:r>
+    </w:p>
+    <w:p>
+      <w:pPr>
+        <w:numPr>
+          <w:ilvl w:val="0"/>
+          <w:numId w:val="18"/>
+        </w:numPr>
+        <w:jc w:val="both"/>
+        <w:rPr>
+          <w:sz w:val="24"/>
+          <w:szCs w:val="24"/>
+        </w:rPr>
+      </w:pPr>
+      <w:r>
+        <w:rPr>
+          <w:b/>
+          <w:bCs/>
+          <w:sz w:val="24"/>
+          <w:szCs w:val="24"/>
+        </w:rPr>
+        <w:t>Muscle Growth</w:t>
+      </w:r>
+      <w:r>
+        <w:rPr>
+          <w:sz w:val="24"/>
+          <w:szCs w:val="24"/>
+        </w:rPr>
+        <w:t>: Heavier weights promote hypertrophy (muscle growth), which can increase your basal metabolic rate.</w:t>
+      </w:r>
+    </w:p>
+    <w:p>
+      <w:pPr>
+        <w:numPr>
+          <w:ilvl w:val="0"/>
+          <w:numId w:val="18"/>
+        </w:numPr>
+        <w:jc w:val="both"/>
+        <w:rPr>
+          <w:sz w:val="24"/>
+          <w:szCs w:val="24"/>
+        </w:rPr>
+      </w:pPr>
+      <w:r>
+        <w:rPr>
+          <w:b/>
+          <w:bCs/>
+          <w:sz w:val="24"/>
+          <w:szCs w:val="24"/>
+        </w:rPr>
+        <w:t>EPOC Effect</w:t>
+      </w:r>
+      <w:r>
+        <w:rPr>
+          <w:sz w:val="24"/>
+          <w:szCs w:val="24"/>
+        </w:rPr>
+        <w:t>: As mentioned earlier, heavy lifting can lead to a higher post-exercise calorie burn.</w:t>
+      </w:r>
+    </w:p>
+    <w:p>
+      <w:pPr>
+        <w:jc w:val="both"/>
+        <w:rPr>
+          <w:b/>
+          <w:bCs/>
+          <w:sz w:val="24"/>
+          <w:szCs w:val="24"/>
+        </w:rPr>
+      </w:pPr>
+      <w:r>
+        <w:rPr>
+          <w:b/>
+          <w:bCs/>
+          <w:sz w:val="24"/>
+          <w:szCs w:val="24"/>
+        </w:rPr>
+        <w:t>Which is Better?</w:t>
+      </w:r>
+    </w:p>
+    <w:p>
+      <w:pPr>
+        <w:numPr>
+          <w:ilvl w:val="0"/>
+          <w:numId w:val="19"/>
+        </w:numPr>
+        <w:jc w:val="both"/>
+        <w:rPr>
+          <w:sz w:val="24"/>
+          <w:szCs w:val="24"/>
+        </w:rPr>
+      </w:pPr>
+      <w:r>
+        <w:rPr>
+          <w:b/>
+          <w:bCs/>
+          <w:sz w:val="24"/>
+          <w:szCs w:val="24"/>
+        </w:rPr>
+        <w:t>For Strength and Muscle Growth</w:t>
+      </w:r>
+      <w:r>
+        <w:rPr>
+          <w:sz w:val="24"/>
+          <w:szCs w:val="24"/>
+        </w:rPr>
+        <w:t>: Heavier weights with fewer repetitions are generally better.</w:t>
+      </w:r>
+    </w:p>
+    <w:p>
+      <w:pPr>
+        <w:numPr>
+          <w:ilvl w:val="0"/>
+          <w:numId w:val="19"/>
+        </w:numPr>
+        <w:jc w:val="both"/>
+        <w:rPr>
+          <w:sz w:val="24"/>
+          <w:szCs w:val="24"/>
+        </w:rPr>
+      </w:pPr>
+      <w:r>
+        <w:rPr>
+          <w:b/>
+          <w:bCs/>
+          <w:sz w:val="24"/>
+          <w:szCs w:val="24"/>
+        </w:rPr>
+        <w:t>For Endurance and Calorie Burn</w:t>
+      </w:r>
+      <w:r>
+        <w:rPr>
+          <w:sz w:val="24"/>
+          <w:szCs w:val="24"/>
+        </w:rPr>
+        <w:t>: Lighter weights with more repetitions might be more effective.</w:t>
+      </w:r>
+    </w:p>
+    <w:p>
+      <w:pPr>
+        <w:jc w:val="both"/>
+        <w:rPr>
+          <w:sz w:val="24"/>
+          <w:szCs w:val="24"/>
+        </w:rPr>
+      </w:pPr>
+      <w:r>
+        <w:rPr>
+          <w:sz w:val="24"/>
+          <w:szCs w:val="24"/>
+        </w:rPr>
+        <w:t>A balanced routine that incorporates both methods can provide comprehensive benefits. For example, you might focus on heavy lifting for major muscle groups and lighter weights for accessory exercises</w:t>
+      </w:r>
+      <w:r>
+        <w:rPr>
+          <w:sz w:val="24"/>
+          <w:szCs w:val="24"/>
+        </w:rPr>
+        <w:t>.</w:t>
+      </w:r>
+      <w:r>
+        <w:rPr>
+          <w:sz w:val="24"/>
+          <w:szCs w:val="24"/>
+        </w:rPr>
+        <w:t xml:space="preserve"> </w:t>
+      </w:r>
+    </w:p>
+    <w:p>
+      <w:pPr>
+        <w:jc w:val="both"/>
+        <w:rPr>
+          <w:sz w:val="24"/>
+          <w:szCs w:val="24"/>
+        </w:rPr>
+      </w:pPr>
+      <w:r>
+        <w:rPr>
+          <w:sz w:val="24"/>
+          <w:szCs w:val="24"/>
+        </w:rPr>
+        <w:t>Both approaches have their benefits, and the best choice depends on your specific fitness goals</w:t>
+      </w:r>
+      <w:r>
+        <w:rPr>
+          <w:sz w:val="24"/>
+          <w:szCs w:val="24"/>
+        </w:rPr>
+        <w:t>.</w:t>
+      </w:r>
+    </w:p>
+    <w:p>
+      <w:pPr>
+        <w:jc w:val="both"/>
+        <w:rPr>
+          <w:sz w:val="24"/>
+          <w:szCs w:val="24"/>
+        </w:rPr>
+      </w:pPr>
+    </w:p>
+    <w:p>
+      <w:pPr>
+        <w:jc w:val="both"/>
+        <w:rPr>
           <w:rStyle w:val="Strong"/>
           <w:b w:val="0"/>
           <w:bCs w:val="0"/>
-          <w:color w:val="FF0000"/>
-          <w:sz w:val="24"/>
-          <w:szCs w:val="24"/>
-        </w:rPr>
-      </w:pPr>
-      <w:r>
-        <w:rPr>
-          <w:sz w:val="24"/>
-          <w:szCs w:val="24"/>
-        </w:rPr>
-        <w:t xml:space="preserve">Your genetic makeup plays a significant role in determining your metabolic </w:t>
-      </w:r>
-      <w:r>
-        <w:rPr>
-          <w:sz w:val="24"/>
-          <w:szCs w:val="24"/>
-        </w:rPr>
-        <w:tab/>
-      </w:r>
-      <w:r>
-        <w:rPr>
-          <w:sz w:val="24"/>
-          <w:szCs w:val="24"/>
-        </w:rPr>
-        <w:t>rate. </w:t>
-      </w:r>
-      <w:r>
-        <w:rPr>
-          <w:sz w:val="24"/>
-          <w:szCs w:val="24"/>
-        </w:rPr>
-        <w:t>Some people naturally have a slower metabolism due to their genes</w:t>
-      </w:r>
-      <w:r>
-        <w:rPr>
-          <w:sz w:val="24"/>
-          <w:szCs w:val="24"/>
-        </w:rPr>
-        <w:t>.</w:t>
+          <w:sz w:val="24"/>
+          <w:szCs w:val="24"/>
+        </w:rPr>
+      </w:pPr>
+      <w:r>
+        <w:rPr>
+          <w:sz w:val="24"/>
+          <w:szCs w:val="24"/>
+        </w:rPr>
+        <w:t xml:space="preserve"> </w:t>
       </w:r>
     </w:p>
     <w:sectPr>
@@ -4320,6 +4981,155 @@
     </w:lvl>
   </w:abstractNum>
   <w:abstractNum w:abstractNumId="4" w15:restartNumberingAfterBreak="0">
+    <w:nsid w:val="15953A16"/>
+    <w:multiLevelType w:val="multilevel"/>
+    <w:tmpl w:val="51D6134A"/>
+    <w:lvl w:ilvl="0">
+      <w:start w:val="1"/>
+      <w:numFmt w:val="bullet"/>
+      <w:lvlText w:val=""/>
+      <w:lvlJc w:val="left"/>
+      <w:pPr>
+        <w:tabs>
+          <w:tab w:val="num" w:pos="720"/>
+        </w:tabs>
+        <w:ind w:left="720" w:hanging="360"/>
+      </w:pPr>
+      <w:rPr>
+        <w:rFonts w:ascii="Symbol" w:hAnsi="Symbol" w:hint="default"/>
+        <w:sz w:val="20"/>
+      </w:rPr>
+    </w:lvl>
+    <w:lvl w:ilvl="1" w:tentative="1">
+      <w:start w:val="1"/>
+      <w:numFmt w:val="bullet"/>
+      <w:lvlText w:val="o"/>
+      <w:lvlJc w:val="left"/>
+      <w:pPr>
+        <w:tabs>
+          <w:tab w:val="num" w:pos="1440"/>
+        </w:tabs>
+        <w:ind w:left="1440" w:hanging="360"/>
+      </w:pPr>
+      <w:rPr>
+        <w:rFonts w:ascii="Courier New" w:hAnsi="Courier New" w:hint="default"/>
+        <w:sz w:val="20"/>
+      </w:rPr>
+    </w:lvl>
+    <w:lvl w:ilvl="2" w:tentative="1">
+      <w:start w:val="1"/>
+      <w:numFmt w:val="bullet"/>
+      <w:lvlText w:val=""/>
+      <w:lvlJc w:val="left"/>
+      <w:pPr>
+        <w:tabs>
+          <w:tab w:val="num" w:pos="2160"/>
+        </w:tabs>
+        <w:ind w:left="2160" w:hanging="360"/>
+      </w:pPr>
+      <w:rPr>
+        <w:rFonts w:ascii="Wingdings" w:hAnsi="Wingdings" w:hint="default"/>
+        <w:sz w:val="20"/>
+      </w:rPr>
+    </w:lvl>
+    <w:lvl w:ilvl="3" w:tentative="1">
+      <w:start w:val="1"/>
+      <w:numFmt w:val="bullet"/>
+      <w:lvlText w:val=""/>
+      <w:lvlJc w:val="left"/>
+      <w:pPr>
+        <w:tabs>
+          <w:tab w:val="num" w:pos="2880"/>
+        </w:tabs>
+        <w:ind w:left="2880" w:hanging="360"/>
+      </w:pPr>
+      <w:rPr>
+        <w:rFonts w:ascii="Wingdings" w:hAnsi="Wingdings" w:hint="default"/>
+        <w:sz w:val="20"/>
+      </w:rPr>
+    </w:lvl>
+    <w:lvl w:ilvl="4" w:tentative="1">
+      <w:start w:val="1"/>
+      <w:numFmt w:val="bullet"/>
+      <w:lvlText w:val=""/>
+      <w:lvlJc w:val="left"/>
+      <w:pPr>
+        <w:tabs>
+          <w:tab w:val="num" w:pos="3600"/>
+        </w:tabs>
+        <w:ind w:left="3600" w:hanging="360"/>
+      </w:pPr>
+      <w:rPr>
+        <w:rFonts w:ascii="Wingdings" w:hAnsi="Wingdings" w:hint="default"/>
+        <w:sz w:val="20"/>
+      </w:rPr>
+    </w:lvl>
+    <w:lvl w:ilvl="5" w:tentative="1">
+      <w:start w:val="1"/>
+      <w:numFmt w:val="bullet"/>
+      <w:lvlText w:val=""/>
+      <w:lvlJc w:val="left"/>
+      <w:pPr>
+        <w:tabs>
+          <w:tab w:val="num" w:pos="4320"/>
+        </w:tabs>
+        <w:ind w:left="4320" w:hanging="360"/>
+      </w:pPr>
+      <w:rPr>
+        <w:rFonts w:ascii="Wingdings" w:hAnsi="Wingdings" w:hint="default"/>
+        <w:sz w:val="20"/>
+      </w:rPr>
+    </w:lvl>
+    <w:lvl w:ilvl="6" w:tentative="1">
+      <w:start w:val="1"/>
+      <w:numFmt w:val="bullet"/>
+      <w:lvlText w:val=""/>
+      <w:lvlJc w:val="left"/>
+      <w:pPr>
+        <w:tabs>
+          <w:tab w:val="num" w:pos="5040"/>
+        </w:tabs>
+        <w:ind w:left="5040" w:hanging="360"/>
+      </w:pPr>
+      <w:rPr>
+        <w:rFonts w:ascii="Wingdings" w:hAnsi="Wingdings" w:hint="default"/>
+        <w:sz w:val="20"/>
+      </w:rPr>
+    </w:lvl>
+    <w:lvl w:ilvl="7" w:tentative="1">
+      <w:start w:val="1"/>
+      <w:numFmt w:val="bullet"/>
+      <w:lvlText w:val=""/>
+      <w:lvlJc w:val="left"/>
+      <w:pPr>
+        <w:tabs>
+          <w:tab w:val="num" w:pos="5760"/>
+        </w:tabs>
+        <w:ind w:left="5760" w:hanging="360"/>
+      </w:pPr>
+      <w:rPr>
+        <w:rFonts w:ascii="Wingdings" w:hAnsi="Wingdings" w:hint="default"/>
+        <w:sz w:val="20"/>
+      </w:rPr>
+    </w:lvl>
+    <w:lvl w:ilvl="8" w:tentative="1">
+      <w:start w:val="1"/>
+      <w:numFmt w:val="bullet"/>
+      <w:lvlText w:val=""/>
+      <w:lvlJc w:val="left"/>
+      <w:pPr>
+        <w:tabs>
+          <w:tab w:val="num" w:pos="6480"/>
+        </w:tabs>
+        <w:ind w:left="6480" w:hanging="360"/>
+      </w:pPr>
+      <w:rPr>
+        <w:rFonts w:ascii="Wingdings" w:hAnsi="Wingdings" w:hint="default"/>
+        <w:sz w:val="20"/>
+      </w:rPr>
+    </w:lvl>
+  </w:abstractNum>
+  <w:abstractNum w:abstractNumId="5" w15:restartNumberingAfterBreak="0">
     <w:nsid w:val="1F245870"/>
     <w:multiLevelType w:val="multilevel"/>
     <w:tmpl w:val="017C5984"/>
@@ -4468,7 +5278,7 @@
       </w:rPr>
     </w:lvl>
   </w:abstractNum>
-  <w:abstractNum w:abstractNumId="5" w15:restartNumberingAfterBreak="0">
+  <w:abstractNum w:abstractNumId="6" w15:restartNumberingAfterBreak="0">
     <w:nsid w:val="23A80FEB"/>
     <w:multiLevelType w:val="multilevel"/>
     <w:tmpl w:val="A1DCE8CA"/>
@@ -4617,7 +5427,7 @@
       </w:rPr>
     </w:lvl>
   </w:abstractNum>
-  <w:abstractNum w:abstractNumId="6" w15:restartNumberingAfterBreak="0">
+  <w:abstractNum w:abstractNumId="7" w15:restartNumberingAfterBreak="0">
     <w:nsid w:val="2977066E"/>
     <w:multiLevelType w:val="multilevel"/>
     <w:tmpl w:val="D9342C68"/>
@@ -4733,7 +5543,272 @@
       </w:pPr>
     </w:lvl>
   </w:abstractNum>
-  <w:abstractNum w:abstractNumId="7" w15:restartNumberingAfterBreak="0">
+  <w:abstractNum w:abstractNumId="8" w15:restartNumberingAfterBreak="0">
+    <w:nsid w:val="2C003FDA"/>
+    <w:multiLevelType w:val="multilevel"/>
+    <w:tmpl w:val="BDDC4282"/>
+    <w:lvl w:ilvl="0">
+      <w:start w:val="1"/>
+      <w:numFmt w:val="bullet"/>
+      <w:lvlText w:val=""/>
+      <w:lvlJc w:val="left"/>
+      <w:pPr>
+        <w:tabs>
+          <w:tab w:val="num" w:pos="502"/>
+        </w:tabs>
+        <w:ind w:left="502" w:hanging="360"/>
+      </w:pPr>
+      <w:rPr>
+        <w:rFonts w:ascii="Symbol" w:hAnsi="Symbol" w:hint="default"/>
+      </w:rPr>
+    </w:lvl>
+    <w:lvl w:ilvl="1" w:tentative="1">
+      <w:start w:val="1"/>
+      <w:numFmt w:val="decimal"/>
+      <w:lvlText w:val="%2."/>
+      <w:lvlJc w:val="left"/>
+      <w:pPr>
+        <w:tabs>
+          <w:tab w:val="num" w:pos="1222"/>
+        </w:tabs>
+        <w:ind w:left="1222" w:hanging="360"/>
+      </w:pPr>
+    </w:lvl>
+    <w:lvl w:ilvl="2" w:tentative="1">
+      <w:start w:val="1"/>
+      <w:numFmt w:val="decimal"/>
+      <w:lvlText w:val="%3."/>
+      <w:lvlJc w:val="left"/>
+      <w:pPr>
+        <w:tabs>
+          <w:tab w:val="num" w:pos="1942"/>
+        </w:tabs>
+        <w:ind w:left="1942" w:hanging="360"/>
+      </w:pPr>
+    </w:lvl>
+    <w:lvl w:ilvl="3" w:tentative="1">
+      <w:start w:val="1"/>
+      <w:numFmt w:val="decimal"/>
+      <w:lvlText w:val="%4."/>
+      <w:lvlJc w:val="left"/>
+      <w:pPr>
+        <w:tabs>
+          <w:tab w:val="num" w:pos="2662"/>
+        </w:tabs>
+        <w:ind w:left="2662" w:hanging="360"/>
+      </w:pPr>
+    </w:lvl>
+    <w:lvl w:ilvl="4" w:tentative="1">
+      <w:start w:val="1"/>
+      <w:numFmt w:val="decimal"/>
+      <w:lvlText w:val="%5."/>
+      <w:lvlJc w:val="left"/>
+      <w:pPr>
+        <w:tabs>
+          <w:tab w:val="num" w:pos="3382"/>
+        </w:tabs>
+        <w:ind w:left="3382" w:hanging="360"/>
+      </w:pPr>
+    </w:lvl>
+    <w:lvl w:ilvl="5" w:tentative="1">
+      <w:start w:val="1"/>
+      <w:numFmt w:val="decimal"/>
+      <w:lvlText w:val="%6."/>
+      <w:lvlJc w:val="left"/>
+      <w:pPr>
+        <w:tabs>
+          <w:tab w:val="num" w:pos="4102"/>
+        </w:tabs>
+        <w:ind w:left="4102" w:hanging="360"/>
+      </w:pPr>
+    </w:lvl>
+    <w:lvl w:ilvl="6" w:tentative="1">
+      <w:start w:val="1"/>
+      <w:numFmt w:val="decimal"/>
+      <w:lvlText w:val="%7."/>
+      <w:lvlJc w:val="left"/>
+      <w:pPr>
+        <w:tabs>
+          <w:tab w:val="num" w:pos="4822"/>
+        </w:tabs>
+        <w:ind w:left="4822" w:hanging="360"/>
+      </w:pPr>
+    </w:lvl>
+    <w:lvl w:ilvl="7" w:tentative="1">
+      <w:start w:val="1"/>
+      <w:numFmt w:val="decimal"/>
+      <w:lvlText w:val="%8."/>
+      <w:lvlJc w:val="left"/>
+      <w:pPr>
+        <w:tabs>
+          <w:tab w:val="num" w:pos="5542"/>
+        </w:tabs>
+        <w:ind w:left="5542" w:hanging="360"/>
+      </w:pPr>
+    </w:lvl>
+    <w:lvl w:ilvl="8" w:tentative="1">
+      <w:start w:val="1"/>
+      <w:numFmt w:val="decimal"/>
+      <w:lvlText w:val="%9."/>
+      <w:lvlJc w:val="left"/>
+      <w:pPr>
+        <w:tabs>
+          <w:tab w:val="num" w:pos="6262"/>
+        </w:tabs>
+        <w:ind w:left="6262" w:hanging="360"/>
+      </w:pPr>
+    </w:lvl>
+  </w:abstractNum>
+  <w:abstractNum w:abstractNumId="9" w15:restartNumberingAfterBreak="0">
+    <w:nsid w:val="461E3E26"/>
+    <w:multiLevelType w:val="multilevel"/>
+    <w:tmpl w:val="F732C33E"/>
+    <w:lvl w:ilvl="0">
+      <w:start w:val="1"/>
+      <w:numFmt w:val="bullet"/>
+      <w:lvlText w:val=""/>
+      <w:lvlJc w:val="left"/>
+      <w:pPr>
+        <w:tabs>
+          <w:tab w:val="num" w:pos="720"/>
+        </w:tabs>
+        <w:ind w:left="720" w:hanging="360"/>
+      </w:pPr>
+      <w:rPr>
+        <w:rFonts w:ascii="Symbol" w:hAnsi="Symbol" w:hint="default"/>
+        <w:sz w:val="20"/>
+      </w:rPr>
+    </w:lvl>
+    <w:lvl w:ilvl="1" w:tentative="1">
+      <w:start w:val="1"/>
+      <w:numFmt w:val="bullet"/>
+      <w:lvlText w:val="o"/>
+      <w:lvlJc w:val="left"/>
+      <w:pPr>
+        <w:tabs>
+          <w:tab w:val="num" w:pos="1440"/>
+        </w:tabs>
+        <w:ind w:left="1440" w:hanging="360"/>
+      </w:pPr>
+      <w:rPr>
+        <w:rFonts w:ascii="Courier New" w:hAnsi="Courier New" w:hint="default"/>
+        <w:sz w:val="20"/>
+      </w:rPr>
+    </w:lvl>
+    <w:lvl w:ilvl="2" w:tentative="1">
+      <w:start w:val="1"/>
+      <w:numFmt w:val="bullet"/>
+      <w:lvlText w:val=""/>
+      <w:lvlJc w:val="left"/>
+      <w:pPr>
+        <w:tabs>
+          <w:tab w:val="num" w:pos="2160"/>
+        </w:tabs>
+        <w:ind w:left="2160" w:hanging="360"/>
+      </w:pPr>
+      <w:rPr>
+        <w:rFonts w:ascii="Wingdings" w:hAnsi="Wingdings" w:hint="default"/>
+        <w:sz w:val="20"/>
+      </w:rPr>
+    </w:lvl>
+    <w:lvl w:ilvl="3" w:tentative="1">
+      <w:start w:val="1"/>
+      <w:numFmt w:val="bullet"/>
+      <w:lvlText w:val=""/>
+      <w:lvlJc w:val="left"/>
+      <w:pPr>
+        <w:tabs>
+          <w:tab w:val="num" w:pos="2880"/>
+        </w:tabs>
+        <w:ind w:left="2880" w:hanging="360"/>
+      </w:pPr>
+      <w:rPr>
+        <w:rFonts w:ascii="Wingdings" w:hAnsi="Wingdings" w:hint="default"/>
+        <w:sz w:val="20"/>
+      </w:rPr>
+    </w:lvl>
+    <w:lvl w:ilvl="4" w:tentative="1">
+      <w:start w:val="1"/>
+      <w:numFmt w:val="bullet"/>
+      <w:lvlText w:val=""/>
+      <w:lvlJc w:val="left"/>
+      <w:pPr>
+        <w:tabs>
+          <w:tab w:val="num" w:pos="3600"/>
+        </w:tabs>
+        <w:ind w:left="3600" w:hanging="360"/>
+      </w:pPr>
+      <w:rPr>
+        <w:rFonts w:ascii="Wingdings" w:hAnsi="Wingdings" w:hint="default"/>
+        <w:sz w:val="20"/>
+      </w:rPr>
+    </w:lvl>
+    <w:lvl w:ilvl="5" w:tentative="1">
+      <w:start w:val="1"/>
+      <w:numFmt w:val="bullet"/>
+      <w:lvlText w:val=""/>
+      <w:lvlJc w:val="left"/>
+      <w:pPr>
+        <w:tabs>
+          <w:tab w:val="num" w:pos="4320"/>
+        </w:tabs>
+        <w:ind w:left="4320" w:hanging="360"/>
+      </w:pPr>
+      <w:rPr>
+        <w:rFonts w:ascii="Wingdings" w:hAnsi="Wingdings" w:hint="default"/>
+        <w:sz w:val="20"/>
+      </w:rPr>
+    </w:lvl>
+    <w:lvl w:ilvl="6" w:tentative="1">
+      <w:start w:val="1"/>
+      <w:numFmt w:val="bullet"/>
+      <w:lvlText w:val=""/>
+      <w:lvlJc w:val="left"/>
+      <w:pPr>
+        <w:tabs>
+          <w:tab w:val="num" w:pos="5040"/>
+        </w:tabs>
+        <w:ind w:left="5040" w:hanging="360"/>
+      </w:pPr>
+      <w:rPr>
+        <w:rFonts w:ascii="Wingdings" w:hAnsi="Wingdings" w:hint="default"/>
+        <w:sz w:val="20"/>
+      </w:rPr>
+    </w:lvl>
+    <w:lvl w:ilvl="7" w:tentative="1">
+      <w:start w:val="1"/>
+      <w:numFmt w:val="bullet"/>
+      <w:lvlText w:val=""/>
+      <w:lvlJc w:val="left"/>
+      <w:pPr>
+        <w:tabs>
+          <w:tab w:val="num" w:pos="5760"/>
+        </w:tabs>
+        <w:ind w:left="5760" w:hanging="360"/>
+      </w:pPr>
+      <w:rPr>
+        <w:rFonts w:ascii="Wingdings" w:hAnsi="Wingdings" w:hint="default"/>
+        <w:sz w:val="20"/>
+      </w:rPr>
+    </w:lvl>
+    <w:lvl w:ilvl="8" w:tentative="1">
+      <w:start w:val="1"/>
+      <w:numFmt w:val="bullet"/>
+      <w:lvlText w:val=""/>
+      <w:lvlJc w:val="left"/>
+      <w:pPr>
+        <w:tabs>
+          <w:tab w:val="num" w:pos="6480"/>
+        </w:tabs>
+        <w:ind w:left="6480" w:hanging="360"/>
+      </w:pPr>
+      <w:rPr>
+        <w:rFonts w:ascii="Wingdings" w:hAnsi="Wingdings" w:hint="default"/>
+        <w:sz w:val="20"/>
+      </w:rPr>
+    </w:lvl>
+  </w:abstractNum>
+  <w:abstractNum w:abstractNumId="10" w15:restartNumberingAfterBreak="0">
     <w:nsid w:val="4B460D4E"/>
     <w:multiLevelType w:val="hybridMultilevel"/>
     <w:tmpl w:val="F176FFFC"/>
@@ -4852,7 +5927,156 @@
       </w:rPr>
     </w:lvl>
   </w:abstractNum>
-  <w:abstractNum w:abstractNumId="8" w15:restartNumberingAfterBreak="0">
+  <w:abstractNum w:abstractNumId="11" w15:restartNumberingAfterBreak="0">
+    <w:nsid w:val="51C6632E"/>
+    <w:multiLevelType w:val="multilevel"/>
+    <w:tmpl w:val="5F860EC0"/>
+    <w:lvl w:ilvl="0">
+      <w:start w:val="1"/>
+      <w:numFmt w:val="bullet"/>
+      <w:lvlText w:val=""/>
+      <w:lvlJc w:val="left"/>
+      <w:pPr>
+        <w:tabs>
+          <w:tab w:val="num" w:pos="720"/>
+        </w:tabs>
+        <w:ind w:left="720" w:hanging="360"/>
+      </w:pPr>
+      <w:rPr>
+        <w:rFonts w:ascii="Symbol" w:hAnsi="Symbol" w:hint="default"/>
+        <w:sz w:val="20"/>
+      </w:rPr>
+    </w:lvl>
+    <w:lvl w:ilvl="1" w:tentative="1">
+      <w:start w:val="1"/>
+      <w:numFmt w:val="bullet"/>
+      <w:lvlText w:val="o"/>
+      <w:lvlJc w:val="left"/>
+      <w:pPr>
+        <w:tabs>
+          <w:tab w:val="num" w:pos="1440"/>
+        </w:tabs>
+        <w:ind w:left="1440" w:hanging="360"/>
+      </w:pPr>
+      <w:rPr>
+        <w:rFonts w:ascii="Courier New" w:hAnsi="Courier New" w:hint="default"/>
+        <w:sz w:val="20"/>
+      </w:rPr>
+    </w:lvl>
+    <w:lvl w:ilvl="2" w:tentative="1">
+      <w:start w:val="1"/>
+      <w:numFmt w:val="bullet"/>
+      <w:lvlText w:val=""/>
+      <w:lvlJc w:val="left"/>
+      <w:pPr>
+        <w:tabs>
+          <w:tab w:val="num" w:pos="2160"/>
+        </w:tabs>
+        <w:ind w:left="2160" w:hanging="360"/>
+      </w:pPr>
+      <w:rPr>
+        <w:rFonts w:ascii="Wingdings" w:hAnsi="Wingdings" w:hint="default"/>
+        <w:sz w:val="20"/>
+      </w:rPr>
+    </w:lvl>
+    <w:lvl w:ilvl="3" w:tentative="1">
+      <w:start w:val="1"/>
+      <w:numFmt w:val="bullet"/>
+      <w:lvlText w:val=""/>
+      <w:lvlJc w:val="left"/>
+      <w:pPr>
+        <w:tabs>
+          <w:tab w:val="num" w:pos="2880"/>
+        </w:tabs>
+        <w:ind w:left="2880" w:hanging="360"/>
+      </w:pPr>
+      <w:rPr>
+        <w:rFonts w:ascii="Wingdings" w:hAnsi="Wingdings" w:hint="default"/>
+        <w:sz w:val="20"/>
+      </w:rPr>
+    </w:lvl>
+    <w:lvl w:ilvl="4" w:tentative="1">
+      <w:start w:val="1"/>
+      <w:numFmt w:val="bullet"/>
+      <w:lvlText w:val=""/>
+      <w:lvlJc w:val="left"/>
+      <w:pPr>
+        <w:tabs>
+          <w:tab w:val="num" w:pos="3600"/>
+        </w:tabs>
+        <w:ind w:left="3600" w:hanging="360"/>
+      </w:pPr>
+      <w:rPr>
+        <w:rFonts w:ascii="Wingdings" w:hAnsi="Wingdings" w:hint="default"/>
+        <w:sz w:val="20"/>
+      </w:rPr>
+    </w:lvl>
+    <w:lvl w:ilvl="5" w:tentative="1">
+      <w:start w:val="1"/>
+      <w:numFmt w:val="bullet"/>
+      <w:lvlText w:val=""/>
+      <w:lvlJc w:val="left"/>
+      <w:pPr>
+        <w:tabs>
+          <w:tab w:val="num" w:pos="4320"/>
+        </w:tabs>
+        <w:ind w:left="4320" w:hanging="360"/>
+      </w:pPr>
+      <w:rPr>
+        <w:rFonts w:ascii="Wingdings" w:hAnsi="Wingdings" w:hint="default"/>
+        <w:sz w:val="20"/>
+      </w:rPr>
+    </w:lvl>
+    <w:lvl w:ilvl="6" w:tentative="1">
+      <w:start w:val="1"/>
+      <w:numFmt w:val="bullet"/>
+      <w:lvlText w:val=""/>
+      <w:lvlJc w:val="left"/>
+      <w:pPr>
+        <w:tabs>
+          <w:tab w:val="num" w:pos="5040"/>
+        </w:tabs>
+        <w:ind w:left="5040" w:hanging="360"/>
+      </w:pPr>
+      <w:rPr>
+        <w:rFonts w:ascii="Wingdings" w:hAnsi="Wingdings" w:hint="default"/>
+        <w:sz w:val="20"/>
+      </w:rPr>
+    </w:lvl>
+    <w:lvl w:ilvl="7" w:tentative="1">
+      <w:start w:val="1"/>
+      <w:numFmt w:val="bullet"/>
+      <w:lvlText w:val=""/>
+      <w:lvlJc w:val="left"/>
+      <w:pPr>
+        <w:tabs>
+          <w:tab w:val="num" w:pos="5760"/>
+        </w:tabs>
+        <w:ind w:left="5760" w:hanging="360"/>
+      </w:pPr>
+      <w:rPr>
+        <w:rFonts w:ascii="Wingdings" w:hAnsi="Wingdings" w:hint="default"/>
+        <w:sz w:val="20"/>
+      </w:rPr>
+    </w:lvl>
+    <w:lvl w:ilvl="8" w:tentative="1">
+      <w:start w:val="1"/>
+      <w:numFmt w:val="bullet"/>
+      <w:lvlText w:val=""/>
+      <w:lvlJc w:val="left"/>
+      <w:pPr>
+        <w:tabs>
+          <w:tab w:val="num" w:pos="6480"/>
+        </w:tabs>
+        <w:ind w:left="6480" w:hanging="360"/>
+      </w:pPr>
+      <w:rPr>
+        <w:rFonts w:ascii="Wingdings" w:hAnsi="Wingdings" w:hint="default"/>
+        <w:sz w:val="20"/>
+      </w:rPr>
+    </w:lvl>
+  </w:abstractNum>
+  <w:abstractNum w:abstractNumId="12" w15:restartNumberingAfterBreak="0">
     <w:nsid w:val="58C12BCE"/>
     <w:multiLevelType w:val="multilevel"/>
     <w:tmpl w:val="54362AFC"/>
@@ -4965,7 +6189,7 @@
       </w:pPr>
     </w:lvl>
   </w:abstractNum>
-  <w:abstractNum w:abstractNumId="9" w15:restartNumberingAfterBreak="0">
+  <w:abstractNum w:abstractNumId="13" w15:restartNumberingAfterBreak="0">
     <w:nsid w:val="5AA121CF"/>
     <w:multiLevelType w:val="hybridMultilevel"/>
     <w:tmpl w:val="801E8B90"/>
@@ -5078,7 +6302,7 @@
       </w:rPr>
     </w:lvl>
   </w:abstractNum>
-  <w:abstractNum w:abstractNumId="10" w15:restartNumberingAfterBreak="0">
+  <w:abstractNum w:abstractNumId="14" w15:restartNumberingAfterBreak="0">
     <w:nsid w:val="5F6A2377"/>
     <w:multiLevelType w:val="multilevel"/>
     <w:tmpl w:val="6F5EC60A"/>
@@ -5191,7 +6415,7 @@
       </w:pPr>
     </w:lvl>
   </w:abstractNum>
-  <w:abstractNum w:abstractNumId="11" w15:restartNumberingAfterBreak="0">
+  <w:abstractNum w:abstractNumId="15" w15:restartNumberingAfterBreak="0">
     <w:nsid w:val="68FB3A87"/>
     <w:multiLevelType w:val="hybridMultilevel"/>
     <w:tmpl w:val="34E8EEEE"/>
@@ -5304,7 +6528,7 @@
       </w:rPr>
     </w:lvl>
   </w:abstractNum>
-  <w:abstractNum w:abstractNumId="12" w15:restartNumberingAfterBreak="0">
+  <w:abstractNum w:abstractNumId="16" w15:restartNumberingAfterBreak="0">
     <w:nsid w:val="698F6CA7"/>
     <w:multiLevelType w:val="multilevel"/>
     <w:tmpl w:val="A1DCE8CA"/>
@@ -5453,7 +6677,7 @@
       </w:rPr>
     </w:lvl>
   </w:abstractNum>
-  <w:abstractNum w:abstractNumId="13" w15:restartNumberingAfterBreak="0">
+  <w:abstractNum w:abstractNumId="17" w15:restartNumberingAfterBreak="0">
     <w:nsid w:val="6DB3410E"/>
     <w:multiLevelType w:val="multilevel"/>
     <w:tmpl w:val="EC5AFCAC"/>
@@ -5602,7 +6826,7 @@
       </w:rPr>
     </w:lvl>
   </w:abstractNum>
-  <w:abstractNum w:abstractNumId="14" w15:restartNumberingAfterBreak="0">
+  <w:abstractNum w:abstractNumId="18" w15:restartNumberingAfterBreak="0">
     <w:nsid w:val="762C4577"/>
     <w:multiLevelType w:val="hybridMultilevel"/>
     <w:tmpl w:val="574203A2"/>
@@ -5719,46 +6943,58 @@
     <w:abstractNumId w:val="2"/>
   </w:num>
   <w:num w:numId="2" w16cid:durableId="616839644">
-    <w:abstractNumId w:val="9"/>
+    <w:abstractNumId w:val="13"/>
   </w:num>
   <w:num w:numId="3" w16cid:durableId="2039355559">
-    <w:abstractNumId w:val="14"/>
+    <w:abstractNumId w:val="18"/>
   </w:num>
   <w:num w:numId="4" w16cid:durableId="1868716406">
-    <w:abstractNumId w:val="7"/>
+    <w:abstractNumId w:val="10"/>
   </w:num>
   <w:num w:numId="5" w16cid:durableId="661087690">
-    <w:abstractNumId w:val="5"/>
+    <w:abstractNumId w:val="6"/>
   </w:num>
   <w:num w:numId="6" w16cid:durableId="324624186">
     <w:abstractNumId w:val="0"/>
   </w:num>
   <w:num w:numId="7" w16cid:durableId="265699617">
-    <w:abstractNumId w:val="12"/>
+    <w:abstractNumId w:val="16"/>
   </w:num>
   <w:num w:numId="8" w16cid:durableId="637078836">
     <w:abstractNumId w:val="3"/>
   </w:num>
   <w:num w:numId="9" w16cid:durableId="214465044">
-    <w:abstractNumId w:val="10"/>
+    <w:abstractNumId w:val="14"/>
   </w:num>
   <w:num w:numId="10" w16cid:durableId="1734935567">
-    <w:abstractNumId w:val="6"/>
+    <w:abstractNumId w:val="7"/>
   </w:num>
   <w:num w:numId="11" w16cid:durableId="1194541750">
-    <w:abstractNumId w:val="4"/>
+    <w:abstractNumId w:val="5"/>
   </w:num>
   <w:num w:numId="12" w16cid:durableId="2132703009">
-    <w:abstractNumId w:val="13"/>
+    <w:abstractNumId w:val="17"/>
   </w:num>
   <w:num w:numId="13" w16cid:durableId="1171144280">
-    <w:abstractNumId w:val="8"/>
+    <w:abstractNumId w:val="12"/>
   </w:num>
   <w:num w:numId="14" w16cid:durableId="1150488785">
     <w:abstractNumId w:val="1"/>
   </w:num>
   <w:num w:numId="15" w16cid:durableId="222915286">
+    <w:abstractNumId w:val="15"/>
+  </w:num>
+  <w:num w:numId="16" w16cid:durableId="1432705755">
+    <w:abstractNumId w:val="8"/>
+  </w:num>
+  <w:num w:numId="17" w16cid:durableId="827137759">
     <w:abstractNumId w:val="11"/>
+  </w:num>
+  <w:num w:numId="18" w16cid:durableId="799422419">
+    <w:abstractNumId w:val="4"/>
+  </w:num>
+  <w:num w:numId="19" w16cid:durableId="1840342896">
+    <w:abstractNumId w:val="9"/>
   </w:num>
 </w:numbering>
 </file>

</xml_diff>

<commit_message>
docs: Updated Strenghten Excercise compared to diet.
</commit_message>
<xml_diff>
--- a/Nutrients/Weight Loss.docx
+++ b/Nutrients/Weight Loss.docx
@@ -4259,16 +4259,16 @@
         <w:rPr>
           <w:b/>
           <w:bCs/>
-          <w:sz w:val="24"/>
-          <w:szCs w:val="24"/>
-        </w:rPr>
-      </w:pPr>
-      <w:r>
-        <w:rPr>
-          <w:b/>
-          <w:bCs/>
-          <w:sz w:val="24"/>
-          <w:szCs w:val="24"/>
+          <w:sz w:val="28"/>
+          <w:szCs w:val="28"/>
+        </w:rPr>
+      </w:pPr>
+      <w:r>
+        <w:rPr>
+          <w:b/>
+          <w:bCs/>
+          <w:sz w:val="28"/>
+          <w:szCs w:val="28"/>
         </w:rPr>
         <w:t>Which is Better?</w:t>
       </w:r>
@@ -4397,6 +4397,488 @@
       <w:pPr>
         <w:jc w:val="both"/>
         <w:rPr>
+          <w:b/>
+          <w:bCs/>
+          <w:sz w:val="28"/>
+          <w:szCs w:val="28"/>
+        </w:rPr>
+      </w:pPr>
+      <w:r>
+        <w:rPr>
+          <w:b/>
+          <w:bCs/>
+          <w:sz w:val="28"/>
+          <w:szCs w:val="28"/>
+        </w:rPr>
+        <w:t xml:space="preserve">Best Approaches for weight loss (by dieting or by exercise) </w:t>
+      </w:r>
+    </w:p>
+    <w:p>
+      <w:pPr>
+        <w:jc w:val="both"/>
+        <w:rPr>
+          <w:sz w:val="24"/>
+          <w:szCs w:val="24"/>
+        </w:rPr>
+      </w:pPr>
+      <w:r>
+        <w:rPr>
+          <w:sz w:val="24"/>
+          <w:szCs w:val="24"/>
+        </w:rPr>
+        <w:t>Both diet and exercise play crucial roles in effective weight loss, but their impacts can vary:</w:t>
+      </w:r>
+    </w:p>
+    <w:p>
+      <w:pPr>
+        <w:jc w:val="both"/>
+        <w:rPr>
+          <w:b/>
+          <w:bCs/>
+          <w:sz w:val="24"/>
+          <w:szCs w:val="24"/>
+        </w:rPr>
+      </w:pPr>
+      <w:r>
+        <w:rPr>
+          <w:b/>
+          <w:bCs/>
+          <w:sz w:val="24"/>
+          <w:szCs w:val="24"/>
+        </w:rPr>
+        <w:t>Diet</w:t>
+      </w:r>
+    </w:p>
+    <w:p>
+      <w:pPr>
+        <w:numPr>
+          <w:ilvl w:val="0"/>
+          <w:numId w:val="20"/>
+        </w:numPr>
+        <w:jc w:val="both"/>
+        <w:rPr>
+          <w:sz w:val="24"/>
+          <w:szCs w:val="24"/>
+        </w:rPr>
+      </w:pPr>
+      <w:r>
+        <w:rPr>
+          <w:b/>
+          <w:bCs/>
+          <w:sz w:val="24"/>
+          <w:szCs w:val="24"/>
+        </w:rPr>
+        <w:t>Caloric Intake</w:t>
+      </w:r>
+      <w:r>
+        <w:rPr>
+          <w:sz w:val="24"/>
+          <w:szCs w:val="24"/>
+        </w:rPr>
+        <w:t>: Weight loss fundamentally comes down to consuming fewer calories than you burn. A well-balanced diet helps control your caloric intake.</w:t>
+      </w:r>
+    </w:p>
+    <w:p>
+      <w:pPr>
+        <w:numPr>
+          <w:ilvl w:val="0"/>
+          <w:numId w:val="20"/>
+        </w:numPr>
+        <w:jc w:val="both"/>
+        <w:rPr>
+          <w:sz w:val="24"/>
+          <w:szCs w:val="24"/>
+        </w:rPr>
+      </w:pPr>
+      <w:r>
+        <w:rPr>
+          <w:b/>
+          <w:bCs/>
+          <w:sz w:val="24"/>
+          <w:szCs w:val="24"/>
+        </w:rPr>
+        <w:t>Nutrient Quality</w:t>
+      </w:r>
+      <w:r>
+        <w:rPr>
+          <w:sz w:val="24"/>
+          <w:szCs w:val="24"/>
+        </w:rPr>
+        <w:t>: Eating nutrient-dense foods ensures you get essential vitamins and minerals, which support overall health and metabolism.</w:t>
+      </w:r>
+    </w:p>
+    <w:p>
+      <w:pPr>
+        <w:numPr>
+          <w:ilvl w:val="0"/>
+          <w:numId w:val="20"/>
+        </w:numPr>
+        <w:jc w:val="both"/>
+        <w:rPr>
+          <w:sz w:val="24"/>
+          <w:szCs w:val="24"/>
+        </w:rPr>
+      </w:pPr>
+      <w:r>
+        <w:rPr>
+          <w:b/>
+          <w:bCs/>
+          <w:sz w:val="24"/>
+          <w:szCs w:val="24"/>
+        </w:rPr>
+        <w:t>Sustainability</w:t>
+      </w:r>
+      <w:r>
+        <w:rPr>
+          <w:sz w:val="24"/>
+          <w:szCs w:val="24"/>
+        </w:rPr>
+        <w:t>: A sustainable diet plan is easier to maintain long-term, which is key for lasting weight loss.</w:t>
+      </w:r>
+    </w:p>
+    <w:p>
+      <w:pPr>
+        <w:jc w:val="both"/>
+        <w:rPr>
+          <w:b/>
+          <w:bCs/>
+          <w:sz w:val="24"/>
+          <w:szCs w:val="24"/>
+        </w:rPr>
+      </w:pPr>
+      <w:r>
+        <w:rPr>
+          <w:b/>
+          <w:bCs/>
+          <w:sz w:val="24"/>
+          <w:szCs w:val="24"/>
+        </w:rPr>
+        <w:t>Exercise</w:t>
+      </w:r>
+    </w:p>
+    <w:p>
+      <w:pPr>
+        <w:numPr>
+          <w:ilvl w:val="0"/>
+          <w:numId w:val="21"/>
+        </w:numPr>
+        <w:jc w:val="both"/>
+        <w:rPr>
+          <w:sz w:val="24"/>
+          <w:szCs w:val="24"/>
+        </w:rPr>
+      </w:pPr>
+      <w:r>
+        <w:rPr>
+          <w:b/>
+          <w:bCs/>
+          <w:sz w:val="24"/>
+          <w:szCs w:val="24"/>
+        </w:rPr>
+        <w:t>Caloric Burn</w:t>
+      </w:r>
+      <w:r>
+        <w:rPr>
+          <w:sz w:val="24"/>
+          <w:szCs w:val="24"/>
+        </w:rPr>
+        <w:t>: Exercise helps burn calories, contributing to the caloric deficit needed for weight loss.</w:t>
+      </w:r>
+    </w:p>
+    <w:p>
+      <w:pPr>
+        <w:numPr>
+          <w:ilvl w:val="0"/>
+          <w:numId w:val="21"/>
+        </w:numPr>
+        <w:jc w:val="both"/>
+        <w:rPr>
+          <w:sz w:val="24"/>
+          <w:szCs w:val="24"/>
+        </w:rPr>
+      </w:pPr>
+      <w:r>
+        <w:rPr>
+          <w:b/>
+          <w:bCs/>
+          <w:sz w:val="24"/>
+          <w:szCs w:val="24"/>
+        </w:rPr>
+        <w:t>Muscle Preservation</w:t>
+      </w:r>
+      <w:r>
+        <w:rPr>
+          <w:sz w:val="24"/>
+          <w:szCs w:val="24"/>
+        </w:rPr>
+        <w:t>: Strength training helps preserve muscle mass during weight loss, which is important for maintaining a healthy metabolism.</w:t>
+      </w:r>
+    </w:p>
+    <w:p>
+      <w:pPr>
+        <w:numPr>
+          <w:ilvl w:val="0"/>
+          <w:numId w:val="21"/>
+        </w:numPr>
+        <w:jc w:val="both"/>
+        <w:rPr>
+          <w:sz w:val="24"/>
+          <w:szCs w:val="24"/>
+        </w:rPr>
+      </w:pPr>
+      <w:r>
+        <w:rPr>
+          <w:b/>
+          <w:bCs/>
+          <w:sz w:val="24"/>
+          <w:szCs w:val="24"/>
+        </w:rPr>
+        <w:t>Overall,</w:t>
+      </w:r>
+      <w:r>
+        <w:rPr>
+          <w:b/>
+          <w:bCs/>
+          <w:sz w:val="24"/>
+          <w:szCs w:val="24"/>
+        </w:rPr>
+        <w:t xml:space="preserve"> Health</w:t>
+      </w:r>
+      <w:r>
+        <w:rPr>
+          <w:sz w:val="24"/>
+          <w:szCs w:val="24"/>
+        </w:rPr>
+        <w:t>: Regular exercise improves cardiovascular health, boosts mood, and enhances overall well-being.</w:t>
+      </w:r>
+    </w:p>
+    <w:p>
+      <w:pPr>
+        <w:jc w:val="both"/>
+        <w:rPr>
+          <w:b/>
+          <w:bCs/>
+          <w:sz w:val="28"/>
+          <w:szCs w:val="28"/>
+        </w:rPr>
+      </w:pPr>
+      <w:r>
+        <w:rPr>
+          <w:b/>
+          <w:bCs/>
+          <w:sz w:val="28"/>
+          <w:szCs w:val="28"/>
+        </w:rPr>
+        <w:lastRenderedPageBreak/>
+        <w:t>Which to Focus On?</w:t>
+      </w:r>
+    </w:p>
+    <w:p>
+      <w:pPr>
+        <w:numPr>
+          <w:ilvl w:val="0"/>
+          <w:numId w:val="22"/>
+        </w:numPr>
+        <w:jc w:val="both"/>
+        <w:rPr>
+          <w:sz w:val="24"/>
+          <w:szCs w:val="24"/>
+        </w:rPr>
+      </w:pPr>
+      <w:r>
+        <w:rPr>
+          <w:b/>
+          <w:bCs/>
+          <w:sz w:val="24"/>
+          <w:szCs w:val="24"/>
+        </w:rPr>
+        <w:t>Diet</w:t>
+      </w:r>
+      <w:r>
+        <w:rPr>
+          <w:sz w:val="24"/>
+          <w:szCs w:val="24"/>
+        </w:rPr>
+        <w:t xml:space="preserve">: Often has a more </w:t>
+      </w:r>
+      <w:r>
+        <w:rPr>
+          <w:b/>
+          <w:bCs/>
+          <w:color w:val="FF0000"/>
+          <w:sz w:val="24"/>
+          <w:szCs w:val="24"/>
+        </w:rPr>
+        <w:t>immediate</w:t>
+      </w:r>
+      <w:r>
+        <w:rPr>
+          <w:color w:val="FF0000"/>
+          <w:sz w:val="24"/>
+          <w:szCs w:val="24"/>
+        </w:rPr>
+        <w:t xml:space="preserve"> </w:t>
+      </w:r>
+      <w:r>
+        <w:rPr>
+          <w:sz w:val="24"/>
+          <w:szCs w:val="24"/>
+        </w:rPr>
+        <w:t>impact on weight loss. It’s easier to reduce calorie intake through diet than to burn the same amount through exercise.</w:t>
+      </w:r>
+    </w:p>
+    <w:p>
+      <w:pPr>
+        <w:numPr>
+          <w:ilvl w:val="0"/>
+          <w:numId w:val="22"/>
+        </w:numPr>
+        <w:jc w:val="both"/>
+        <w:rPr>
+          <w:sz w:val="24"/>
+          <w:szCs w:val="24"/>
+        </w:rPr>
+      </w:pPr>
+      <w:r>
+        <w:rPr>
+          <w:b/>
+          <w:bCs/>
+          <w:sz w:val="24"/>
+          <w:szCs w:val="24"/>
+        </w:rPr>
+        <w:t>Exercise</w:t>
+      </w:r>
+      <w:r>
+        <w:rPr>
+          <w:sz w:val="24"/>
+          <w:szCs w:val="24"/>
+        </w:rPr>
+        <w:t xml:space="preserve">: Supports weight loss and helps maintain muscle mass, which is crucial for </w:t>
+      </w:r>
+      <w:r>
+        <w:rPr>
+          <w:b/>
+          <w:bCs/>
+          <w:color w:val="FF0000"/>
+          <w:sz w:val="24"/>
+          <w:szCs w:val="24"/>
+        </w:rPr>
+        <w:t>long-term</w:t>
+      </w:r>
+      <w:r>
+        <w:rPr>
+          <w:color w:val="FF0000"/>
+          <w:sz w:val="24"/>
+          <w:szCs w:val="24"/>
+        </w:rPr>
+        <w:t xml:space="preserve"> </w:t>
+      </w:r>
+      <w:r>
+        <w:rPr>
+          <w:sz w:val="24"/>
+          <w:szCs w:val="24"/>
+        </w:rPr>
+        <w:t>success. It also provides numerous health benefits beyond weight loss.</w:t>
+      </w:r>
+    </w:p>
+    <w:p>
+      <w:pPr>
+        <w:jc w:val="both"/>
+        <w:rPr>
+          <w:b/>
+          <w:bCs/>
+          <w:sz w:val="28"/>
+          <w:szCs w:val="28"/>
+        </w:rPr>
+      </w:pPr>
+      <w:r>
+        <w:rPr>
+          <w:b/>
+          <w:bCs/>
+          <w:sz w:val="28"/>
+          <w:szCs w:val="28"/>
+        </w:rPr>
+        <w:t>Best Approach</w:t>
+      </w:r>
+    </w:p>
+    <w:p>
+      <w:pPr>
+        <w:jc w:val="both"/>
+        <w:rPr>
+          <w:sz w:val="24"/>
+          <w:szCs w:val="24"/>
+        </w:rPr>
+      </w:pPr>
+      <w:r>
+        <w:rPr>
+          <w:sz w:val="24"/>
+          <w:szCs w:val="24"/>
+        </w:rPr>
+        <w:t>A combination of both diet and exercise is typically the most effective strategy for weight loss. Here’s a balanced approach:</w:t>
+      </w:r>
+    </w:p>
+    <w:p>
+      <w:pPr>
+        <w:numPr>
+          <w:ilvl w:val="0"/>
+          <w:numId w:val="23"/>
+        </w:numPr>
+        <w:jc w:val="both"/>
+        <w:rPr>
+          <w:sz w:val="24"/>
+          <w:szCs w:val="24"/>
+        </w:rPr>
+      </w:pPr>
+      <w:r>
+        <w:rPr>
+          <w:b/>
+          <w:bCs/>
+          <w:sz w:val="24"/>
+          <w:szCs w:val="24"/>
+        </w:rPr>
+        <w:t>Diet</w:t>
+      </w:r>
+      <w:r>
+        <w:rPr>
+          <w:sz w:val="24"/>
+          <w:szCs w:val="24"/>
+        </w:rPr>
+        <w:t>: Focus on a balanced, nutrient-dense diet that creates a moderate caloric deficit.</w:t>
+      </w:r>
+    </w:p>
+    <w:p>
+      <w:pPr>
+        <w:numPr>
+          <w:ilvl w:val="0"/>
+          <w:numId w:val="23"/>
+        </w:numPr>
+        <w:jc w:val="both"/>
+        <w:rPr>
+          <w:sz w:val="24"/>
+          <w:szCs w:val="24"/>
+        </w:rPr>
+      </w:pPr>
+      <w:r>
+        <w:rPr>
+          <w:b/>
+          <w:bCs/>
+          <w:sz w:val="24"/>
+          <w:szCs w:val="24"/>
+        </w:rPr>
+        <w:t>Exercise</w:t>
+      </w:r>
+      <w:r>
+        <w:rPr>
+          <w:sz w:val="24"/>
+          <w:szCs w:val="24"/>
+        </w:rPr>
+        <w:t>: Incorporate both cardio and strength training to maximize calorie burn and muscle preservation</w:t>
+      </w:r>
+    </w:p>
+    <w:p>
+      <w:pPr>
+        <w:jc w:val="both"/>
+        <w:rPr>
           <w:rStyle w:val="Strong"/>
           <w:b w:val="0"/>
           <w:bCs w:val="0"/>
@@ -4404,13 +4886,6 @@
           <w:szCs w:val="24"/>
         </w:rPr>
       </w:pPr>
-      <w:r>
-        <w:rPr>
-          <w:sz w:val="24"/>
-          <w:szCs w:val="24"/>
-        </w:rPr>
-        <w:t xml:space="preserve"> </w:t>
-      </w:r>
     </w:p>
     <w:sectPr>
       <w:pgSz w:w="11906" w:h="16838"/>
@@ -4425,6 +4900,155 @@
 <file path=word/numbering.xml><?xml version="1.0" encoding="utf-8"?>
 <w:numbering xmlns:wpc="http://schemas.microsoft.com/office/word/2010/wordprocessingCanvas" xmlns:cx="http://schemas.microsoft.com/office/drawing/2014/chartex" xmlns:cx1="http://schemas.microsoft.com/office/drawing/2015/9/8/chartex" xmlns:cx2="http://schemas.microsoft.com/office/drawing/2015/10/21/chartex" xmlns:cx3="http://schemas.microsoft.com/office/drawing/2016/5/9/chartex" xmlns:cx4="http://schemas.microsoft.com/office/drawing/2016/5/10/chartex" xmlns:cx5="http://schemas.microsoft.com/office/drawing/2016/5/11/chartex" xmlns:cx6="http://schemas.microsoft.com/office/drawing/2016/5/12/chartex" xmlns:cx7="http://schemas.microsoft.com/office/drawing/2016/5/13/chartex" xmlns:cx8="http://schemas.microsoft.com/office/drawing/2016/5/14/chartex" xmlns:mc="http://schemas.openxmlformats.org/markup-compatibility/2006" xmlns:aink="http://schemas.microsoft.com/office/drawing/2016/ink" xmlns:am3d="http://schemas.microsoft.com/office/drawing/2017/model3d" xmlns:o="urn:schemas-microsoft-com:office:office" xmlns:oel="http://schemas.microsoft.com/office/2019/extlst" xmlns:r="http://schemas.openxmlformats.org/officeDocument/2006/relationships" xmlns:m="http://schemas.openxmlformats.org/officeDocument/2006/math" xmlns:v="urn:schemas-microsoft-com:vml" xmlns:wp14="http://schemas.microsoft.com/office/word/2010/wordprocessingDrawing" xmlns:wp="http://schemas.openxmlformats.org/drawingml/2006/wordprocessingDrawing" xmlns:w10="urn:schemas-microsoft-com:office:word" xmlns:w="http://schemas.openxmlformats.org/wordprocessingml/2006/main" xmlns:w14="http://schemas.microsoft.com/office/word/2010/wordml" xmlns:w15="http://schemas.microsoft.com/office/word/2012/wordml" xmlns:w16cex="http://schemas.microsoft.com/office/word/2018/wordml/cex" xmlns:w16cid="http://schemas.microsoft.com/office/word/2016/wordml/cid" xmlns:w16="http://schemas.microsoft.com/office/word/2018/wordml" xmlns:w16du="http://schemas.microsoft.com/office/word/2023/wordml/word16du" xmlns:w16sdtdh="http://schemas.microsoft.com/office/word/2020/wordml/sdtdatahash" xmlns:w16se="http://schemas.microsoft.com/office/word/2015/wordml/symex" xmlns:wpg="http://schemas.microsoft.com/office/word/2010/wordprocessingGroup" xmlns:wpi="http://schemas.microsoft.com/office/word/2010/wordprocessingInk" xmlns:wne="http://schemas.microsoft.com/office/word/2006/wordml" xmlns:wps="http://schemas.microsoft.com/office/word/2010/wordprocessingShape" mc:Ignorable="w14 w15 w16se w16cid w16 w16cex w16sdtdh w16du wp14">
   <w:abstractNum w:abstractNumId="0" w15:restartNumberingAfterBreak="0">
+    <w:nsid w:val="006679A6"/>
+    <w:multiLevelType w:val="multilevel"/>
+    <w:tmpl w:val="3A148000"/>
+    <w:lvl w:ilvl="0">
+      <w:start w:val="1"/>
+      <w:numFmt w:val="bullet"/>
+      <w:lvlText w:val=""/>
+      <w:lvlJc w:val="left"/>
+      <w:pPr>
+        <w:tabs>
+          <w:tab w:val="num" w:pos="720"/>
+        </w:tabs>
+        <w:ind w:left="720" w:hanging="360"/>
+      </w:pPr>
+      <w:rPr>
+        <w:rFonts w:ascii="Symbol" w:hAnsi="Symbol" w:hint="default"/>
+        <w:sz w:val="20"/>
+      </w:rPr>
+    </w:lvl>
+    <w:lvl w:ilvl="1" w:tentative="1">
+      <w:start w:val="1"/>
+      <w:numFmt w:val="bullet"/>
+      <w:lvlText w:val="o"/>
+      <w:lvlJc w:val="left"/>
+      <w:pPr>
+        <w:tabs>
+          <w:tab w:val="num" w:pos="1440"/>
+        </w:tabs>
+        <w:ind w:left="1440" w:hanging="360"/>
+      </w:pPr>
+      <w:rPr>
+        <w:rFonts w:ascii="Courier New" w:hAnsi="Courier New" w:hint="default"/>
+        <w:sz w:val="20"/>
+      </w:rPr>
+    </w:lvl>
+    <w:lvl w:ilvl="2" w:tentative="1">
+      <w:start w:val="1"/>
+      <w:numFmt w:val="bullet"/>
+      <w:lvlText w:val=""/>
+      <w:lvlJc w:val="left"/>
+      <w:pPr>
+        <w:tabs>
+          <w:tab w:val="num" w:pos="2160"/>
+        </w:tabs>
+        <w:ind w:left="2160" w:hanging="360"/>
+      </w:pPr>
+      <w:rPr>
+        <w:rFonts w:ascii="Wingdings" w:hAnsi="Wingdings" w:hint="default"/>
+        <w:sz w:val="20"/>
+      </w:rPr>
+    </w:lvl>
+    <w:lvl w:ilvl="3" w:tentative="1">
+      <w:start w:val="1"/>
+      <w:numFmt w:val="bullet"/>
+      <w:lvlText w:val=""/>
+      <w:lvlJc w:val="left"/>
+      <w:pPr>
+        <w:tabs>
+          <w:tab w:val="num" w:pos="2880"/>
+        </w:tabs>
+        <w:ind w:left="2880" w:hanging="360"/>
+      </w:pPr>
+      <w:rPr>
+        <w:rFonts w:ascii="Wingdings" w:hAnsi="Wingdings" w:hint="default"/>
+        <w:sz w:val="20"/>
+      </w:rPr>
+    </w:lvl>
+    <w:lvl w:ilvl="4" w:tentative="1">
+      <w:start w:val="1"/>
+      <w:numFmt w:val="bullet"/>
+      <w:lvlText w:val=""/>
+      <w:lvlJc w:val="left"/>
+      <w:pPr>
+        <w:tabs>
+          <w:tab w:val="num" w:pos="3600"/>
+        </w:tabs>
+        <w:ind w:left="3600" w:hanging="360"/>
+      </w:pPr>
+      <w:rPr>
+        <w:rFonts w:ascii="Wingdings" w:hAnsi="Wingdings" w:hint="default"/>
+        <w:sz w:val="20"/>
+      </w:rPr>
+    </w:lvl>
+    <w:lvl w:ilvl="5" w:tentative="1">
+      <w:start w:val="1"/>
+      <w:numFmt w:val="bullet"/>
+      <w:lvlText w:val=""/>
+      <w:lvlJc w:val="left"/>
+      <w:pPr>
+        <w:tabs>
+          <w:tab w:val="num" w:pos="4320"/>
+        </w:tabs>
+        <w:ind w:left="4320" w:hanging="360"/>
+      </w:pPr>
+      <w:rPr>
+        <w:rFonts w:ascii="Wingdings" w:hAnsi="Wingdings" w:hint="default"/>
+        <w:sz w:val="20"/>
+      </w:rPr>
+    </w:lvl>
+    <w:lvl w:ilvl="6" w:tentative="1">
+      <w:start w:val="1"/>
+      <w:numFmt w:val="bullet"/>
+      <w:lvlText w:val=""/>
+      <w:lvlJc w:val="left"/>
+      <w:pPr>
+        <w:tabs>
+          <w:tab w:val="num" w:pos="5040"/>
+        </w:tabs>
+        <w:ind w:left="5040" w:hanging="360"/>
+      </w:pPr>
+      <w:rPr>
+        <w:rFonts w:ascii="Wingdings" w:hAnsi="Wingdings" w:hint="default"/>
+        <w:sz w:val="20"/>
+      </w:rPr>
+    </w:lvl>
+    <w:lvl w:ilvl="7" w:tentative="1">
+      <w:start w:val="1"/>
+      <w:numFmt w:val="bullet"/>
+      <w:lvlText w:val=""/>
+      <w:lvlJc w:val="left"/>
+      <w:pPr>
+        <w:tabs>
+          <w:tab w:val="num" w:pos="5760"/>
+        </w:tabs>
+        <w:ind w:left="5760" w:hanging="360"/>
+      </w:pPr>
+      <w:rPr>
+        <w:rFonts w:ascii="Wingdings" w:hAnsi="Wingdings" w:hint="default"/>
+        <w:sz w:val="20"/>
+      </w:rPr>
+    </w:lvl>
+    <w:lvl w:ilvl="8" w:tentative="1">
+      <w:start w:val="1"/>
+      <w:numFmt w:val="bullet"/>
+      <w:lvlText w:val=""/>
+      <w:lvlJc w:val="left"/>
+      <w:pPr>
+        <w:tabs>
+          <w:tab w:val="num" w:pos="6480"/>
+        </w:tabs>
+        <w:ind w:left="6480" w:hanging="360"/>
+      </w:pPr>
+      <w:rPr>
+        <w:rFonts w:ascii="Wingdings" w:hAnsi="Wingdings" w:hint="default"/>
+        <w:sz w:val="20"/>
+      </w:rPr>
+    </w:lvl>
+  </w:abstractNum>
+  <w:abstractNum w:abstractNumId="1" w15:restartNumberingAfterBreak="0">
     <w:nsid w:val="008D571D"/>
     <w:multiLevelType w:val="multilevel"/>
     <w:tmpl w:val="A316138A"/>
@@ -4569,7 +5193,7 @@
       </w:rPr>
     </w:lvl>
   </w:abstractNum>
-  <w:abstractNum w:abstractNumId="1" w15:restartNumberingAfterBreak="0">
+  <w:abstractNum w:abstractNumId="2" w15:restartNumberingAfterBreak="0">
     <w:nsid w:val="0294188B"/>
     <w:multiLevelType w:val="multilevel"/>
     <w:tmpl w:val="92E6E5CC"/>
@@ -4718,7 +5342,156 @@
       </w:rPr>
     </w:lvl>
   </w:abstractNum>
-  <w:abstractNum w:abstractNumId="2" w15:restartNumberingAfterBreak="0">
+  <w:abstractNum w:abstractNumId="3" w15:restartNumberingAfterBreak="0">
+    <w:nsid w:val="03370220"/>
+    <w:multiLevelType w:val="multilevel"/>
+    <w:tmpl w:val="821CCFF8"/>
+    <w:lvl w:ilvl="0">
+      <w:start w:val="1"/>
+      <w:numFmt w:val="bullet"/>
+      <w:lvlText w:val=""/>
+      <w:lvlJc w:val="left"/>
+      <w:pPr>
+        <w:tabs>
+          <w:tab w:val="num" w:pos="720"/>
+        </w:tabs>
+        <w:ind w:left="720" w:hanging="360"/>
+      </w:pPr>
+      <w:rPr>
+        <w:rFonts w:ascii="Symbol" w:hAnsi="Symbol" w:hint="default"/>
+        <w:sz w:val="20"/>
+      </w:rPr>
+    </w:lvl>
+    <w:lvl w:ilvl="1" w:tentative="1">
+      <w:start w:val="1"/>
+      <w:numFmt w:val="bullet"/>
+      <w:lvlText w:val="o"/>
+      <w:lvlJc w:val="left"/>
+      <w:pPr>
+        <w:tabs>
+          <w:tab w:val="num" w:pos="1440"/>
+        </w:tabs>
+        <w:ind w:left="1440" w:hanging="360"/>
+      </w:pPr>
+      <w:rPr>
+        <w:rFonts w:ascii="Courier New" w:hAnsi="Courier New" w:hint="default"/>
+        <w:sz w:val="20"/>
+      </w:rPr>
+    </w:lvl>
+    <w:lvl w:ilvl="2" w:tentative="1">
+      <w:start w:val="1"/>
+      <w:numFmt w:val="bullet"/>
+      <w:lvlText w:val=""/>
+      <w:lvlJc w:val="left"/>
+      <w:pPr>
+        <w:tabs>
+          <w:tab w:val="num" w:pos="2160"/>
+        </w:tabs>
+        <w:ind w:left="2160" w:hanging="360"/>
+      </w:pPr>
+      <w:rPr>
+        <w:rFonts w:ascii="Wingdings" w:hAnsi="Wingdings" w:hint="default"/>
+        <w:sz w:val="20"/>
+      </w:rPr>
+    </w:lvl>
+    <w:lvl w:ilvl="3" w:tentative="1">
+      <w:start w:val="1"/>
+      <w:numFmt w:val="bullet"/>
+      <w:lvlText w:val=""/>
+      <w:lvlJc w:val="left"/>
+      <w:pPr>
+        <w:tabs>
+          <w:tab w:val="num" w:pos="2880"/>
+        </w:tabs>
+        <w:ind w:left="2880" w:hanging="360"/>
+      </w:pPr>
+      <w:rPr>
+        <w:rFonts w:ascii="Wingdings" w:hAnsi="Wingdings" w:hint="default"/>
+        <w:sz w:val="20"/>
+      </w:rPr>
+    </w:lvl>
+    <w:lvl w:ilvl="4" w:tentative="1">
+      <w:start w:val="1"/>
+      <w:numFmt w:val="bullet"/>
+      <w:lvlText w:val=""/>
+      <w:lvlJc w:val="left"/>
+      <w:pPr>
+        <w:tabs>
+          <w:tab w:val="num" w:pos="3600"/>
+        </w:tabs>
+        <w:ind w:left="3600" w:hanging="360"/>
+      </w:pPr>
+      <w:rPr>
+        <w:rFonts w:ascii="Wingdings" w:hAnsi="Wingdings" w:hint="default"/>
+        <w:sz w:val="20"/>
+      </w:rPr>
+    </w:lvl>
+    <w:lvl w:ilvl="5" w:tentative="1">
+      <w:start w:val="1"/>
+      <w:numFmt w:val="bullet"/>
+      <w:lvlText w:val=""/>
+      <w:lvlJc w:val="left"/>
+      <w:pPr>
+        <w:tabs>
+          <w:tab w:val="num" w:pos="4320"/>
+        </w:tabs>
+        <w:ind w:left="4320" w:hanging="360"/>
+      </w:pPr>
+      <w:rPr>
+        <w:rFonts w:ascii="Wingdings" w:hAnsi="Wingdings" w:hint="default"/>
+        <w:sz w:val="20"/>
+      </w:rPr>
+    </w:lvl>
+    <w:lvl w:ilvl="6" w:tentative="1">
+      <w:start w:val="1"/>
+      <w:numFmt w:val="bullet"/>
+      <w:lvlText w:val=""/>
+      <w:lvlJc w:val="left"/>
+      <w:pPr>
+        <w:tabs>
+          <w:tab w:val="num" w:pos="5040"/>
+        </w:tabs>
+        <w:ind w:left="5040" w:hanging="360"/>
+      </w:pPr>
+      <w:rPr>
+        <w:rFonts w:ascii="Wingdings" w:hAnsi="Wingdings" w:hint="default"/>
+        <w:sz w:val="20"/>
+      </w:rPr>
+    </w:lvl>
+    <w:lvl w:ilvl="7" w:tentative="1">
+      <w:start w:val="1"/>
+      <w:numFmt w:val="bullet"/>
+      <w:lvlText w:val=""/>
+      <w:lvlJc w:val="left"/>
+      <w:pPr>
+        <w:tabs>
+          <w:tab w:val="num" w:pos="5760"/>
+        </w:tabs>
+        <w:ind w:left="5760" w:hanging="360"/>
+      </w:pPr>
+      <w:rPr>
+        <w:rFonts w:ascii="Wingdings" w:hAnsi="Wingdings" w:hint="default"/>
+        <w:sz w:val="20"/>
+      </w:rPr>
+    </w:lvl>
+    <w:lvl w:ilvl="8" w:tentative="1">
+      <w:start w:val="1"/>
+      <w:numFmt w:val="bullet"/>
+      <w:lvlText w:val=""/>
+      <w:lvlJc w:val="left"/>
+      <w:pPr>
+        <w:tabs>
+          <w:tab w:val="num" w:pos="6480"/>
+        </w:tabs>
+        <w:ind w:left="6480" w:hanging="360"/>
+      </w:pPr>
+      <w:rPr>
+        <w:rFonts w:ascii="Wingdings" w:hAnsi="Wingdings" w:hint="default"/>
+        <w:sz w:val="20"/>
+      </w:rPr>
+    </w:lvl>
+  </w:abstractNum>
+  <w:abstractNum w:abstractNumId="4" w15:restartNumberingAfterBreak="0">
     <w:nsid w:val="066F10BD"/>
     <w:multiLevelType w:val="hybridMultilevel"/>
     <w:tmpl w:val="98F445F4"/>
@@ -4831,7 +5604,156 @@
       </w:rPr>
     </w:lvl>
   </w:abstractNum>
-  <w:abstractNum w:abstractNumId="3" w15:restartNumberingAfterBreak="0">
+  <w:abstractNum w:abstractNumId="5" w15:restartNumberingAfterBreak="0">
+    <w:nsid w:val="0DC27808"/>
+    <w:multiLevelType w:val="multilevel"/>
+    <w:tmpl w:val="1BB6722A"/>
+    <w:lvl w:ilvl="0">
+      <w:start w:val="1"/>
+      <w:numFmt w:val="bullet"/>
+      <w:lvlText w:val=""/>
+      <w:lvlJc w:val="left"/>
+      <w:pPr>
+        <w:tabs>
+          <w:tab w:val="num" w:pos="720"/>
+        </w:tabs>
+        <w:ind w:left="720" w:hanging="360"/>
+      </w:pPr>
+      <w:rPr>
+        <w:rFonts w:ascii="Symbol" w:hAnsi="Symbol" w:hint="default"/>
+        <w:sz w:val="20"/>
+      </w:rPr>
+    </w:lvl>
+    <w:lvl w:ilvl="1" w:tentative="1">
+      <w:start w:val="1"/>
+      <w:numFmt w:val="bullet"/>
+      <w:lvlText w:val="o"/>
+      <w:lvlJc w:val="left"/>
+      <w:pPr>
+        <w:tabs>
+          <w:tab w:val="num" w:pos="1440"/>
+        </w:tabs>
+        <w:ind w:left="1440" w:hanging="360"/>
+      </w:pPr>
+      <w:rPr>
+        <w:rFonts w:ascii="Courier New" w:hAnsi="Courier New" w:hint="default"/>
+        <w:sz w:val="20"/>
+      </w:rPr>
+    </w:lvl>
+    <w:lvl w:ilvl="2" w:tentative="1">
+      <w:start w:val="1"/>
+      <w:numFmt w:val="bullet"/>
+      <w:lvlText w:val=""/>
+      <w:lvlJc w:val="left"/>
+      <w:pPr>
+        <w:tabs>
+          <w:tab w:val="num" w:pos="2160"/>
+        </w:tabs>
+        <w:ind w:left="2160" w:hanging="360"/>
+      </w:pPr>
+      <w:rPr>
+        <w:rFonts w:ascii="Wingdings" w:hAnsi="Wingdings" w:hint="default"/>
+        <w:sz w:val="20"/>
+      </w:rPr>
+    </w:lvl>
+    <w:lvl w:ilvl="3" w:tentative="1">
+      <w:start w:val="1"/>
+      <w:numFmt w:val="bullet"/>
+      <w:lvlText w:val=""/>
+      <w:lvlJc w:val="left"/>
+      <w:pPr>
+        <w:tabs>
+          <w:tab w:val="num" w:pos="2880"/>
+        </w:tabs>
+        <w:ind w:left="2880" w:hanging="360"/>
+      </w:pPr>
+      <w:rPr>
+        <w:rFonts w:ascii="Wingdings" w:hAnsi="Wingdings" w:hint="default"/>
+        <w:sz w:val="20"/>
+      </w:rPr>
+    </w:lvl>
+    <w:lvl w:ilvl="4" w:tentative="1">
+      <w:start w:val="1"/>
+      <w:numFmt w:val="bullet"/>
+      <w:lvlText w:val=""/>
+      <w:lvlJc w:val="left"/>
+      <w:pPr>
+        <w:tabs>
+          <w:tab w:val="num" w:pos="3600"/>
+        </w:tabs>
+        <w:ind w:left="3600" w:hanging="360"/>
+      </w:pPr>
+      <w:rPr>
+        <w:rFonts w:ascii="Wingdings" w:hAnsi="Wingdings" w:hint="default"/>
+        <w:sz w:val="20"/>
+      </w:rPr>
+    </w:lvl>
+    <w:lvl w:ilvl="5" w:tentative="1">
+      <w:start w:val="1"/>
+      <w:numFmt w:val="bullet"/>
+      <w:lvlText w:val=""/>
+      <w:lvlJc w:val="left"/>
+      <w:pPr>
+        <w:tabs>
+          <w:tab w:val="num" w:pos="4320"/>
+        </w:tabs>
+        <w:ind w:left="4320" w:hanging="360"/>
+      </w:pPr>
+      <w:rPr>
+        <w:rFonts w:ascii="Wingdings" w:hAnsi="Wingdings" w:hint="default"/>
+        <w:sz w:val="20"/>
+      </w:rPr>
+    </w:lvl>
+    <w:lvl w:ilvl="6" w:tentative="1">
+      <w:start w:val="1"/>
+      <w:numFmt w:val="bullet"/>
+      <w:lvlText w:val=""/>
+      <w:lvlJc w:val="left"/>
+      <w:pPr>
+        <w:tabs>
+          <w:tab w:val="num" w:pos="5040"/>
+        </w:tabs>
+        <w:ind w:left="5040" w:hanging="360"/>
+      </w:pPr>
+      <w:rPr>
+        <w:rFonts w:ascii="Wingdings" w:hAnsi="Wingdings" w:hint="default"/>
+        <w:sz w:val="20"/>
+      </w:rPr>
+    </w:lvl>
+    <w:lvl w:ilvl="7" w:tentative="1">
+      <w:start w:val="1"/>
+      <w:numFmt w:val="bullet"/>
+      <w:lvlText w:val=""/>
+      <w:lvlJc w:val="left"/>
+      <w:pPr>
+        <w:tabs>
+          <w:tab w:val="num" w:pos="5760"/>
+        </w:tabs>
+        <w:ind w:left="5760" w:hanging="360"/>
+      </w:pPr>
+      <w:rPr>
+        <w:rFonts w:ascii="Wingdings" w:hAnsi="Wingdings" w:hint="default"/>
+        <w:sz w:val="20"/>
+      </w:rPr>
+    </w:lvl>
+    <w:lvl w:ilvl="8" w:tentative="1">
+      <w:start w:val="1"/>
+      <w:numFmt w:val="bullet"/>
+      <w:lvlText w:val=""/>
+      <w:lvlJc w:val="left"/>
+      <w:pPr>
+        <w:tabs>
+          <w:tab w:val="num" w:pos="6480"/>
+        </w:tabs>
+        <w:ind w:left="6480" w:hanging="360"/>
+      </w:pPr>
+      <w:rPr>
+        <w:rFonts w:ascii="Wingdings" w:hAnsi="Wingdings" w:hint="default"/>
+        <w:sz w:val="20"/>
+      </w:rPr>
+    </w:lvl>
+  </w:abstractNum>
+  <w:abstractNum w:abstractNumId="6" w15:restartNumberingAfterBreak="0">
     <w:nsid w:val="116D3FBA"/>
     <w:multiLevelType w:val="multilevel"/>
     <w:tmpl w:val="06F2D440"/>
@@ -4980,7 +5902,156 @@
       </w:rPr>
     </w:lvl>
   </w:abstractNum>
-  <w:abstractNum w:abstractNumId="4" w15:restartNumberingAfterBreak="0">
+  <w:abstractNum w:abstractNumId="7" w15:restartNumberingAfterBreak="0">
+    <w:nsid w:val="12B6105B"/>
+    <w:multiLevelType w:val="multilevel"/>
+    <w:tmpl w:val="6590D0C0"/>
+    <w:lvl w:ilvl="0">
+      <w:start w:val="1"/>
+      <w:numFmt w:val="bullet"/>
+      <w:lvlText w:val=""/>
+      <w:lvlJc w:val="left"/>
+      <w:pPr>
+        <w:tabs>
+          <w:tab w:val="num" w:pos="720"/>
+        </w:tabs>
+        <w:ind w:left="720" w:hanging="360"/>
+      </w:pPr>
+      <w:rPr>
+        <w:rFonts w:ascii="Symbol" w:hAnsi="Symbol" w:hint="default"/>
+        <w:sz w:val="20"/>
+      </w:rPr>
+    </w:lvl>
+    <w:lvl w:ilvl="1" w:tentative="1">
+      <w:start w:val="1"/>
+      <w:numFmt w:val="bullet"/>
+      <w:lvlText w:val="o"/>
+      <w:lvlJc w:val="left"/>
+      <w:pPr>
+        <w:tabs>
+          <w:tab w:val="num" w:pos="1440"/>
+        </w:tabs>
+        <w:ind w:left="1440" w:hanging="360"/>
+      </w:pPr>
+      <w:rPr>
+        <w:rFonts w:ascii="Courier New" w:hAnsi="Courier New" w:hint="default"/>
+        <w:sz w:val="20"/>
+      </w:rPr>
+    </w:lvl>
+    <w:lvl w:ilvl="2" w:tentative="1">
+      <w:start w:val="1"/>
+      <w:numFmt w:val="bullet"/>
+      <w:lvlText w:val=""/>
+      <w:lvlJc w:val="left"/>
+      <w:pPr>
+        <w:tabs>
+          <w:tab w:val="num" w:pos="2160"/>
+        </w:tabs>
+        <w:ind w:left="2160" w:hanging="360"/>
+      </w:pPr>
+      <w:rPr>
+        <w:rFonts w:ascii="Wingdings" w:hAnsi="Wingdings" w:hint="default"/>
+        <w:sz w:val="20"/>
+      </w:rPr>
+    </w:lvl>
+    <w:lvl w:ilvl="3" w:tentative="1">
+      <w:start w:val="1"/>
+      <w:numFmt w:val="bullet"/>
+      <w:lvlText w:val=""/>
+      <w:lvlJc w:val="left"/>
+      <w:pPr>
+        <w:tabs>
+          <w:tab w:val="num" w:pos="2880"/>
+        </w:tabs>
+        <w:ind w:left="2880" w:hanging="360"/>
+      </w:pPr>
+      <w:rPr>
+        <w:rFonts w:ascii="Wingdings" w:hAnsi="Wingdings" w:hint="default"/>
+        <w:sz w:val="20"/>
+      </w:rPr>
+    </w:lvl>
+    <w:lvl w:ilvl="4" w:tentative="1">
+      <w:start w:val="1"/>
+      <w:numFmt w:val="bullet"/>
+      <w:lvlText w:val=""/>
+      <w:lvlJc w:val="left"/>
+      <w:pPr>
+        <w:tabs>
+          <w:tab w:val="num" w:pos="3600"/>
+        </w:tabs>
+        <w:ind w:left="3600" w:hanging="360"/>
+      </w:pPr>
+      <w:rPr>
+        <w:rFonts w:ascii="Wingdings" w:hAnsi="Wingdings" w:hint="default"/>
+        <w:sz w:val="20"/>
+      </w:rPr>
+    </w:lvl>
+    <w:lvl w:ilvl="5" w:tentative="1">
+      <w:start w:val="1"/>
+      <w:numFmt w:val="bullet"/>
+      <w:lvlText w:val=""/>
+      <w:lvlJc w:val="left"/>
+      <w:pPr>
+        <w:tabs>
+          <w:tab w:val="num" w:pos="4320"/>
+        </w:tabs>
+        <w:ind w:left="4320" w:hanging="360"/>
+      </w:pPr>
+      <w:rPr>
+        <w:rFonts w:ascii="Wingdings" w:hAnsi="Wingdings" w:hint="default"/>
+        <w:sz w:val="20"/>
+      </w:rPr>
+    </w:lvl>
+    <w:lvl w:ilvl="6" w:tentative="1">
+      <w:start w:val="1"/>
+      <w:numFmt w:val="bullet"/>
+      <w:lvlText w:val=""/>
+      <w:lvlJc w:val="left"/>
+      <w:pPr>
+        <w:tabs>
+          <w:tab w:val="num" w:pos="5040"/>
+        </w:tabs>
+        <w:ind w:left="5040" w:hanging="360"/>
+      </w:pPr>
+      <w:rPr>
+        <w:rFonts w:ascii="Wingdings" w:hAnsi="Wingdings" w:hint="default"/>
+        <w:sz w:val="20"/>
+      </w:rPr>
+    </w:lvl>
+    <w:lvl w:ilvl="7" w:tentative="1">
+      <w:start w:val="1"/>
+      <w:numFmt w:val="bullet"/>
+      <w:lvlText w:val=""/>
+      <w:lvlJc w:val="left"/>
+      <w:pPr>
+        <w:tabs>
+          <w:tab w:val="num" w:pos="5760"/>
+        </w:tabs>
+        <w:ind w:left="5760" w:hanging="360"/>
+      </w:pPr>
+      <w:rPr>
+        <w:rFonts w:ascii="Wingdings" w:hAnsi="Wingdings" w:hint="default"/>
+        <w:sz w:val="20"/>
+      </w:rPr>
+    </w:lvl>
+    <w:lvl w:ilvl="8" w:tentative="1">
+      <w:start w:val="1"/>
+      <w:numFmt w:val="bullet"/>
+      <w:lvlText w:val=""/>
+      <w:lvlJc w:val="left"/>
+      <w:pPr>
+        <w:tabs>
+          <w:tab w:val="num" w:pos="6480"/>
+        </w:tabs>
+        <w:ind w:left="6480" w:hanging="360"/>
+      </w:pPr>
+      <w:rPr>
+        <w:rFonts w:ascii="Wingdings" w:hAnsi="Wingdings" w:hint="default"/>
+        <w:sz w:val="20"/>
+      </w:rPr>
+    </w:lvl>
+  </w:abstractNum>
+  <w:abstractNum w:abstractNumId="8" w15:restartNumberingAfterBreak="0">
     <w:nsid w:val="15953A16"/>
     <w:multiLevelType w:val="multilevel"/>
     <w:tmpl w:val="51D6134A"/>
@@ -5129,7 +6200,7 @@
       </w:rPr>
     </w:lvl>
   </w:abstractNum>
-  <w:abstractNum w:abstractNumId="5" w15:restartNumberingAfterBreak="0">
+  <w:abstractNum w:abstractNumId="9" w15:restartNumberingAfterBreak="0">
     <w:nsid w:val="1F245870"/>
     <w:multiLevelType w:val="multilevel"/>
     <w:tmpl w:val="017C5984"/>
@@ -5278,7 +6349,7 @@
       </w:rPr>
     </w:lvl>
   </w:abstractNum>
-  <w:abstractNum w:abstractNumId="6" w15:restartNumberingAfterBreak="0">
+  <w:abstractNum w:abstractNumId="10" w15:restartNumberingAfterBreak="0">
     <w:nsid w:val="23A80FEB"/>
     <w:multiLevelType w:val="multilevel"/>
     <w:tmpl w:val="A1DCE8CA"/>
@@ -5427,7 +6498,7 @@
       </w:rPr>
     </w:lvl>
   </w:abstractNum>
-  <w:abstractNum w:abstractNumId="7" w15:restartNumberingAfterBreak="0">
+  <w:abstractNum w:abstractNumId="11" w15:restartNumberingAfterBreak="0">
     <w:nsid w:val="2977066E"/>
     <w:multiLevelType w:val="multilevel"/>
     <w:tmpl w:val="D9342C68"/>
@@ -5543,7 +6614,7 @@
       </w:pPr>
     </w:lvl>
   </w:abstractNum>
-  <w:abstractNum w:abstractNumId="8" w15:restartNumberingAfterBreak="0">
+  <w:abstractNum w:abstractNumId="12" w15:restartNumberingAfterBreak="0">
     <w:nsid w:val="2C003FDA"/>
     <w:multiLevelType w:val="multilevel"/>
     <w:tmpl w:val="BDDC4282"/>
@@ -5659,7 +6730,7 @@
       </w:pPr>
     </w:lvl>
   </w:abstractNum>
-  <w:abstractNum w:abstractNumId="9" w15:restartNumberingAfterBreak="0">
+  <w:abstractNum w:abstractNumId="13" w15:restartNumberingAfterBreak="0">
     <w:nsid w:val="461E3E26"/>
     <w:multiLevelType w:val="multilevel"/>
     <w:tmpl w:val="F732C33E"/>
@@ -5808,7 +6879,7 @@
       </w:rPr>
     </w:lvl>
   </w:abstractNum>
-  <w:abstractNum w:abstractNumId="10" w15:restartNumberingAfterBreak="0">
+  <w:abstractNum w:abstractNumId="14" w15:restartNumberingAfterBreak="0">
     <w:nsid w:val="4B460D4E"/>
     <w:multiLevelType w:val="hybridMultilevel"/>
     <w:tmpl w:val="F176FFFC"/>
@@ -5927,7 +6998,7 @@
       </w:rPr>
     </w:lvl>
   </w:abstractNum>
-  <w:abstractNum w:abstractNumId="11" w15:restartNumberingAfterBreak="0">
+  <w:abstractNum w:abstractNumId="15" w15:restartNumberingAfterBreak="0">
     <w:nsid w:val="51C6632E"/>
     <w:multiLevelType w:val="multilevel"/>
     <w:tmpl w:val="5F860EC0"/>
@@ -6076,7 +7147,7 @@
       </w:rPr>
     </w:lvl>
   </w:abstractNum>
-  <w:abstractNum w:abstractNumId="12" w15:restartNumberingAfterBreak="0">
+  <w:abstractNum w:abstractNumId="16" w15:restartNumberingAfterBreak="0">
     <w:nsid w:val="58C12BCE"/>
     <w:multiLevelType w:val="multilevel"/>
     <w:tmpl w:val="54362AFC"/>
@@ -6189,7 +7260,7 @@
       </w:pPr>
     </w:lvl>
   </w:abstractNum>
-  <w:abstractNum w:abstractNumId="13" w15:restartNumberingAfterBreak="0">
+  <w:abstractNum w:abstractNumId="17" w15:restartNumberingAfterBreak="0">
     <w:nsid w:val="5AA121CF"/>
     <w:multiLevelType w:val="hybridMultilevel"/>
     <w:tmpl w:val="801E8B90"/>
@@ -6302,7 +7373,7 @@
       </w:rPr>
     </w:lvl>
   </w:abstractNum>
-  <w:abstractNum w:abstractNumId="14" w15:restartNumberingAfterBreak="0">
+  <w:abstractNum w:abstractNumId="18" w15:restartNumberingAfterBreak="0">
     <w:nsid w:val="5F6A2377"/>
     <w:multiLevelType w:val="multilevel"/>
     <w:tmpl w:val="6F5EC60A"/>
@@ -6415,7 +7486,7 @@
       </w:pPr>
     </w:lvl>
   </w:abstractNum>
-  <w:abstractNum w:abstractNumId="15" w15:restartNumberingAfterBreak="0">
+  <w:abstractNum w:abstractNumId="19" w15:restartNumberingAfterBreak="0">
     <w:nsid w:val="68FB3A87"/>
     <w:multiLevelType w:val="hybridMultilevel"/>
     <w:tmpl w:val="34E8EEEE"/>
@@ -6528,7 +7599,7 @@
       </w:rPr>
     </w:lvl>
   </w:abstractNum>
-  <w:abstractNum w:abstractNumId="16" w15:restartNumberingAfterBreak="0">
+  <w:abstractNum w:abstractNumId="20" w15:restartNumberingAfterBreak="0">
     <w:nsid w:val="698F6CA7"/>
     <w:multiLevelType w:val="multilevel"/>
     <w:tmpl w:val="A1DCE8CA"/>
@@ -6677,7 +7748,7 @@
       </w:rPr>
     </w:lvl>
   </w:abstractNum>
-  <w:abstractNum w:abstractNumId="17" w15:restartNumberingAfterBreak="0">
+  <w:abstractNum w:abstractNumId="21" w15:restartNumberingAfterBreak="0">
     <w:nsid w:val="6DB3410E"/>
     <w:multiLevelType w:val="multilevel"/>
     <w:tmpl w:val="EC5AFCAC"/>
@@ -6826,7 +7897,7 @@
       </w:rPr>
     </w:lvl>
   </w:abstractNum>
-  <w:abstractNum w:abstractNumId="18" w15:restartNumberingAfterBreak="0">
+  <w:abstractNum w:abstractNumId="22" w15:restartNumberingAfterBreak="0">
     <w:nsid w:val="762C4577"/>
     <w:multiLevelType w:val="hybridMultilevel"/>
     <w:tmpl w:val="574203A2"/>
@@ -6940,61 +8011,73 @@
     </w:lvl>
   </w:abstractNum>
   <w:num w:numId="1" w16cid:durableId="1733233544">
+    <w:abstractNumId w:val="4"/>
+  </w:num>
+  <w:num w:numId="2" w16cid:durableId="616839644">
+    <w:abstractNumId w:val="17"/>
+  </w:num>
+  <w:num w:numId="3" w16cid:durableId="2039355559">
+    <w:abstractNumId w:val="22"/>
+  </w:num>
+  <w:num w:numId="4" w16cid:durableId="1868716406">
+    <w:abstractNumId w:val="14"/>
+  </w:num>
+  <w:num w:numId="5" w16cid:durableId="661087690">
+    <w:abstractNumId w:val="10"/>
+  </w:num>
+  <w:num w:numId="6" w16cid:durableId="324624186">
+    <w:abstractNumId w:val="1"/>
+  </w:num>
+  <w:num w:numId="7" w16cid:durableId="265699617">
+    <w:abstractNumId w:val="20"/>
+  </w:num>
+  <w:num w:numId="8" w16cid:durableId="637078836">
+    <w:abstractNumId w:val="6"/>
+  </w:num>
+  <w:num w:numId="9" w16cid:durableId="214465044">
+    <w:abstractNumId w:val="18"/>
+  </w:num>
+  <w:num w:numId="10" w16cid:durableId="1734935567">
+    <w:abstractNumId w:val="11"/>
+  </w:num>
+  <w:num w:numId="11" w16cid:durableId="1194541750">
+    <w:abstractNumId w:val="9"/>
+  </w:num>
+  <w:num w:numId="12" w16cid:durableId="2132703009">
+    <w:abstractNumId w:val="21"/>
+  </w:num>
+  <w:num w:numId="13" w16cid:durableId="1171144280">
+    <w:abstractNumId w:val="16"/>
+  </w:num>
+  <w:num w:numId="14" w16cid:durableId="1150488785">
     <w:abstractNumId w:val="2"/>
   </w:num>
-  <w:num w:numId="2" w16cid:durableId="616839644">
+  <w:num w:numId="15" w16cid:durableId="222915286">
+    <w:abstractNumId w:val="19"/>
+  </w:num>
+  <w:num w:numId="16" w16cid:durableId="1432705755">
+    <w:abstractNumId w:val="12"/>
+  </w:num>
+  <w:num w:numId="17" w16cid:durableId="827137759">
+    <w:abstractNumId w:val="15"/>
+  </w:num>
+  <w:num w:numId="18" w16cid:durableId="799422419">
+    <w:abstractNumId w:val="8"/>
+  </w:num>
+  <w:num w:numId="19" w16cid:durableId="1840342896">
     <w:abstractNumId w:val="13"/>
   </w:num>
-  <w:num w:numId="3" w16cid:durableId="2039355559">
-    <w:abstractNumId w:val="18"/>
+  <w:num w:numId="20" w16cid:durableId="183447027">
+    <w:abstractNumId w:val="7"/>
   </w:num>
-  <w:num w:numId="4" w16cid:durableId="1868716406">
-    <w:abstractNumId w:val="10"/>
+  <w:num w:numId="21" w16cid:durableId="741216713">
+    <w:abstractNumId w:val="5"/>
   </w:num>
-  <w:num w:numId="5" w16cid:durableId="661087690">
-    <w:abstractNumId w:val="6"/>
-  </w:num>
-  <w:num w:numId="6" w16cid:durableId="324624186">
+  <w:num w:numId="22" w16cid:durableId="255091594">
     <w:abstractNumId w:val="0"/>
   </w:num>
-  <w:num w:numId="7" w16cid:durableId="265699617">
-    <w:abstractNumId w:val="16"/>
-  </w:num>
-  <w:num w:numId="8" w16cid:durableId="637078836">
+  <w:num w:numId="23" w16cid:durableId="229271220">
     <w:abstractNumId w:val="3"/>
-  </w:num>
-  <w:num w:numId="9" w16cid:durableId="214465044">
-    <w:abstractNumId w:val="14"/>
-  </w:num>
-  <w:num w:numId="10" w16cid:durableId="1734935567">
-    <w:abstractNumId w:val="7"/>
-  </w:num>
-  <w:num w:numId="11" w16cid:durableId="1194541750">
-    <w:abstractNumId w:val="5"/>
-  </w:num>
-  <w:num w:numId="12" w16cid:durableId="2132703009">
-    <w:abstractNumId w:val="17"/>
-  </w:num>
-  <w:num w:numId="13" w16cid:durableId="1171144280">
-    <w:abstractNumId w:val="12"/>
-  </w:num>
-  <w:num w:numId="14" w16cid:durableId="1150488785">
-    <w:abstractNumId w:val="1"/>
-  </w:num>
-  <w:num w:numId="15" w16cid:durableId="222915286">
-    <w:abstractNumId w:val="15"/>
-  </w:num>
-  <w:num w:numId="16" w16cid:durableId="1432705755">
-    <w:abstractNumId w:val="8"/>
-  </w:num>
-  <w:num w:numId="17" w16cid:durableId="827137759">
-    <w:abstractNumId w:val="11"/>
-  </w:num>
-  <w:num w:numId="18" w16cid:durableId="799422419">
-    <w:abstractNumId w:val="4"/>
-  </w:num>
-  <w:num w:numId="19" w16cid:durableId="1840342896">
-    <w:abstractNumId w:val="9"/>
   </w:num>
 </w:numbering>
 </file>
@@ -7609,6 +8692,19 @@
       <w:color w:val="2F5496" w:themeColor="accent1" w:themeShade="BF"/>
     </w:rPr>
   </w:style>
+  <w:style w:type="paragraph" w:styleId="NormalWeb">
+    <w:name w:val="Normal (Web)"/>
+    <w:basedOn w:val="Normal"/>
+    <w:uiPriority w:val="99"/>
+    <w:semiHidden/>
+    <w:unhideWhenUsed/>
+    <w:rsid w:val="00E45C65"/>
+    <w:rPr>
+      <w:rFonts w:ascii="Times New Roman" w:hAnsi="Times New Roman" w:cs="Times New Roman"/>
+      <w:sz w:val="24"/>
+      <w:szCs w:val="24"/>
+    </w:rPr>
+  </w:style>
 </w:styles>
 </file>
 

</xml_diff>

<commit_message>
docs: Strength weight updated
</commit_message>
<xml_diff>
--- a/Nutrients/Weight Loss.docx
+++ b/Nutrients/Weight Loss.docx
@@ -3967,12 +3967,239 @@
     </w:p>
     <w:p>
       <w:pPr>
-        <w:jc w:val="both"/>
-        <w:rPr>
-          <w:sz w:val="24"/>
-          <w:szCs w:val="24"/>
-        </w:rPr>
-      </w:pPr>
+        <w:pStyle w:val="ListParagraph"/>
+        <w:numPr>
+          <w:ilvl w:val="0"/>
+          <w:numId w:val="29"/>
+        </w:numPr>
+        <w:shd w:val="clear" w:color="auto" w:fill="FFFFFF"/>
+        <w:spacing w:beforeAutospacing="1" w:after="0" w:afterAutospacing="1" w:line="360" w:lineRule="auto"/>
+        <w:textAlignment w:val="baseline"/>
+        <w:rPr>
+          <w:sz w:val="24"/>
+          <w:szCs w:val="24"/>
+        </w:rPr>
+      </w:pPr>
+      <w:r>
+        <w:rPr>
+          <w:b/>
+          <w:bCs/>
+          <w:sz w:val="24"/>
+          <w:szCs w:val="24"/>
+        </w:rPr>
+        <w:t>Burns extra calories</w:t>
+      </w:r>
+      <w:r>
+        <w:rPr>
+          <w:b/>
+          <w:bCs/>
+          <w:sz w:val="24"/>
+          <w:szCs w:val="24"/>
+        </w:rPr>
+        <w:t>:</w:t>
+      </w:r>
+      <w:r>
+        <w:rPr>
+          <w:sz w:val="24"/>
+          <w:szCs w:val="24"/>
+        </w:rPr>
+        <w:t xml:space="preserve"> for up to 72 hours after your workout—known as </w:t>
+      </w:r>
+      <w:hyperlink r:id="rId7" w:history="1">
+        <w:r>
+          <w:rPr>
+            <w:sz w:val="24"/>
+            <w:szCs w:val="24"/>
+          </w:rPr>
+          <w:t>afterburn</w:t>
+        </w:r>
+      </w:hyperlink>
+      <w:r>
+        <w:rPr>
+          <w:sz w:val="24"/>
+          <w:szCs w:val="24"/>
+        </w:rPr>
+        <w:t>.</w:t>
+      </w:r>
+      <w:r>
+        <w:rPr>
+          <w:sz w:val="24"/>
+          <w:szCs w:val="24"/>
+        </w:rPr>
+        <w:t xml:space="preserve"> </w:t>
+      </w:r>
+      <w:r>
+        <w:rPr>
+          <w:sz w:val="24"/>
+          <w:szCs w:val="24"/>
+        </w:rPr>
+        <w:t>This is especially true with </w:t>
+      </w:r>
+      <w:hyperlink r:id="rId8" w:history="1">
+        <w:r>
+          <w:rPr>
+            <w:sz w:val="24"/>
+            <w:szCs w:val="24"/>
+          </w:rPr>
+          <w:t>high-intensity strength training</w:t>
+        </w:r>
+      </w:hyperlink>
+      <w:r>
+        <w:rPr>
+          <w:sz w:val="24"/>
+          <w:szCs w:val="24"/>
+        </w:rPr>
+        <w:t>.</w:t>
+      </w:r>
+    </w:p>
+    <w:p>
+      <w:pPr>
+        <w:pStyle w:val="ListParagraph"/>
+        <w:numPr>
+          <w:ilvl w:val="0"/>
+          <w:numId w:val="30"/>
+        </w:numPr>
+        <w:shd w:val="clear" w:color="auto" w:fill="FFFFFF"/>
+        <w:spacing w:after="120" w:line="360" w:lineRule="auto"/>
+        <w:ind w:left="499" w:hanging="357"/>
+        <w:textAlignment w:val="baseline"/>
+        <w:rPr>
+          <w:sz w:val="24"/>
+          <w:szCs w:val="24"/>
+        </w:rPr>
+      </w:pPr>
+      <w:r>
+        <w:rPr>
+          <w:b/>
+          <w:bCs/>
+          <w:sz w:val="24"/>
+          <w:szCs w:val="24"/>
+        </w:rPr>
+        <w:t>Changes your </w:t>
+      </w:r>
+      <w:hyperlink r:id="rId9" w:history="1">
+        <w:r>
+          <w:rPr>
+            <w:b/>
+            <w:bCs/>
+            <w:sz w:val="24"/>
+            <w:szCs w:val="24"/>
+          </w:rPr>
+          <w:t>body composition</w:t>
+        </w:r>
+      </w:hyperlink>
+      <w:r>
+        <w:rPr>
+          <w:b/>
+          <w:bCs/>
+          <w:sz w:val="24"/>
+          <w:szCs w:val="24"/>
+        </w:rPr>
+        <w:t>,</w:t>
+      </w:r>
+      <w:r>
+        <w:rPr>
+          <w:sz w:val="24"/>
+          <w:szCs w:val="24"/>
+        </w:rPr>
+        <w:t xml:space="preserve"> helping shape your body and keep you healthy.</w:t>
+      </w:r>
+    </w:p>
+    <w:p>
+      <w:pPr>
+        <w:pStyle w:val="ListParagraph"/>
+        <w:numPr>
+          <w:ilvl w:val="0"/>
+          <w:numId w:val="30"/>
+        </w:numPr>
+        <w:shd w:val="clear" w:color="auto" w:fill="FFFFFF"/>
+        <w:spacing w:before="100" w:beforeAutospacing="1" w:after="100" w:afterAutospacing="1" w:line="360" w:lineRule="auto"/>
+        <w:textAlignment w:val="baseline"/>
+        <w:rPr>
+          <w:sz w:val="24"/>
+          <w:szCs w:val="24"/>
+        </w:rPr>
+      </w:pPr>
+      <w:r>
+        <w:rPr>
+          <w:b/>
+          <w:bCs/>
+          <w:sz w:val="24"/>
+          <w:szCs w:val="24"/>
+        </w:rPr>
+        <w:t>Improves coordination and balance</w:t>
+      </w:r>
+      <w:r>
+        <w:rPr>
+          <w:sz w:val="24"/>
+          <w:szCs w:val="24"/>
+        </w:rPr>
+        <w:t xml:space="preserve"> and may help prevent injuries.</w:t>
+      </w:r>
+    </w:p>
+    <w:p>
+      <w:pPr>
+        <w:pStyle w:val="ListParagraph"/>
+        <w:numPr>
+          <w:ilvl w:val="0"/>
+          <w:numId w:val="30"/>
+        </w:numPr>
+        <w:shd w:val="clear" w:color="auto" w:fill="FFFFFF"/>
+        <w:spacing w:before="100" w:beforeAutospacing="1" w:after="100" w:afterAutospacing="1" w:line="360" w:lineRule="auto"/>
+        <w:textAlignment w:val="baseline"/>
+        <w:rPr>
+          <w:sz w:val="24"/>
+          <w:szCs w:val="24"/>
+        </w:rPr>
+      </w:pPr>
+      <w:r>
+        <w:rPr>
+          <w:b/>
+          <w:bCs/>
+          <w:sz w:val="24"/>
+          <w:szCs w:val="24"/>
+        </w:rPr>
+        <w:t>Prevents the loss of lean body mass</w:t>
+      </w:r>
+      <w:r>
+        <w:rPr>
+          <w:sz w:val="24"/>
+          <w:szCs w:val="24"/>
+        </w:rPr>
+        <w:t> from weight loss and/or aging. Weight gain often happens as your metabolism slows over time.</w:t>
+      </w:r>
+    </w:p>
+    <w:p>
+      <w:pPr>
+        <w:pStyle w:val="ListParagraph"/>
+        <w:numPr>
+          <w:ilvl w:val="0"/>
+          <w:numId w:val="30"/>
+        </w:numPr>
+        <w:shd w:val="clear" w:color="auto" w:fill="FFFFFF"/>
+        <w:spacing w:before="100" w:beforeAutospacing="1" w:after="100" w:afterAutospacing="1" w:line="360" w:lineRule="auto"/>
+        <w:textAlignment w:val="baseline"/>
+        <w:rPr>
+          <w:sz w:val="24"/>
+          <w:szCs w:val="24"/>
+        </w:rPr>
+      </w:pPr>
+      <w:r>
+        <w:rPr>
+          <w:b/>
+          <w:bCs/>
+          <w:sz w:val="24"/>
+          <w:szCs w:val="24"/>
+        </w:rPr>
+        <w:t>Strengthens bones and connective tissue</w:t>
+      </w:r>
+      <w:r>
+        <w:rPr>
+          <w:sz w:val="24"/>
+          <w:szCs w:val="24"/>
+        </w:rPr>
+        <w:t xml:space="preserve"> along with muscles.</w:t>
+      </w:r>
     </w:p>
     <w:p>
       <w:pPr>
@@ -4008,17 +4235,33 @@
     </w:p>
     <w:p>
       <w:pPr>
-        <w:jc w:val="both"/>
-        <w:rPr>
-          <w:sz w:val="24"/>
-          <w:szCs w:val="24"/>
-        </w:rPr>
-      </w:pPr>
-      <w:r>
-        <w:rPr>
-          <w:sz w:val="24"/>
-          <w:szCs w:val="24"/>
-        </w:rPr>
+        <w:rPr>
+          <w:sz w:val="24"/>
+          <w:szCs w:val="24"/>
+        </w:rPr>
+      </w:pPr>
+      <w:r>
+        <w:rPr>
+          <w:sz w:val="24"/>
+          <w:szCs w:val="24"/>
+        </w:rPr>
+        <w:br w:type="page"/>
+      </w:r>
+    </w:p>
+    <w:p>
+      <w:pPr>
+        <w:jc w:val="both"/>
+        <w:rPr>
+          <w:sz w:val="24"/>
+          <w:szCs w:val="24"/>
+        </w:rPr>
+      </w:pPr>
+      <w:r>
+        <w:rPr>
+          <w:sz w:val="24"/>
+          <w:szCs w:val="24"/>
+        </w:rPr>
+        <w:lastRenderedPageBreak/>
         <w:t xml:space="preserve">You may ask, which is better to lift a not too heavy weight for longer duration or perhaps lift a much heavier weight at a shorter duration. Below describe the </w:t>
       </w:r>
       <w:r>
@@ -4162,7 +4405,6 @@
           <w:sz w:val="28"/>
           <w:szCs w:val="28"/>
         </w:rPr>
-        <w:lastRenderedPageBreak/>
         <w:t>Lifting Heavier Weights for Shorter Duration</w:t>
       </w:r>
     </w:p>
@@ -4526,6 +4768,7 @@
           <w:sz w:val="24"/>
           <w:szCs w:val="24"/>
         </w:rPr>
+        <w:lastRenderedPageBreak/>
         <w:t>Sustainability</w:t>
       </w:r>
       <w:r>
@@ -4669,7 +4912,6 @@
           <w:sz w:val="28"/>
           <w:szCs w:val="28"/>
         </w:rPr>
-        <w:lastRenderedPageBreak/>
         <w:t>Which to Focus On?</w:t>
       </w:r>
     </w:p>
@@ -5605,6 +5847,146 @@
     </w:lvl>
   </w:abstractNum>
   <w:abstractNum w:abstractNumId="5" w15:restartNumberingAfterBreak="0">
+    <w:nsid w:val="0A533749"/>
+    <w:multiLevelType w:val="multilevel"/>
+    <w:tmpl w:val="4288C69C"/>
+    <w:lvl w:ilvl="0">
+      <w:start w:val="1"/>
+      <w:numFmt w:val="bullet"/>
+      <w:lvlText w:val=""/>
+      <w:lvlJc w:val="left"/>
+      <w:pPr>
+        <w:tabs>
+          <w:tab w:val="num" w:pos="502"/>
+        </w:tabs>
+        <w:ind w:left="502" w:hanging="360"/>
+      </w:pPr>
+      <w:rPr>
+        <w:rFonts w:ascii="Symbol" w:hAnsi="Symbol" w:hint="default"/>
+      </w:rPr>
+    </w:lvl>
+    <w:lvl w:ilvl="1">
+      <w:start w:val="1"/>
+      <w:numFmt w:val="decimal"/>
+      <w:lvlText w:val="%2."/>
+      <w:lvlJc w:val="left"/>
+      <w:pPr>
+        <w:tabs>
+          <w:tab w:val="num" w:pos="1222"/>
+        </w:tabs>
+        <w:ind w:left="1222" w:hanging="360"/>
+      </w:pPr>
+      <w:rPr>
+        <w:rFonts w:hint="default"/>
+      </w:rPr>
+    </w:lvl>
+    <w:lvl w:ilvl="2">
+      <w:start w:val="1"/>
+      <w:numFmt w:val="decimal"/>
+      <w:lvlText w:val="%3."/>
+      <w:lvlJc w:val="left"/>
+      <w:pPr>
+        <w:tabs>
+          <w:tab w:val="num" w:pos="1942"/>
+        </w:tabs>
+        <w:ind w:left="1942" w:hanging="360"/>
+      </w:pPr>
+      <w:rPr>
+        <w:rFonts w:hint="default"/>
+      </w:rPr>
+    </w:lvl>
+    <w:lvl w:ilvl="3">
+      <w:start w:val="1"/>
+      <w:numFmt w:val="decimal"/>
+      <w:lvlText w:val="%4."/>
+      <w:lvlJc w:val="left"/>
+      <w:pPr>
+        <w:tabs>
+          <w:tab w:val="num" w:pos="2662"/>
+        </w:tabs>
+        <w:ind w:left="2662" w:hanging="360"/>
+      </w:pPr>
+      <w:rPr>
+        <w:rFonts w:hint="default"/>
+      </w:rPr>
+    </w:lvl>
+    <w:lvl w:ilvl="4">
+      <w:start w:val="1"/>
+      <w:numFmt w:val="decimal"/>
+      <w:lvlText w:val="%5."/>
+      <w:lvlJc w:val="left"/>
+      <w:pPr>
+        <w:tabs>
+          <w:tab w:val="num" w:pos="3382"/>
+        </w:tabs>
+        <w:ind w:left="3382" w:hanging="360"/>
+      </w:pPr>
+      <w:rPr>
+        <w:rFonts w:hint="default"/>
+      </w:rPr>
+    </w:lvl>
+    <w:lvl w:ilvl="5">
+      <w:start w:val="1"/>
+      <w:numFmt w:val="decimal"/>
+      <w:lvlText w:val="%6."/>
+      <w:lvlJc w:val="left"/>
+      <w:pPr>
+        <w:tabs>
+          <w:tab w:val="num" w:pos="4102"/>
+        </w:tabs>
+        <w:ind w:left="4102" w:hanging="360"/>
+      </w:pPr>
+      <w:rPr>
+        <w:rFonts w:hint="default"/>
+      </w:rPr>
+    </w:lvl>
+    <w:lvl w:ilvl="6">
+      <w:start w:val="1"/>
+      <w:numFmt w:val="decimal"/>
+      <w:lvlText w:val="%7."/>
+      <w:lvlJc w:val="left"/>
+      <w:pPr>
+        <w:tabs>
+          <w:tab w:val="num" w:pos="4822"/>
+        </w:tabs>
+        <w:ind w:left="4822" w:hanging="360"/>
+      </w:pPr>
+      <w:rPr>
+        <w:rFonts w:hint="default"/>
+      </w:rPr>
+    </w:lvl>
+    <w:lvl w:ilvl="7">
+      <w:start w:val="1"/>
+      <w:numFmt w:val="decimal"/>
+      <w:lvlText w:val="%8."/>
+      <w:lvlJc w:val="left"/>
+      <w:pPr>
+        <w:tabs>
+          <w:tab w:val="num" w:pos="5542"/>
+        </w:tabs>
+        <w:ind w:left="5542" w:hanging="360"/>
+      </w:pPr>
+      <w:rPr>
+        <w:rFonts w:hint="default"/>
+      </w:rPr>
+    </w:lvl>
+    <w:lvl w:ilvl="8">
+      <w:start w:val="1"/>
+      <w:numFmt w:val="decimal"/>
+      <w:lvlText w:val="%9."/>
+      <w:lvlJc w:val="left"/>
+      <w:pPr>
+        <w:tabs>
+          <w:tab w:val="num" w:pos="6262"/>
+        </w:tabs>
+        <w:ind w:left="6262" w:hanging="360"/>
+      </w:pPr>
+      <w:rPr>
+        <w:rFonts w:hint="default"/>
+      </w:rPr>
+    </w:lvl>
+  </w:abstractNum>
+  <w:abstractNum w:abstractNumId="6" w15:restartNumberingAfterBreak="0">
     <w:nsid w:val="0DC27808"/>
     <w:multiLevelType w:val="multilevel"/>
     <w:tmpl w:val="1BB6722A"/>
@@ -5753,7 +6135,156 @@
       </w:rPr>
     </w:lvl>
   </w:abstractNum>
-  <w:abstractNum w:abstractNumId="6" w15:restartNumberingAfterBreak="0">
+  <w:abstractNum w:abstractNumId="7" w15:restartNumberingAfterBreak="0">
+    <w:nsid w:val="0F8220D5"/>
+    <w:multiLevelType w:val="multilevel"/>
+    <w:tmpl w:val="7F2A15DA"/>
+    <w:lvl w:ilvl="0">
+      <w:start w:val="1"/>
+      <w:numFmt w:val="bullet"/>
+      <w:lvlText w:val=""/>
+      <w:lvlJc w:val="left"/>
+      <w:pPr>
+        <w:tabs>
+          <w:tab w:val="num" w:pos="720"/>
+        </w:tabs>
+        <w:ind w:left="720" w:hanging="360"/>
+      </w:pPr>
+      <w:rPr>
+        <w:rFonts w:ascii="Symbol" w:hAnsi="Symbol" w:hint="default"/>
+        <w:sz w:val="20"/>
+      </w:rPr>
+    </w:lvl>
+    <w:lvl w:ilvl="1" w:tentative="1">
+      <w:start w:val="1"/>
+      <w:numFmt w:val="bullet"/>
+      <w:lvlText w:val="o"/>
+      <w:lvlJc w:val="left"/>
+      <w:pPr>
+        <w:tabs>
+          <w:tab w:val="num" w:pos="1440"/>
+        </w:tabs>
+        <w:ind w:left="1440" w:hanging="360"/>
+      </w:pPr>
+      <w:rPr>
+        <w:rFonts w:ascii="Courier New" w:hAnsi="Courier New" w:hint="default"/>
+        <w:sz w:val="20"/>
+      </w:rPr>
+    </w:lvl>
+    <w:lvl w:ilvl="2" w:tentative="1">
+      <w:start w:val="1"/>
+      <w:numFmt w:val="bullet"/>
+      <w:lvlText w:val=""/>
+      <w:lvlJc w:val="left"/>
+      <w:pPr>
+        <w:tabs>
+          <w:tab w:val="num" w:pos="2160"/>
+        </w:tabs>
+        <w:ind w:left="2160" w:hanging="360"/>
+      </w:pPr>
+      <w:rPr>
+        <w:rFonts w:ascii="Wingdings" w:hAnsi="Wingdings" w:hint="default"/>
+        <w:sz w:val="20"/>
+      </w:rPr>
+    </w:lvl>
+    <w:lvl w:ilvl="3" w:tentative="1">
+      <w:start w:val="1"/>
+      <w:numFmt w:val="bullet"/>
+      <w:lvlText w:val=""/>
+      <w:lvlJc w:val="left"/>
+      <w:pPr>
+        <w:tabs>
+          <w:tab w:val="num" w:pos="2880"/>
+        </w:tabs>
+        <w:ind w:left="2880" w:hanging="360"/>
+      </w:pPr>
+      <w:rPr>
+        <w:rFonts w:ascii="Wingdings" w:hAnsi="Wingdings" w:hint="default"/>
+        <w:sz w:val="20"/>
+      </w:rPr>
+    </w:lvl>
+    <w:lvl w:ilvl="4" w:tentative="1">
+      <w:start w:val="1"/>
+      <w:numFmt w:val="bullet"/>
+      <w:lvlText w:val=""/>
+      <w:lvlJc w:val="left"/>
+      <w:pPr>
+        <w:tabs>
+          <w:tab w:val="num" w:pos="3600"/>
+        </w:tabs>
+        <w:ind w:left="3600" w:hanging="360"/>
+      </w:pPr>
+      <w:rPr>
+        <w:rFonts w:ascii="Wingdings" w:hAnsi="Wingdings" w:hint="default"/>
+        <w:sz w:val="20"/>
+      </w:rPr>
+    </w:lvl>
+    <w:lvl w:ilvl="5" w:tentative="1">
+      <w:start w:val="1"/>
+      <w:numFmt w:val="bullet"/>
+      <w:lvlText w:val=""/>
+      <w:lvlJc w:val="left"/>
+      <w:pPr>
+        <w:tabs>
+          <w:tab w:val="num" w:pos="4320"/>
+        </w:tabs>
+        <w:ind w:left="4320" w:hanging="360"/>
+      </w:pPr>
+      <w:rPr>
+        <w:rFonts w:ascii="Wingdings" w:hAnsi="Wingdings" w:hint="default"/>
+        <w:sz w:val="20"/>
+      </w:rPr>
+    </w:lvl>
+    <w:lvl w:ilvl="6" w:tentative="1">
+      <w:start w:val="1"/>
+      <w:numFmt w:val="bullet"/>
+      <w:lvlText w:val=""/>
+      <w:lvlJc w:val="left"/>
+      <w:pPr>
+        <w:tabs>
+          <w:tab w:val="num" w:pos="5040"/>
+        </w:tabs>
+        <w:ind w:left="5040" w:hanging="360"/>
+      </w:pPr>
+      <w:rPr>
+        <w:rFonts w:ascii="Wingdings" w:hAnsi="Wingdings" w:hint="default"/>
+        <w:sz w:val="20"/>
+      </w:rPr>
+    </w:lvl>
+    <w:lvl w:ilvl="7" w:tentative="1">
+      <w:start w:val="1"/>
+      <w:numFmt w:val="bullet"/>
+      <w:lvlText w:val=""/>
+      <w:lvlJc w:val="left"/>
+      <w:pPr>
+        <w:tabs>
+          <w:tab w:val="num" w:pos="5760"/>
+        </w:tabs>
+        <w:ind w:left="5760" w:hanging="360"/>
+      </w:pPr>
+      <w:rPr>
+        <w:rFonts w:ascii="Wingdings" w:hAnsi="Wingdings" w:hint="default"/>
+        <w:sz w:val="20"/>
+      </w:rPr>
+    </w:lvl>
+    <w:lvl w:ilvl="8" w:tentative="1">
+      <w:start w:val="1"/>
+      <w:numFmt w:val="bullet"/>
+      <w:lvlText w:val=""/>
+      <w:lvlJc w:val="left"/>
+      <w:pPr>
+        <w:tabs>
+          <w:tab w:val="num" w:pos="6480"/>
+        </w:tabs>
+        <w:ind w:left="6480" w:hanging="360"/>
+      </w:pPr>
+      <w:rPr>
+        <w:rFonts w:ascii="Wingdings" w:hAnsi="Wingdings" w:hint="default"/>
+        <w:sz w:val="20"/>
+      </w:rPr>
+    </w:lvl>
+  </w:abstractNum>
+  <w:abstractNum w:abstractNumId="8" w15:restartNumberingAfterBreak="0">
     <w:nsid w:val="116D3FBA"/>
     <w:multiLevelType w:val="multilevel"/>
     <w:tmpl w:val="06F2D440"/>
@@ -5902,7 +6433,7 @@
       </w:rPr>
     </w:lvl>
   </w:abstractNum>
-  <w:abstractNum w:abstractNumId="7" w15:restartNumberingAfterBreak="0">
+  <w:abstractNum w:abstractNumId="9" w15:restartNumberingAfterBreak="0">
     <w:nsid w:val="12B6105B"/>
     <w:multiLevelType w:val="multilevel"/>
     <w:tmpl w:val="6590D0C0"/>
@@ -6051,7 +6582,7 @@
       </w:rPr>
     </w:lvl>
   </w:abstractNum>
-  <w:abstractNum w:abstractNumId="8" w15:restartNumberingAfterBreak="0">
+  <w:abstractNum w:abstractNumId="10" w15:restartNumberingAfterBreak="0">
     <w:nsid w:val="15953A16"/>
     <w:multiLevelType w:val="multilevel"/>
     <w:tmpl w:val="51D6134A"/>
@@ -6200,7 +6731,156 @@
       </w:rPr>
     </w:lvl>
   </w:abstractNum>
-  <w:abstractNum w:abstractNumId="9" w15:restartNumberingAfterBreak="0">
+  <w:abstractNum w:abstractNumId="11" w15:restartNumberingAfterBreak="0">
+    <w:nsid w:val="15A916CF"/>
+    <w:multiLevelType w:val="multilevel"/>
+    <w:tmpl w:val="50983FEC"/>
+    <w:lvl w:ilvl="0">
+      <w:start w:val="1"/>
+      <w:numFmt w:val="bullet"/>
+      <w:lvlText w:val=""/>
+      <w:lvlJc w:val="left"/>
+      <w:pPr>
+        <w:tabs>
+          <w:tab w:val="num" w:pos="720"/>
+        </w:tabs>
+        <w:ind w:left="720" w:hanging="360"/>
+      </w:pPr>
+      <w:rPr>
+        <w:rFonts w:ascii="Symbol" w:hAnsi="Symbol" w:hint="default"/>
+        <w:sz w:val="20"/>
+      </w:rPr>
+    </w:lvl>
+    <w:lvl w:ilvl="1" w:tentative="1">
+      <w:start w:val="1"/>
+      <w:numFmt w:val="bullet"/>
+      <w:lvlText w:val="o"/>
+      <w:lvlJc w:val="left"/>
+      <w:pPr>
+        <w:tabs>
+          <w:tab w:val="num" w:pos="1440"/>
+        </w:tabs>
+        <w:ind w:left="1440" w:hanging="360"/>
+      </w:pPr>
+      <w:rPr>
+        <w:rFonts w:ascii="Courier New" w:hAnsi="Courier New" w:hint="default"/>
+        <w:sz w:val="20"/>
+      </w:rPr>
+    </w:lvl>
+    <w:lvl w:ilvl="2" w:tentative="1">
+      <w:start w:val="1"/>
+      <w:numFmt w:val="bullet"/>
+      <w:lvlText w:val=""/>
+      <w:lvlJc w:val="left"/>
+      <w:pPr>
+        <w:tabs>
+          <w:tab w:val="num" w:pos="2160"/>
+        </w:tabs>
+        <w:ind w:left="2160" w:hanging="360"/>
+      </w:pPr>
+      <w:rPr>
+        <w:rFonts w:ascii="Wingdings" w:hAnsi="Wingdings" w:hint="default"/>
+        <w:sz w:val="20"/>
+      </w:rPr>
+    </w:lvl>
+    <w:lvl w:ilvl="3" w:tentative="1">
+      <w:start w:val="1"/>
+      <w:numFmt w:val="bullet"/>
+      <w:lvlText w:val=""/>
+      <w:lvlJc w:val="left"/>
+      <w:pPr>
+        <w:tabs>
+          <w:tab w:val="num" w:pos="2880"/>
+        </w:tabs>
+        <w:ind w:left="2880" w:hanging="360"/>
+      </w:pPr>
+      <w:rPr>
+        <w:rFonts w:ascii="Wingdings" w:hAnsi="Wingdings" w:hint="default"/>
+        <w:sz w:val="20"/>
+      </w:rPr>
+    </w:lvl>
+    <w:lvl w:ilvl="4" w:tentative="1">
+      <w:start w:val="1"/>
+      <w:numFmt w:val="bullet"/>
+      <w:lvlText w:val=""/>
+      <w:lvlJc w:val="left"/>
+      <w:pPr>
+        <w:tabs>
+          <w:tab w:val="num" w:pos="3600"/>
+        </w:tabs>
+        <w:ind w:left="3600" w:hanging="360"/>
+      </w:pPr>
+      <w:rPr>
+        <w:rFonts w:ascii="Wingdings" w:hAnsi="Wingdings" w:hint="default"/>
+        <w:sz w:val="20"/>
+      </w:rPr>
+    </w:lvl>
+    <w:lvl w:ilvl="5" w:tentative="1">
+      <w:start w:val="1"/>
+      <w:numFmt w:val="bullet"/>
+      <w:lvlText w:val=""/>
+      <w:lvlJc w:val="left"/>
+      <w:pPr>
+        <w:tabs>
+          <w:tab w:val="num" w:pos="4320"/>
+        </w:tabs>
+        <w:ind w:left="4320" w:hanging="360"/>
+      </w:pPr>
+      <w:rPr>
+        <w:rFonts w:ascii="Wingdings" w:hAnsi="Wingdings" w:hint="default"/>
+        <w:sz w:val="20"/>
+      </w:rPr>
+    </w:lvl>
+    <w:lvl w:ilvl="6" w:tentative="1">
+      <w:start w:val="1"/>
+      <w:numFmt w:val="bullet"/>
+      <w:lvlText w:val=""/>
+      <w:lvlJc w:val="left"/>
+      <w:pPr>
+        <w:tabs>
+          <w:tab w:val="num" w:pos="5040"/>
+        </w:tabs>
+        <w:ind w:left="5040" w:hanging="360"/>
+      </w:pPr>
+      <w:rPr>
+        <w:rFonts w:ascii="Wingdings" w:hAnsi="Wingdings" w:hint="default"/>
+        <w:sz w:val="20"/>
+      </w:rPr>
+    </w:lvl>
+    <w:lvl w:ilvl="7" w:tentative="1">
+      <w:start w:val="1"/>
+      <w:numFmt w:val="bullet"/>
+      <w:lvlText w:val=""/>
+      <w:lvlJc w:val="left"/>
+      <w:pPr>
+        <w:tabs>
+          <w:tab w:val="num" w:pos="5760"/>
+        </w:tabs>
+        <w:ind w:left="5760" w:hanging="360"/>
+      </w:pPr>
+      <w:rPr>
+        <w:rFonts w:ascii="Wingdings" w:hAnsi="Wingdings" w:hint="default"/>
+        <w:sz w:val="20"/>
+      </w:rPr>
+    </w:lvl>
+    <w:lvl w:ilvl="8" w:tentative="1">
+      <w:start w:val="1"/>
+      <w:numFmt w:val="bullet"/>
+      <w:lvlText w:val=""/>
+      <w:lvlJc w:val="left"/>
+      <w:pPr>
+        <w:tabs>
+          <w:tab w:val="num" w:pos="6480"/>
+        </w:tabs>
+        <w:ind w:left="6480" w:hanging="360"/>
+      </w:pPr>
+      <w:rPr>
+        <w:rFonts w:ascii="Wingdings" w:hAnsi="Wingdings" w:hint="default"/>
+        <w:sz w:val="20"/>
+      </w:rPr>
+    </w:lvl>
+  </w:abstractNum>
+  <w:abstractNum w:abstractNumId="12" w15:restartNumberingAfterBreak="0">
     <w:nsid w:val="1F245870"/>
     <w:multiLevelType w:val="multilevel"/>
     <w:tmpl w:val="017C5984"/>
@@ -6349,7 +7029,7 @@
       </w:rPr>
     </w:lvl>
   </w:abstractNum>
-  <w:abstractNum w:abstractNumId="10" w15:restartNumberingAfterBreak="0">
+  <w:abstractNum w:abstractNumId="13" w15:restartNumberingAfterBreak="0">
     <w:nsid w:val="23A80FEB"/>
     <w:multiLevelType w:val="multilevel"/>
     <w:tmpl w:val="A1DCE8CA"/>
@@ -6498,7 +7178,7 @@
       </w:rPr>
     </w:lvl>
   </w:abstractNum>
-  <w:abstractNum w:abstractNumId="11" w15:restartNumberingAfterBreak="0">
+  <w:abstractNum w:abstractNumId="14" w15:restartNumberingAfterBreak="0">
     <w:nsid w:val="2977066E"/>
     <w:multiLevelType w:val="multilevel"/>
     <w:tmpl w:val="D9342C68"/>
@@ -6614,10 +7294,10 @@
       </w:pPr>
     </w:lvl>
   </w:abstractNum>
-  <w:abstractNum w:abstractNumId="12" w15:restartNumberingAfterBreak="0">
+  <w:abstractNum w:abstractNumId="15" w15:restartNumberingAfterBreak="0">
     <w:nsid w:val="2C003FDA"/>
     <w:multiLevelType w:val="multilevel"/>
-    <w:tmpl w:val="BDDC4282"/>
+    <w:tmpl w:val="4288C69C"/>
     <w:lvl w:ilvl="0">
       <w:start w:val="1"/>
       <w:numFmt w:val="bullet"/>
@@ -6633,7 +7313,7 @@
         <w:rFonts w:ascii="Symbol" w:hAnsi="Symbol" w:hint="default"/>
       </w:rPr>
     </w:lvl>
-    <w:lvl w:ilvl="1" w:tentative="1">
+    <w:lvl w:ilvl="1">
       <w:start w:val="1"/>
       <w:numFmt w:val="decimal"/>
       <w:lvlText w:val="%2."/>
@@ -6644,8 +7324,11 @@
         </w:tabs>
         <w:ind w:left="1222" w:hanging="360"/>
       </w:pPr>
-    </w:lvl>
-    <w:lvl w:ilvl="2" w:tentative="1">
+      <w:rPr>
+        <w:rFonts w:hint="default"/>
+      </w:rPr>
+    </w:lvl>
+    <w:lvl w:ilvl="2">
       <w:start w:val="1"/>
       <w:numFmt w:val="decimal"/>
       <w:lvlText w:val="%3."/>
@@ -6656,8 +7339,11 @@
         </w:tabs>
         <w:ind w:left="1942" w:hanging="360"/>
       </w:pPr>
-    </w:lvl>
-    <w:lvl w:ilvl="3" w:tentative="1">
+      <w:rPr>
+        <w:rFonts w:hint="default"/>
+      </w:rPr>
+    </w:lvl>
+    <w:lvl w:ilvl="3">
       <w:start w:val="1"/>
       <w:numFmt w:val="decimal"/>
       <w:lvlText w:val="%4."/>
@@ -6668,8 +7354,11 @@
         </w:tabs>
         <w:ind w:left="2662" w:hanging="360"/>
       </w:pPr>
-    </w:lvl>
-    <w:lvl w:ilvl="4" w:tentative="1">
+      <w:rPr>
+        <w:rFonts w:hint="default"/>
+      </w:rPr>
+    </w:lvl>
+    <w:lvl w:ilvl="4">
       <w:start w:val="1"/>
       <w:numFmt w:val="decimal"/>
       <w:lvlText w:val="%5."/>
@@ -6680,8 +7369,11 @@
         </w:tabs>
         <w:ind w:left="3382" w:hanging="360"/>
       </w:pPr>
-    </w:lvl>
-    <w:lvl w:ilvl="5" w:tentative="1">
+      <w:rPr>
+        <w:rFonts w:hint="default"/>
+      </w:rPr>
+    </w:lvl>
+    <w:lvl w:ilvl="5">
       <w:start w:val="1"/>
       <w:numFmt w:val="decimal"/>
       <w:lvlText w:val="%6."/>
@@ -6692,8 +7384,11 @@
         </w:tabs>
         <w:ind w:left="4102" w:hanging="360"/>
       </w:pPr>
-    </w:lvl>
-    <w:lvl w:ilvl="6" w:tentative="1">
+      <w:rPr>
+        <w:rFonts w:hint="default"/>
+      </w:rPr>
+    </w:lvl>
+    <w:lvl w:ilvl="6">
       <w:start w:val="1"/>
       <w:numFmt w:val="decimal"/>
       <w:lvlText w:val="%7."/>
@@ -6704,8 +7399,11 @@
         </w:tabs>
         <w:ind w:left="4822" w:hanging="360"/>
       </w:pPr>
-    </w:lvl>
-    <w:lvl w:ilvl="7" w:tentative="1">
+      <w:rPr>
+        <w:rFonts w:hint="default"/>
+      </w:rPr>
+    </w:lvl>
+    <w:lvl w:ilvl="7">
       <w:start w:val="1"/>
       <w:numFmt w:val="decimal"/>
       <w:lvlText w:val="%8."/>
@@ -6716,8 +7414,11 @@
         </w:tabs>
         <w:ind w:left="5542" w:hanging="360"/>
       </w:pPr>
-    </w:lvl>
-    <w:lvl w:ilvl="8" w:tentative="1">
+      <w:rPr>
+        <w:rFonts w:hint="default"/>
+      </w:rPr>
+    </w:lvl>
+    <w:lvl w:ilvl="8">
       <w:start w:val="1"/>
       <w:numFmt w:val="decimal"/>
       <w:lvlText w:val="%9."/>
@@ -6728,9 +7429,152 @@
         </w:tabs>
         <w:ind w:left="6262" w:hanging="360"/>
       </w:pPr>
+      <w:rPr>
+        <w:rFonts w:hint="default"/>
+      </w:rPr>
     </w:lvl>
   </w:abstractNum>
-  <w:abstractNum w:abstractNumId="13" w15:restartNumberingAfterBreak="0">
+  <w:abstractNum w:abstractNumId="16" w15:restartNumberingAfterBreak="0">
+    <w:nsid w:val="38F54988"/>
+    <w:multiLevelType w:val="multilevel"/>
+    <w:tmpl w:val="4288C69C"/>
+    <w:lvl w:ilvl="0">
+      <w:start w:val="1"/>
+      <w:numFmt w:val="bullet"/>
+      <w:lvlText w:val=""/>
+      <w:lvlJc w:val="left"/>
+      <w:pPr>
+        <w:tabs>
+          <w:tab w:val="num" w:pos="502"/>
+        </w:tabs>
+        <w:ind w:left="502" w:hanging="360"/>
+      </w:pPr>
+      <w:rPr>
+        <w:rFonts w:ascii="Symbol" w:hAnsi="Symbol" w:hint="default"/>
+      </w:rPr>
+    </w:lvl>
+    <w:lvl w:ilvl="1">
+      <w:start w:val="1"/>
+      <w:numFmt w:val="decimal"/>
+      <w:lvlText w:val="%2."/>
+      <w:lvlJc w:val="left"/>
+      <w:pPr>
+        <w:tabs>
+          <w:tab w:val="num" w:pos="1222"/>
+        </w:tabs>
+        <w:ind w:left="1222" w:hanging="360"/>
+      </w:pPr>
+      <w:rPr>
+        <w:rFonts w:hint="default"/>
+      </w:rPr>
+    </w:lvl>
+    <w:lvl w:ilvl="2">
+      <w:start w:val="1"/>
+      <w:numFmt w:val="decimal"/>
+      <w:lvlText w:val="%3."/>
+      <w:lvlJc w:val="left"/>
+      <w:pPr>
+        <w:tabs>
+          <w:tab w:val="num" w:pos="1942"/>
+        </w:tabs>
+        <w:ind w:left="1942" w:hanging="360"/>
+      </w:pPr>
+      <w:rPr>
+        <w:rFonts w:hint="default"/>
+      </w:rPr>
+    </w:lvl>
+    <w:lvl w:ilvl="3">
+      <w:start w:val="1"/>
+      <w:numFmt w:val="decimal"/>
+      <w:lvlText w:val="%4."/>
+      <w:lvlJc w:val="left"/>
+      <w:pPr>
+        <w:tabs>
+          <w:tab w:val="num" w:pos="2662"/>
+        </w:tabs>
+        <w:ind w:left="2662" w:hanging="360"/>
+      </w:pPr>
+      <w:rPr>
+        <w:rFonts w:hint="default"/>
+      </w:rPr>
+    </w:lvl>
+    <w:lvl w:ilvl="4">
+      <w:start w:val="1"/>
+      <w:numFmt w:val="decimal"/>
+      <w:lvlText w:val="%5."/>
+      <w:lvlJc w:val="left"/>
+      <w:pPr>
+        <w:tabs>
+          <w:tab w:val="num" w:pos="3382"/>
+        </w:tabs>
+        <w:ind w:left="3382" w:hanging="360"/>
+      </w:pPr>
+      <w:rPr>
+        <w:rFonts w:hint="default"/>
+      </w:rPr>
+    </w:lvl>
+    <w:lvl w:ilvl="5">
+      <w:start w:val="1"/>
+      <w:numFmt w:val="decimal"/>
+      <w:lvlText w:val="%6."/>
+      <w:lvlJc w:val="left"/>
+      <w:pPr>
+        <w:tabs>
+          <w:tab w:val="num" w:pos="4102"/>
+        </w:tabs>
+        <w:ind w:left="4102" w:hanging="360"/>
+      </w:pPr>
+      <w:rPr>
+        <w:rFonts w:hint="default"/>
+      </w:rPr>
+    </w:lvl>
+    <w:lvl w:ilvl="6">
+      <w:start w:val="1"/>
+      <w:numFmt w:val="decimal"/>
+      <w:lvlText w:val="%7."/>
+      <w:lvlJc w:val="left"/>
+      <w:pPr>
+        <w:tabs>
+          <w:tab w:val="num" w:pos="4822"/>
+        </w:tabs>
+        <w:ind w:left="4822" w:hanging="360"/>
+      </w:pPr>
+      <w:rPr>
+        <w:rFonts w:hint="default"/>
+      </w:rPr>
+    </w:lvl>
+    <w:lvl w:ilvl="7">
+      <w:start w:val="1"/>
+      <w:numFmt w:val="decimal"/>
+      <w:lvlText w:val="%8."/>
+      <w:lvlJc w:val="left"/>
+      <w:pPr>
+        <w:tabs>
+          <w:tab w:val="num" w:pos="5542"/>
+        </w:tabs>
+        <w:ind w:left="5542" w:hanging="360"/>
+      </w:pPr>
+      <w:rPr>
+        <w:rFonts w:hint="default"/>
+      </w:rPr>
+    </w:lvl>
+    <w:lvl w:ilvl="8">
+      <w:start w:val="1"/>
+      <w:numFmt w:val="decimal"/>
+      <w:lvlText w:val="%9."/>
+      <w:lvlJc w:val="left"/>
+      <w:pPr>
+        <w:tabs>
+          <w:tab w:val="num" w:pos="6262"/>
+        </w:tabs>
+        <w:ind w:left="6262" w:hanging="360"/>
+      </w:pPr>
+      <w:rPr>
+        <w:rFonts w:hint="default"/>
+      </w:rPr>
+    </w:lvl>
+  </w:abstractNum>
+  <w:abstractNum w:abstractNumId="17" w15:restartNumberingAfterBreak="0">
     <w:nsid w:val="461E3E26"/>
     <w:multiLevelType w:val="multilevel"/>
     <w:tmpl w:val="F732C33E"/>
@@ -6879,7 +7723,156 @@
       </w:rPr>
     </w:lvl>
   </w:abstractNum>
-  <w:abstractNum w:abstractNumId="14" w15:restartNumberingAfterBreak="0">
+  <w:abstractNum w:abstractNumId="18" w15:restartNumberingAfterBreak="0">
+    <w:nsid w:val="47AE10F1"/>
+    <w:multiLevelType w:val="multilevel"/>
+    <w:tmpl w:val="53B473E4"/>
+    <w:lvl w:ilvl="0">
+      <w:start w:val="1"/>
+      <w:numFmt w:val="bullet"/>
+      <w:lvlText w:val=""/>
+      <w:lvlJc w:val="left"/>
+      <w:pPr>
+        <w:tabs>
+          <w:tab w:val="num" w:pos="720"/>
+        </w:tabs>
+        <w:ind w:left="720" w:hanging="360"/>
+      </w:pPr>
+      <w:rPr>
+        <w:rFonts w:ascii="Symbol" w:hAnsi="Symbol" w:hint="default"/>
+        <w:sz w:val="20"/>
+      </w:rPr>
+    </w:lvl>
+    <w:lvl w:ilvl="1" w:tentative="1">
+      <w:start w:val="1"/>
+      <w:numFmt w:val="bullet"/>
+      <w:lvlText w:val="o"/>
+      <w:lvlJc w:val="left"/>
+      <w:pPr>
+        <w:tabs>
+          <w:tab w:val="num" w:pos="1440"/>
+        </w:tabs>
+        <w:ind w:left="1440" w:hanging="360"/>
+      </w:pPr>
+      <w:rPr>
+        <w:rFonts w:ascii="Courier New" w:hAnsi="Courier New" w:hint="default"/>
+        <w:sz w:val="20"/>
+      </w:rPr>
+    </w:lvl>
+    <w:lvl w:ilvl="2" w:tentative="1">
+      <w:start w:val="1"/>
+      <w:numFmt w:val="bullet"/>
+      <w:lvlText w:val=""/>
+      <w:lvlJc w:val="left"/>
+      <w:pPr>
+        <w:tabs>
+          <w:tab w:val="num" w:pos="2160"/>
+        </w:tabs>
+        <w:ind w:left="2160" w:hanging="360"/>
+      </w:pPr>
+      <w:rPr>
+        <w:rFonts w:ascii="Wingdings" w:hAnsi="Wingdings" w:hint="default"/>
+        <w:sz w:val="20"/>
+      </w:rPr>
+    </w:lvl>
+    <w:lvl w:ilvl="3" w:tentative="1">
+      <w:start w:val="1"/>
+      <w:numFmt w:val="bullet"/>
+      <w:lvlText w:val=""/>
+      <w:lvlJc w:val="left"/>
+      <w:pPr>
+        <w:tabs>
+          <w:tab w:val="num" w:pos="2880"/>
+        </w:tabs>
+        <w:ind w:left="2880" w:hanging="360"/>
+      </w:pPr>
+      <w:rPr>
+        <w:rFonts w:ascii="Wingdings" w:hAnsi="Wingdings" w:hint="default"/>
+        <w:sz w:val="20"/>
+      </w:rPr>
+    </w:lvl>
+    <w:lvl w:ilvl="4" w:tentative="1">
+      <w:start w:val="1"/>
+      <w:numFmt w:val="bullet"/>
+      <w:lvlText w:val=""/>
+      <w:lvlJc w:val="left"/>
+      <w:pPr>
+        <w:tabs>
+          <w:tab w:val="num" w:pos="3600"/>
+        </w:tabs>
+        <w:ind w:left="3600" w:hanging="360"/>
+      </w:pPr>
+      <w:rPr>
+        <w:rFonts w:ascii="Wingdings" w:hAnsi="Wingdings" w:hint="default"/>
+        <w:sz w:val="20"/>
+      </w:rPr>
+    </w:lvl>
+    <w:lvl w:ilvl="5" w:tentative="1">
+      <w:start w:val="1"/>
+      <w:numFmt w:val="bullet"/>
+      <w:lvlText w:val=""/>
+      <w:lvlJc w:val="left"/>
+      <w:pPr>
+        <w:tabs>
+          <w:tab w:val="num" w:pos="4320"/>
+        </w:tabs>
+        <w:ind w:left="4320" w:hanging="360"/>
+      </w:pPr>
+      <w:rPr>
+        <w:rFonts w:ascii="Wingdings" w:hAnsi="Wingdings" w:hint="default"/>
+        <w:sz w:val="20"/>
+      </w:rPr>
+    </w:lvl>
+    <w:lvl w:ilvl="6" w:tentative="1">
+      <w:start w:val="1"/>
+      <w:numFmt w:val="bullet"/>
+      <w:lvlText w:val=""/>
+      <w:lvlJc w:val="left"/>
+      <w:pPr>
+        <w:tabs>
+          <w:tab w:val="num" w:pos="5040"/>
+        </w:tabs>
+        <w:ind w:left="5040" w:hanging="360"/>
+      </w:pPr>
+      <w:rPr>
+        <w:rFonts w:ascii="Wingdings" w:hAnsi="Wingdings" w:hint="default"/>
+        <w:sz w:val="20"/>
+      </w:rPr>
+    </w:lvl>
+    <w:lvl w:ilvl="7" w:tentative="1">
+      <w:start w:val="1"/>
+      <w:numFmt w:val="bullet"/>
+      <w:lvlText w:val=""/>
+      <w:lvlJc w:val="left"/>
+      <w:pPr>
+        <w:tabs>
+          <w:tab w:val="num" w:pos="5760"/>
+        </w:tabs>
+        <w:ind w:left="5760" w:hanging="360"/>
+      </w:pPr>
+      <w:rPr>
+        <w:rFonts w:ascii="Wingdings" w:hAnsi="Wingdings" w:hint="default"/>
+        <w:sz w:val="20"/>
+      </w:rPr>
+    </w:lvl>
+    <w:lvl w:ilvl="8" w:tentative="1">
+      <w:start w:val="1"/>
+      <w:numFmt w:val="bullet"/>
+      <w:lvlText w:val=""/>
+      <w:lvlJc w:val="left"/>
+      <w:pPr>
+        <w:tabs>
+          <w:tab w:val="num" w:pos="6480"/>
+        </w:tabs>
+        <w:ind w:left="6480" w:hanging="360"/>
+      </w:pPr>
+      <w:rPr>
+        <w:rFonts w:ascii="Wingdings" w:hAnsi="Wingdings" w:hint="default"/>
+        <w:sz w:val="20"/>
+      </w:rPr>
+    </w:lvl>
+  </w:abstractNum>
+  <w:abstractNum w:abstractNumId="19" w15:restartNumberingAfterBreak="0">
     <w:nsid w:val="4B460D4E"/>
     <w:multiLevelType w:val="hybridMultilevel"/>
     <w:tmpl w:val="F176FFFC"/>
@@ -6998,7 +7991,7 @@
       </w:rPr>
     </w:lvl>
   </w:abstractNum>
-  <w:abstractNum w:abstractNumId="15" w15:restartNumberingAfterBreak="0">
+  <w:abstractNum w:abstractNumId="20" w15:restartNumberingAfterBreak="0">
     <w:nsid w:val="51C6632E"/>
     <w:multiLevelType w:val="multilevel"/>
     <w:tmpl w:val="5F860EC0"/>
@@ -7147,7 +8140,7 @@
       </w:rPr>
     </w:lvl>
   </w:abstractNum>
-  <w:abstractNum w:abstractNumId="16" w15:restartNumberingAfterBreak="0">
+  <w:abstractNum w:abstractNumId="21" w15:restartNumberingAfterBreak="0">
     <w:nsid w:val="58C12BCE"/>
     <w:multiLevelType w:val="multilevel"/>
     <w:tmpl w:val="54362AFC"/>
@@ -7260,7 +8253,7 @@
       </w:pPr>
     </w:lvl>
   </w:abstractNum>
-  <w:abstractNum w:abstractNumId="17" w15:restartNumberingAfterBreak="0">
+  <w:abstractNum w:abstractNumId="22" w15:restartNumberingAfterBreak="0">
     <w:nsid w:val="5AA121CF"/>
     <w:multiLevelType w:val="hybridMultilevel"/>
     <w:tmpl w:val="801E8B90"/>
@@ -7373,7 +8366,7 @@
       </w:rPr>
     </w:lvl>
   </w:abstractNum>
-  <w:abstractNum w:abstractNumId="18" w15:restartNumberingAfterBreak="0">
+  <w:abstractNum w:abstractNumId="23" w15:restartNumberingAfterBreak="0">
     <w:nsid w:val="5F6A2377"/>
     <w:multiLevelType w:val="multilevel"/>
     <w:tmpl w:val="6F5EC60A"/>
@@ -7486,7 +8479,305 @@
       </w:pPr>
     </w:lvl>
   </w:abstractNum>
-  <w:abstractNum w:abstractNumId="19" w15:restartNumberingAfterBreak="0">
+  <w:abstractNum w:abstractNumId="24" w15:restartNumberingAfterBreak="0">
+    <w:nsid w:val="60EA3971"/>
+    <w:multiLevelType w:val="multilevel"/>
+    <w:tmpl w:val="C3B8E7B4"/>
+    <w:lvl w:ilvl="0">
+      <w:start w:val="1"/>
+      <w:numFmt w:val="bullet"/>
+      <w:lvlText w:val=""/>
+      <w:lvlJc w:val="left"/>
+      <w:pPr>
+        <w:tabs>
+          <w:tab w:val="num" w:pos="720"/>
+        </w:tabs>
+        <w:ind w:left="720" w:hanging="360"/>
+      </w:pPr>
+      <w:rPr>
+        <w:rFonts w:ascii="Symbol" w:hAnsi="Symbol" w:hint="default"/>
+        <w:sz w:val="20"/>
+      </w:rPr>
+    </w:lvl>
+    <w:lvl w:ilvl="1" w:tentative="1">
+      <w:start w:val="1"/>
+      <w:numFmt w:val="bullet"/>
+      <w:lvlText w:val="o"/>
+      <w:lvlJc w:val="left"/>
+      <w:pPr>
+        <w:tabs>
+          <w:tab w:val="num" w:pos="1440"/>
+        </w:tabs>
+        <w:ind w:left="1440" w:hanging="360"/>
+      </w:pPr>
+      <w:rPr>
+        <w:rFonts w:ascii="Courier New" w:hAnsi="Courier New" w:hint="default"/>
+        <w:sz w:val="20"/>
+      </w:rPr>
+    </w:lvl>
+    <w:lvl w:ilvl="2" w:tentative="1">
+      <w:start w:val="1"/>
+      <w:numFmt w:val="bullet"/>
+      <w:lvlText w:val=""/>
+      <w:lvlJc w:val="left"/>
+      <w:pPr>
+        <w:tabs>
+          <w:tab w:val="num" w:pos="2160"/>
+        </w:tabs>
+        <w:ind w:left="2160" w:hanging="360"/>
+      </w:pPr>
+      <w:rPr>
+        <w:rFonts w:ascii="Wingdings" w:hAnsi="Wingdings" w:hint="default"/>
+        <w:sz w:val="20"/>
+      </w:rPr>
+    </w:lvl>
+    <w:lvl w:ilvl="3" w:tentative="1">
+      <w:start w:val="1"/>
+      <w:numFmt w:val="bullet"/>
+      <w:lvlText w:val=""/>
+      <w:lvlJc w:val="left"/>
+      <w:pPr>
+        <w:tabs>
+          <w:tab w:val="num" w:pos="2880"/>
+        </w:tabs>
+        <w:ind w:left="2880" w:hanging="360"/>
+      </w:pPr>
+      <w:rPr>
+        <w:rFonts w:ascii="Wingdings" w:hAnsi="Wingdings" w:hint="default"/>
+        <w:sz w:val="20"/>
+      </w:rPr>
+    </w:lvl>
+    <w:lvl w:ilvl="4" w:tentative="1">
+      <w:start w:val="1"/>
+      <w:numFmt w:val="bullet"/>
+      <w:lvlText w:val=""/>
+      <w:lvlJc w:val="left"/>
+      <w:pPr>
+        <w:tabs>
+          <w:tab w:val="num" w:pos="3600"/>
+        </w:tabs>
+        <w:ind w:left="3600" w:hanging="360"/>
+      </w:pPr>
+      <w:rPr>
+        <w:rFonts w:ascii="Wingdings" w:hAnsi="Wingdings" w:hint="default"/>
+        <w:sz w:val="20"/>
+      </w:rPr>
+    </w:lvl>
+    <w:lvl w:ilvl="5" w:tentative="1">
+      <w:start w:val="1"/>
+      <w:numFmt w:val="bullet"/>
+      <w:lvlText w:val=""/>
+      <w:lvlJc w:val="left"/>
+      <w:pPr>
+        <w:tabs>
+          <w:tab w:val="num" w:pos="4320"/>
+        </w:tabs>
+        <w:ind w:left="4320" w:hanging="360"/>
+      </w:pPr>
+      <w:rPr>
+        <w:rFonts w:ascii="Wingdings" w:hAnsi="Wingdings" w:hint="default"/>
+        <w:sz w:val="20"/>
+      </w:rPr>
+    </w:lvl>
+    <w:lvl w:ilvl="6" w:tentative="1">
+      <w:start w:val="1"/>
+      <w:numFmt w:val="bullet"/>
+      <w:lvlText w:val=""/>
+      <w:lvlJc w:val="left"/>
+      <w:pPr>
+        <w:tabs>
+          <w:tab w:val="num" w:pos="5040"/>
+        </w:tabs>
+        <w:ind w:left="5040" w:hanging="360"/>
+      </w:pPr>
+      <w:rPr>
+        <w:rFonts w:ascii="Wingdings" w:hAnsi="Wingdings" w:hint="default"/>
+        <w:sz w:val="20"/>
+      </w:rPr>
+    </w:lvl>
+    <w:lvl w:ilvl="7" w:tentative="1">
+      <w:start w:val="1"/>
+      <w:numFmt w:val="bullet"/>
+      <w:lvlText w:val=""/>
+      <w:lvlJc w:val="left"/>
+      <w:pPr>
+        <w:tabs>
+          <w:tab w:val="num" w:pos="5760"/>
+        </w:tabs>
+        <w:ind w:left="5760" w:hanging="360"/>
+      </w:pPr>
+      <w:rPr>
+        <w:rFonts w:ascii="Wingdings" w:hAnsi="Wingdings" w:hint="default"/>
+        <w:sz w:val="20"/>
+      </w:rPr>
+    </w:lvl>
+    <w:lvl w:ilvl="8" w:tentative="1">
+      <w:start w:val="1"/>
+      <w:numFmt w:val="bullet"/>
+      <w:lvlText w:val=""/>
+      <w:lvlJc w:val="left"/>
+      <w:pPr>
+        <w:tabs>
+          <w:tab w:val="num" w:pos="6480"/>
+        </w:tabs>
+        <w:ind w:left="6480" w:hanging="360"/>
+      </w:pPr>
+      <w:rPr>
+        <w:rFonts w:ascii="Wingdings" w:hAnsi="Wingdings" w:hint="default"/>
+        <w:sz w:val="20"/>
+      </w:rPr>
+    </w:lvl>
+  </w:abstractNum>
+  <w:abstractNum w:abstractNumId="25" w15:restartNumberingAfterBreak="0">
+    <w:nsid w:val="61525570"/>
+    <w:multiLevelType w:val="multilevel"/>
+    <w:tmpl w:val="CD20C138"/>
+    <w:lvl w:ilvl="0">
+      <w:start w:val="1"/>
+      <w:numFmt w:val="bullet"/>
+      <w:lvlText w:val=""/>
+      <w:lvlJc w:val="left"/>
+      <w:pPr>
+        <w:tabs>
+          <w:tab w:val="num" w:pos="720"/>
+        </w:tabs>
+        <w:ind w:left="720" w:hanging="360"/>
+      </w:pPr>
+      <w:rPr>
+        <w:rFonts w:ascii="Symbol" w:hAnsi="Symbol" w:hint="default"/>
+        <w:sz w:val="20"/>
+      </w:rPr>
+    </w:lvl>
+    <w:lvl w:ilvl="1" w:tentative="1">
+      <w:start w:val="1"/>
+      <w:numFmt w:val="bullet"/>
+      <w:lvlText w:val="o"/>
+      <w:lvlJc w:val="left"/>
+      <w:pPr>
+        <w:tabs>
+          <w:tab w:val="num" w:pos="1440"/>
+        </w:tabs>
+        <w:ind w:left="1440" w:hanging="360"/>
+      </w:pPr>
+      <w:rPr>
+        <w:rFonts w:ascii="Courier New" w:hAnsi="Courier New" w:hint="default"/>
+        <w:sz w:val="20"/>
+      </w:rPr>
+    </w:lvl>
+    <w:lvl w:ilvl="2" w:tentative="1">
+      <w:start w:val="1"/>
+      <w:numFmt w:val="bullet"/>
+      <w:lvlText w:val=""/>
+      <w:lvlJc w:val="left"/>
+      <w:pPr>
+        <w:tabs>
+          <w:tab w:val="num" w:pos="2160"/>
+        </w:tabs>
+        <w:ind w:left="2160" w:hanging="360"/>
+      </w:pPr>
+      <w:rPr>
+        <w:rFonts w:ascii="Wingdings" w:hAnsi="Wingdings" w:hint="default"/>
+        <w:sz w:val="20"/>
+      </w:rPr>
+    </w:lvl>
+    <w:lvl w:ilvl="3" w:tentative="1">
+      <w:start w:val="1"/>
+      <w:numFmt w:val="bullet"/>
+      <w:lvlText w:val=""/>
+      <w:lvlJc w:val="left"/>
+      <w:pPr>
+        <w:tabs>
+          <w:tab w:val="num" w:pos="2880"/>
+        </w:tabs>
+        <w:ind w:left="2880" w:hanging="360"/>
+      </w:pPr>
+      <w:rPr>
+        <w:rFonts w:ascii="Wingdings" w:hAnsi="Wingdings" w:hint="default"/>
+        <w:sz w:val="20"/>
+      </w:rPr>
+    </w:lvl>
+    <w:lvl w:ilvl="4" w:tentative="1">
+      <w:start w:val="1"/>
+      <w:numFmt w:val="bullet"/>
+      <w:lvlText w:val=""/>
+      <w:lvlJc w:val="left"/>
+      <w:pPr>
+        <w:tabs>
+          <w:tab w:val="num" w:pos="3600"/>
+        </w:tabs>
+        <w:ind w:left="3600" w:hanging="360"/>
+      </w:pPr>
+      <w:rPr>
+        <w:rFonts w:ascii="Wingdings" w:hAnsi="Wingdings" w:hint="default"/>
+        <w:sz w:val="20"/>
+      </w:rPr>
+    </w:lvl>
+    <w:lvl w:ilvl="5" w:tentative="1">
+      <w:start w:val="1"/>
+      <w:numFmt w:val="bullet"/>
+      <w:lvlText w:val=""/>
+      <w:lvlJc w:val="left"/>
+      <w:pPr>
+        <w:tabs>
+          <w:tab w:val="num" w:pos="4320"/>
+        </w:tabs>
+        <w:ind w:left="4320" w:hanging="360"/>
+      </w:pPr>
+      <w:rPr>
+        <w:rFonts w:ascii="Wingdings" w:hAnsi="Wingdings" w:hint="default"/>
+        <w:sz w:val="20"/>
+      </w:rPr>
+    </w:lvl>
+    <w:lvl w:ilvl="6" w:tentative="1">
+      <w:start w:val="1"/>
+      <w:numFmt w:val="bullet"/>
+      <w:lvlText w:val=""/>
+      <w:lvlJc w:val="left"/>
+      <w:pPr>
+        <w:tabs>
+          <w:tab w:val="num" w:pos="5040"/>
+        </w:tabs>
+        <w:ind w:left="5040" w:hanging="360"/>
+      </w:pPr>
+      <w:rPr>
+        <w:rFonts w:ascii="Wingdings" w:hAnsi="Wingdings" w:hint="default"/>
+        <w:sz w:val="20"/>
+      </w:rPr>
+    </w:lvl>
+    <w:lvl w:ilvl="7" w:tentative="1">
+      <w:start w:val="1"/>
+      <w:numFmt w:val="bullet"/>
+      <w:lvlText w:val=""/>
+      <w:lvlJc w:val="left"/>
+      <w:pPr>
+        <w:tabs>
+          <w:tab w:val="num" w:pos="5760"/>
+        </w:tabs>
+        <w:ind w:left="5760" w:hanging="360"/>
+      </w:pPr>
+      <w:rPr>
+        <w:rFonts w:ascii="Wingdings" w:hAnsi="Wingdings" w:hint="default"/>
+        <w:sz w:val="20"/>
+      </w:rPr>
+    </w:lvl>
+    <w:lvl w:ilvl="8" w:tentative="1">
+      <w:start w:val="1"/>
+      <w:numFmt w:val="bullet"/>
+      <w:lvlText w:val=""/>
+      <w:lvlJc w:val="left"/>
+      <w:pPr>
+        <w:tabs>
+          <w:tab w:val="num" w:pos="6480"/>
+        </w:tabs>
+        <w:ind w:left="6480" w:hanging="360"/>
+      </w:pPr>
+      <w:rPr>
+        <w:rFonts w:ascii="Wingdings" w:hAnsi="Wingdings" w:hint="default"/>
+        <w:sz w:val="20"/>
+      </w:rPr>
+    </w:lvl>
+  </w:abstractNum>
+  <w:abstractNum w:abstractNumId="26" w15:restartNumberingAfterBreak="0">
     <w:nsid w:val="68FB3A87"/>
     <w:multiLevelType w:val="hybridMultilevel"/>
     <w:tmpl w:val="34E8EEEE"/>
@@ -7599,7 +8890,7 @@
       </w:rPr>
     </w:lvl>
   </w:abstractNum>
-  <w:abstractNum w:abstractNumId="20" w15:restartNumberingAfterBreak="0">
+  <w:abstractNum w:abstractNumId="27" w15:restartNumberingAfterBreak="0">
     <w:nsid w:val="698F6CA7"/>
     <w:multiLevelType w:val="multilevel"/>
     <w:tmpl w:val="A1DCE8CA"/>
@@ -7748,7 +9039,7 @@
       </w:rPr>
     </w:lvl>
   </w:abstractNum>
-  <w:abstractNum w:abstractNumId="21" w15:restartNumberingAfterBreak="0">
+  <w:abstractNum w:abstractNumId="28" w15:restartNumberingAfterBreak="0">
     <w:nsid w:val="6DB3410E"/>
     <w:multiLevelType w:val="multilevel"/>
     <w:tmpl w:val="EC5AFCAC"/>
@@ -7897,7 +9188,7 @@
       </w:rPr>
     </w:lvl>
   </w:abstractNum>
-  <w:abstractNum w:abstractNumId="22" w15:restartNumberingAfterBreak="0">
+  <w:abstractNum w:abstractNumId="29" w15:restartNumberingAfterBreak="0">
     <w:nsid w:val="762C4577"/>
     <w:multiLevelType w:val="hybridMultilevel"/>
     <w:tmpl w:val="574203A2"/>
@@ -8014,70 +9305,91 @@
     <w:abstractNumId w:val="4"/>
   </w:num>
   <w:num w:numId="2" w16cid:durableId="616839644">
-    <w:abstractNumId w:val="17"/>
+    <w:abstractNumId w:val="22"/>
   </w:num>
   <w:num w:numId="3" w16cid:durableId="2039355559">
-    <w:abstractNumId w:val="22"/>
+    <w:abstractNumId w:val="29"/>
   </w:num>
   <w:num w:numId="4" w16cid:durableId="1868716406">
-    <w:abstractNumId w:val="14"/>
+    <w:abstractNumId w:val="19"/>
   </w:num>
   <w:num w:numId="5" w16cid:durableId="661087690">
-    <w:abstractNumId w:val="10"/>
+    <w:abstractNumId w:val="13"/>
   </w:num>
   <w:num w:numId="6" w16cid:durableId="324624186">
     <w:abstractNumId w:val="1"/>
   </w:num>
   <w:num w:numId="7" w16cid:durableId="265699617">
-    <w:abstractNumId w:val="20"/>
+    <w:abstractNumId w:val="27"/>
   </w:num>
   <w:num w:numId="8" w16cid:durableId="637078836">
-    <w:abstractNumId w:val="6"/>
+    <w:abstractNumId w:val="8"/>
   </w:num>
   <w:num w:numId="9" w16cid:durableId="214465044">
-    <w:abstractNumId w:val="18"/>
+    <w:abstractNumId w:val="23"/>
   </w:num>
   <w:num w:numId="10" w16cid:durableId="1734935567">
-    <w:abstractNumId w:val="11"/>
+    <w:abstractNumId w:val="14"/>
   </w:num>
   <w:num w:numId="11" w16cid:durableId="1194541750">
-    <w:abstractNumId w:val="9"/>
+    <w:abstractNumId w:val="12"/>
   </w:num>
   <w:num w:numId="12" w16cid:durableId="2132703009">
-    <w:abstractNumId w:val="21"/>
+    <w:abstractNumId w:val="28"/>
   </w:num>
   <w:num w:numId="13" w16cid:durableId="1171144280">
-    <w:abstractNumId w:val="16"/>
+    <w:abstractNumId w:val="21"/>
   </w:num>
   <w:num w:numId="14" w16cid:durableId="1150488785">
     <w:abstractNumId w:val="2"/>
   </w:num>
   <w:num w:numId="15" w16cid:durableId="222915286">
-    <w:abstractNumId w:val="19"/>
+    <w:abstractNumId w:val="26"/>
   </w:num>
   <w:num w:numId="16" w16cid:durableId="1432705755">
-    <w:abstractNumId w:val="12"/>
+    <w:abstractNumId w:val="15"/>
   </w:num>
   <w:num w:numId="17" w16cid:durableId="827137759">
-    <w:abstractNumId w:val="15"/>
+    <w:abstractNumId w:val="20"/>
   </w:num>
   <w:num w:numId="18" w16cid:durableId="799422419">
-    <w:abstractNumId w:val="8"/>
+    <w:abstractNumId w:val="10"/>
   </w:num>
   <w:num w:numId="19" w16cid:durableId="1840342896">
-    <w:abstractNumId w:val="13"/>
+    <w:abstractNumId w:val="17"/>
   </w:num>
   <w:num w:numId="20" w16cid:durableId="183447027">
-    <w:abstractNumId w:val="7"/>
+    <w:abstractNumId w:val="9"/>
   </w:num>
   <w:num w:numId="21" w16cid:durableId="741216713">
-    <w:abstractNumId w:val="5"/>
+    <w:abstractNumId w:val="6"/>
   </w:num>
   <w:num w:numId="22" w16cid:durableId="255091594">
     <w:abstractNumId w:val="0"/>
   </w:num>
   <w:num w:numId="23" w16cid:durableId="229271220">
     <w:abstractNumId w:val="3"/>
+  </w:num>
+  <w:num w:numId="24" w16cid:durableId="2026982856">
+    <w:abstractNumId w:val="25"/>
+  </w:num>
+  <w:num w:numId="25" w16cid:durableId="1077821552">
+    <w:abstractNumId w:val="18"/>
+  </w:num>
+  <w:num w:numId="26" w16cid:durableId="1005589563">
+    <w:abstractNumId w:val="24"/>
+  </w:num>
+  <w:num w:numId="27" w16cid:durableId="1576238986">
+    <w:abstractNumId w:val="7"/>
+  </w:num>
+  <w:num w:numId="28" w16cid:durableId="1537087091">
+    <w:abstractNumId w:val="11"/>
+  </w:num>
+  <w:num w:numId="29" w16cid:durableId="699204665">
+    <w:abstractNumId w:val="16"/>
+  </w:num>
+  <w:num w:numId="30" w16cid:durableId="396365548">
+    <w:abstractNumId w:val="5"/>
   </w:num>
 </w:numbering>
 </file>
@@ -8551,6 +9863,7 @@
   <w:style w:type="character" w:default="1" w:styleId="DefaultParagraphFont">
     <w:name w:val="Default Paragraph Font"/>
     <w:uiPriority w:val="1"/>
+    <w:semiHidden/>
     <w:unhideWhenUsed/>
   </w:style>
   <w:style w:type="table" w:default="1" w:styleId="TableNormal">
@@ -8703,6 +10016,22 @@
       <w:rFonts w:ascii="Times New Roman" w:hAnsi="Times New Roman" w:cs="Times New Roman"/>
       <w:sz w:val="24"/>
       <w:szCs w:val="24"/>
+    </w:rPr>
+  </w:style>
+  <w:style w:type="character" w:customStyle="1" w:styleId="mntl-inline-citation">
+    <w:name w:val="mntl-inline-citation"/>
+    <w:basedOn w:val="DefaultParagraphFont"/>
+    <w:rsid w:val="00396DAB"/>
+  </w:style>
+  <w:style w:type="character" w:styleId="Emphasis">
+    <w:name w:val="Emphasis"/>
+    <w:basedOn w:val="DefaultParagraphFont"/>
+    <w:uiPriority w:val="20"/>
+    <w:qFormat/>
+    <w:rsid w:val="00396DAB"/>
+    <w:rPr>
+      <w:i/>
+      <w:iCs/>
     </w:rPr>
   </w:style>
 </w:styles>

</xml_diff>

<commit_message>
docs: Best approach diet or exercise?
</commit_message>
<xml_diff>
--- a/Nutrients/Weight Loss.docx
+++ b/Nutrients/Weight Loss.docx
@@ -3987,16 +3987,7 @@
           <w:sz w:val="24"/>
           <w:szCs w:val="24"/>
         </w:rPr>
-        <w:t>Burns extra calories</w:t>
-      </w:r>
-      <w:r>
-        <w:rPr>
-          <w:b/>
-          <w:bCs/>
-          <w:sz w:val="24"/>
-          <w:szCs w:val="24"/>
-        </w:rPr>
-        <w:t>:</w:t>
+        <w:t>Burns extra calories:</w:t>
       </w:r>
       <w:r>
         <w:rPr>
@@ -4008,6 +3999,9 @@
       <w:hyperlink r:id="rId7" w:history="1">
         <w:r>
           <w:rPr>
+            <w:b/>
+            <w:bCs/>
+            <w:color w:val="FF0000"/>
             <w:sz w:val="24"/>
             <w:szCs w:val="24"/>
           </w:rPr>
@@ -4019,21 +4013,7 @@
           <w:sz w:val="24"/>
           <w:szCs w:val="24"/>
         </w:rPr>
-        <w:t>.</w:t>
-      </w:r>
-      <w:r>
-        <w:rPr>
-          <w:sz w:val="24"/>
-          <w:szCs w:val="24"/>
-        </w:rPr>
-        <w:t xml:space="preserve"> </w:t>
-      </w:r>
-      <w:r>
-        <w:rPr>
-          <w:sz w:val="24"/>
-          <w:szCs w:val="24"/>
-        </w:rPr>
-        <w:t>This is especially true with </w:t>
+        <w:t>. This is especially true with </w:t>
       </w:r>
       <w:hyperlink r:id="rId8" w:history="1">
         <w:r>

</xml_diff>